<commit_message>
AbramovAA:update questions by topic
</commit_message>
<xml_diff>
--- a/Вопросы_для_теста.docx
+++ b/Вопросы_для_теста.docx
@@ -7,28 +7,34 @@
         <w:rPr>
           <w:rFonts w:ascii="Palatino Linotype" w:hAnsi="Palatino Linotype"/>
           <w:sz w:val="36"/>
+          <w:szCs w:val="36"/>
+          <w:u w:val="single"/>
         </w:rPr>
       </w:pPr>
       <w:r>
         <w:rPr>
           <w:rFonts w:ascii="Palatino Linotype" w:hAnsi="Palatino Linotype"/>
           <w:sz w:val="36"/>
+          <w:szCs w:val="36"/>
+          <w:u w:val="single"/>
         </w:rPr>
         <w:t xml:space="preserve">Общие вопросы по </w:t>
       </w:r>
-      <w:proofErr w:type="spellStart"/>
       <w:r>
         <w:rPr>
           <w:rFonts w:ascii="Palatino Linotype" w:hAnsi="Palatino Linotype"/>
           <w:sz w:val="36"/>
+          <w:szCs w:val="36"/>
+          <w:u w:val="single"/>
         </w:rPr>
         <w:t>Git</w:t>
       </w:r>
-      <w:proofErr w:type="spellEnd"/>
       <w:r>
         <w:rPr>
           <w:rFonts w:ascii="Palatino Linotype" w:hAnsi="Palatino Linotype"/>
           <w:sz w:val="36"/>
+          <w:szCs w:val="36"/>
+          <w:u w:val="single"/>
         </w:rPr>
         <w:t>-системе?</w:t>
       </w:r>
@@ -448,12 +454,13 @@
         <w:t xml:space="preserve"> сохраняет «снимки» проекта только один раз за все время</w:t>
       </w:r>
     </w:p>
-    <w:p>
+    <w:p w14:noSpellErr="1">
       <w:pPr>
         <w:ind w:left="420"/>
         <w:rPr>
           <w:rFonts w:ascii="Palatino Linotype" w:hAnsi="Palatino Linotype"/>
           <w:sz w:val="28"/>
+          <w:szCs w:val="28"/>
         </w:rPr>
       </w:pPr>
       <w:r>
@@ -461,6 +468,7 @@
           <w:rFonts w:ascii="Palatino Linotype" w:hAnsi="Palatino Linotype"/>
           <w:color w:val="333333"/>
           <w:sz w:val="28"/>
+          <w:szCs w:val="28"/>
           <w:highlight w:val="white"/>
         </w:rPr>
         <w:t>Верный ответ: b</w:t>
@@ -468,57 +476,255 @@
     </w:p>
     <w:p>
       <w:pPr>
-        <w:ind w:left="420"/>
-        <w:rPr>
-          <w:rFonts w:ascii="Palatino Linotype" w:hAnsi="Palatino Linotype"/>
-          <w:sz w:val="28"/>
-        </w:rPr>
-      </w:pPr>
-    </w:p>
-    <w:p>
-      <w:pPr>
-        <w:ind w:left="420"/>
+        <w:ind w:left="0"/>
+        <w:rPr>
+          <w:rFonts w:ascii="Palatino Linotype" w:hAnsi="Palatino Linotype"/>
+          <w:color w:val="333333"/>
+          <w:sz w:val="28"/>
+          <w:szCs w:val="28"/>
+          <w:highlight w:val="white"/>
+        </w:rPr>
+      </w:pPr>
+    </w:p>
+    <w:p>
+      <w:pPr>
+        <w:ind w:left="0"/>
+        <w:rPr>
+          <w:rFonts w:ascii="Palatino Linotype" w:hAnsi="Palatino Linotype"/>
+          <w:color w:val="333333"/>
+          <w:sz w:val="28"/>
+          <w:szCs w:val="28"/>
+          <w:highlight w:val="white"/>
+        </w:rPr>
+      </w:pPr>
+    </w:p>
+    <w:p>
+      <w:pPr>
+        <w:ind w:left="0"/>
+        <w:rPr>
+          <w:rFonts w:ascii="Palatino Linotype" w:hAnsi="Palatino Linotype"/>
+          <w:color w:val="333333"/>
+          <w:sz w:val="28"/>
+          <w:szCs w:val="28"/>
+          <w:highlight w:val="white"/>
+        </w:rPr>
+      </w:pPr>
+    </w:p>
+    <w:p>
+      <w:pPr>
+        <w:ind w:left="0"/>
+        <w:rPr>
+          <w:rFonts w:ascii="Palatino Linotype" w:hAnsi="Palatino Linotype"/>
+          <w:color w:val="333333"/>
+          <w:sz w:val="28"/>
+          <w:szCs w:val="28"/>
+          <w:highlight w:val="white"/>
+        </w:rPr>
+      </w:pPr>
+      <w:r>
+        <w:rPr>
+          <w:rFonts w:ascii="Palatino Linotype" w:hAnsi="Palatino Linotype"/>
+          <w:color w:val="333333"/>
+          <w:sz w:val="28"/>
+          <w:szCs w:val="28"/>
+          <w:highlight w:val="white"/>
+        </w:rPr>
+        <w:t>Для чего Git использует криптографические хэш-ключи?</w:t>
+      </w:r>
+    </w:p>
+    <w:p>
+      <w:pPr>
+        <w:pStyle w:val="ListParagraph"/>
+        <w:numPr>
+          <w:ilvl w:val="0"/>
+          <w:numId w:val="9"/>
+        </w:numPr>
+        <w:rPr>
+          <w:rFonts w:ascii="Palatino Linotype" w:hAnsi="Palatino Linotype"/>
+          <w:color w:val="000000" w:themeColor="text1" w:themeTint="FF" w:themeShade="FF"/>
+          <w:sz w:val="28"/>
+          <w:szCs w:val="28"/>
+          <w:highlight w:val="white"/>
+        </w:rPr>
+      </w:pPr>
+      <w:r>
+        <w:rPr>
+          <w:rFonts w:ascii="Palatino Linotype" w:hAnsi="Palatino Linotype"/>
+          <w:color w:val="333333"/>
+          <w:sz w:val="28"/>
+          <w:szCs w:val="28"/>
+          <w:highlight w:val="white"/>
+        </w:rPr>
+        <w:t>Для защиты резервных копий проекта</w:t>
+      </w:r>
+    </w:p>
+    <w:p>
+      <w:pPr>
+        <w:pStyle w:val="ListParagraph"/>
+        <w:numPr>
+          <w:ilvl w:val="0"/>
+          <w:numId w:val="9"/>
+        </w:numPr>
+        <w:rPr>
+          <w:rFonts w:ascii="Palatino Linotype" w:hAnsi="Palatino Linotype"/>
+          <w:color w:val="000000" w:themeColor="text1" w:themeTint="FF" w:themeShade="FF"/>
+          <w:sz w:val="28"/>
+          <w:szCs w:val="28"/>
+          <w:highlight w:val="white"/>
+        </w:rPr>
+      </w:pPr>
+      <w:r>
+        <w:rPr>
+          <w:rFonts w:ascii="Palatino Linotype" w:hAnsi="Palatino Linotype"/>
+          <w:color w:val="333333"/>
+          <w:sz w:val="28"/>
+          <w:szCs w:val="28"/>
+          <w:highlight w:val="white"/>
+        </w:rPr>
+        <w:t>Чтобы обеспечить целостность репозитория</w:t>
+      </w:r>
+    </w:p>
+    <w:p>
+      <w:pPr>
+        <w:pStyle w:val="ListParagraph"/>
+        <w:numPr>
+          <w:ilvl w:val="0"/>
+          <w:numId w:val="9"/>
+        </w:numPr>
+        <w:rPr>
+          <w:rFonts w:ascii="Palatino Linotype" w:hAnsi="Palatino Linotype"/>
+          <w:color w:val="000000" w:themeColor="text1" w:themeTint="FF" w:themeShade="FF"/>
+          <w:sz w:val="28"/>
+          <w:szCs w:val="28"/>
+          <w:highlight w:val="white"/>
+        </w:rPr>
+      </w:pPr>
+      <w:r>
+        <w:rPr>
+          <w:rFonts w:ascii="Palatino Linotype" w:hAnsi="Palatino Linotype"/>
+          <w:color w:val="333333"/>
+          <w:sz w:val="28"/>
+          <w:szCs w:val="28"/>
+          <w:highlight w:val="white"/>
+        </w:rPr>
+        <w:t>Для шифрования паролей</w:t>
+      </w:r>
+    </w:p>
+    <w:p>
+      <w:pPr>
+        <w:pStyle w:val="ListParagraph"/>
+        <w:numPr>
+          <w:ilvl w:val="0"/>
+          <w:numId w:val="9"/>
+        </w:numPr>
+        <w:rPr>
+          <w:rFonts w:ascii="Palatino Linotype" w:hAnsi="Palatino Linotype"/>
+          <w:color w:val="000000" w:themeColor="text1" w:themeTint="FF" w:themeShade="FF"/>
+          <w:sz w:val="28"/>
+          <w:szCs w:val="28"/>
+          <w:highlight w:val="white"/>
+        </w:rPr>
+      </w:pPr>
+      <w:r>
+        <w:rPr>
+          <w:rFonts w:ascii="Palatino Linotype" w:hAnsi="Palatino Linotype"/>
+          <w:color w:val="333333"/>
+          <w:sz w:val="28"/>
+          <w:szCs w:val="28"/>
+          <w:highlight w:val="white"/>
+        </w:rPr>
+        <w:t>Для выявления коммитов</w:t>
+      </w:r>
+    </w:p>
+    <w:p>
+      <w:pPr>
+        <w:pStyle w:val="a"/>
+        <w:ind w:left="0"/>
+        <w:rPr>
+          <w:rFonts w:ascii="Palatino Linotype" w:hAnsi="Palatino Linotype"/>
+          <w:color w:val="000000" w:themeColor="text1" w:themeTint="FF" w:themeShade="FF"/>
+          <w:sz w:val="28"/>
+          <w:szCs w:val="28"/>
+          <w:highlight w:val="white"/>
+        </w:rPr>
+      </w:pPr>
+      <w:r>
+        <w:rPr>
+          <w:rFonts w:ascii="Palatino Linotype" w:hAnsi="Palatino Linotype"/>
+          <w:color w:val="000000" w:themeColor="text1" w:themeTint="FF" w:themeShade="FF"/>
+          <w:sz w:val="28"/>
+          <w:szCs w:val="28"/>
+          <w:highlight w:val="white"/>
+        </w:rPr>
+        <w:t>Верный ответ: b</w:t>
+      </w:r>
+    </w:p>
+    <w:p>
+      <w:pPr>
+        <w:ind w:left="0"/>
+        <w:jc w:val="both"/>
+        <w:rPr>
+          <w:rFonts w:ascii="Palatino Linotype" w:hAnsi="Palatino Linotype"/>
+          <w:color w:val="333333"/>
+          <w:sz w:val="28"/>
+          <w:szCs w:val="28"/>
+          <w:highlight w:val="white"/>
+        </w:rPr>
+      </w:pPr>
+    </w:p>
+    <w:p>
+      <w:pPr>
+        <w:ind w:left="0"/>
+        <w:jc w:val="both"/>
         <w:rPr>
           <w:rFonts w:ascii="Palatino Linotype" w:hAnsi="Palatino Linotype"/>
           <w:sz w:val="36"/>
+          <w:szCs w:val="36"/>
+          <w:u w:val="single"/>
         </w:rPr>
       </w:pPr>
       <w:r>
         <w:rPr>
           <w:rFonts w:ascii="Palatino Linotype" w:hAnsi="Palatino Linotype"/>
           <w:sz w:val="36"/>
+          <w:szCs w:val="36"/>
+          <w:u w:val="single"/>
         </w:rPr>
         <w:t xml:space="preserve">Вопросы по работе в </w:t>
       </w:r>
-      <w:proofErr w:type="spellStart"/>
       <w:r>
         <w:rPr>
           <w:rFonts w:ascii="Palatino Linotype" w:hAnsi="Palatino Linotype"/>
           <w:sz w:val="36"/>
+          <w:szCs w:val="36"/>
+          <w:u w:val="single"/>
         </w:rPr>
         <w:t>Git</w:t>
       </w:r>
-      <w:proofErr w:type="spellEnd"/>
       <w:r>
         <w:rPr>
           <w:rFonts w:ascii="Palatino Linotype" w:hAnsi="Palatino Linotype"/>
           <w:sz w:val="36"/>
+          <w:szCs w:val="36"/>
+          <w:u w:val="single"/>
         </w:rPr>
         <w:t xml:space="preserve"> </w:t>
       </w:r>
-      <w:proofErr w:type="spellStart"/>
       <w:r>
         <w:rPr>
           <w:rFonts w:ascii="Palatino Linotype" w:hAnsi="Palatino Linotype"/>
           <w:sz w:val="36"/>
+          <w:szCs w:val="36"/>
+          <w:u w:val="single"/>
         </w:rPr>
         <w:t>Bash</w:t>
       </w:r>
-      <w:proofErr w:type="spellEnd"/>
       <w:r>
         <w:rPr>
           <w:rFonts w:ascii="Palatino Linotype" w:hAnsi="Palatino Linotype"/>
           <w:sz w:val="36"/>
+          <w:szCs w:val="36"/>
+          <w:u w:val="single"/>
         </w:rPr>
         <w:t>?</w:t>
       </w:r>
@@ -1677,6 +1883,7 @@
         <w:rPr>
           <w:rFonts w:ascii="Palatino Linotype" w:hAnsi="Palatino Linotype"/>
           <w:sz w:val="28"/>
+          <w:szCs w:val="28"/>
         </w:rPr>
         <w:t>Верный ответ:</w:t>
       </w:r>
@@ -1684,6 +1891,7 @@
         <w:rPr>
           <w:rFonts w:ascii="Palatino Linotype" w:hAnsi="Palatino Linotype"/>
           <w:sz w:val="28"/>
+          <w:szCs w:val="28"/>
           <w:lang w:val="en-US"/>
         </w:rPr>
         <w:t xml:space="preserve"> b</w:t>
@@ -1694,24 +1902,1987 @@
         <w:rPr>
           <w:rFonts w:ascii="Palatino Linotype" w:hAnsi="Palatino Linotype"/>
           <w:sz w:val="28"/>
-          <w:lang w:val="en-US"/>
-        </w:rPr>
-      </w:pPr>
-    </w:p>
-    <w:p>
-      <w:pPr>
-        <w:ind w:left="420"/>
+          <w:szCs w:val="28"/>
+          <w:lang w:val="en-US"/>
+        </w:rPr>
+      </w:pPr>
+    </w:p>
+    <w:p>
+      <w:pPr>
+        <w:rPr>
+          <w:rFonts w:ascii="Palatino Linotype" w:hAnsi="Palatino Linotype"/>
+          <w:sz w:val="28"/>
+          <w:szCs w:val="28"/>
+          <w:lang w:val="en-US"/>
+        </w:rPr>
+      </w:pPr>
+      <w:r>
+        <w:rPr>
+          <w:rFonts w:ascii="Palatino Linotype" w:hAnsi="Palatino Linotype"/>
+          <w:sz w:val="28"/>
+          <w:szCs w:val="28"/>
+          <w:lang w:val="en-US"/>
+        </w:rPr>
+        <w:t>Вопрос</w:t>
+      </w:r>
+      <w:r>
+        <w:rPr>
+          <w:rFonts w:ascii="Palatino Linotype" w:hAnsi="Palatino Linotype"/>
+          <w:sz w:val="28"/>
+          <w:szCs w:val="28"/>
+          <w:lang w:val="en-US"/>
+        </w:rPr>
+        <w:t xml:space="preserve"> 7:</w:t>
+      </w:r>
+    </w:p>
+    <w:p>
+      <w:pPr>
+        <w:rPr>
+          <w:rFonts w:ascii="Palatino Linotype" w:hAnsi="Palatino Linotype"/>
+          <w:sz w:val="28"/>
+          <w:szCs w:val="28"/>
+          <w:lang w:val="en-US"/>
+        </w:rPr>
+      </w:pPr>
+      <w:r>
+        <w:rPr>
+          <w:rFonts w:ascii="Palatino Linotype" w:hAnsi="Palatino Linotype"/>
+          <w:sz w:val="28"/>
+          <w:szCs w:val="28"/>
+          <w:lang w:val="en-US"/>
+        </w:rPr>
+        <w:t>Что нужно сделать после изменения файла, отслеживаемого Git?</w:t>
+      </w:r>
+    </w:p>
+    <w:p>
+      <w:pPr>
+        <w:pStyle w:val="ListParagraph"/>
+        <w:numPr>
+          <w:ilvl w:val="0"/>
+          <w:numId w:val="3"/>
+        </w:numPr>
+        <w:rPr>
+          <w:rFonts w:ascii="Palatino Linotype" w:hAnsi="Palatino Linotype"/>
+          <w:color w:val="000000" w:themeColor="text1" w:themeTint="FF" w:themeShade="FF"/>
+          <w:sz w:val="28"/>
+          <w:szCs w:val="28"/>
+          <w:lang w:val="en-US"/>
+        </w:rPr>
+      </w:pPr>
+      <w:r>
+        <w:rPr>
+          <w:rFonts w:ascii="Palatino Linotype" w:hAnsi="Palatino Linotype"/>
+          <w:sz w:val="28"/>
+          <w:szCs w:val="28"/>
+          <w:lang w:val="en-US"/>
+        </w:rPr>
+        <w:t>Нам</w:t>
+      </w:r>
+      <w:r>
+        <w:rPr>
+          <w:rFonts w:ascii="Palatino Linotype" w:hAnsi="Palatino Linotype"/>
+          <w:sz w:val="28"/>
+          <w:szCs w:val="28"/>
+          <w:lang w:val="en-US"/>
+        </w:rPr>
+        <w:t xml:space="preserve"> </w:t>
+      </w:r>
+      <w:r>
+        <w:rPr>
+          <w:rFonts w:ascii="Palatino Linotype" w:hAnsi="Palatino Linotype"/>
+          <w:sz w:val="28"/>
+          <w:szCs w:val="28"/>
+          <w:lang w:val="en-US"/>
+        </w:rPr>
+        <w:t>нужно</w:t>
+      </w:r>
+      <w:r>
+        <w:rPr>
+          <w:rFonts w:ascii="Palatino Linotype" w:hAnsi="Palatino Linotype"/>
+          <w:sz w:val="28"/>
+          <w:szCs w:val="28"/>
+          <w:lang w:val="en-US"/>
+        </w:rPr>
+        <w:t xml:space="preserve"> </w:t>
+      </w:r>
+      <w:r>
+        <w:rPr>
+          <w:rFonts w:ascii="Palatino Linotype" w:hAnsi="Palatino Linotype"/>
+          <w:sz w:val="28"/>
+          <w:szCs w:val="28"/>
+          <w:lang w:val="en-US"/>
+        </w:rPr>
+        <w:t>зафиксировать</w:t>
+      </w:r>
+      <w:r>
+        <w:rPr>
+          <w:rFonts w:ascii="Palatino Linotype" w:hAnsi="Palatino Linotype"/>
+          <w:sz w:val="28"/>
+          <w:szCs w:val="28"/>
+          <w:lang w:val="en-US"/>
+        </w:rPr>
+        <w:t xml:space="preserve"> </w:t>
+      </w:r>
+      <w:r>
+        <w:rPr>
+          <w:rFonts w:ascii="Palatino Linotype" w:hAnsi="Palatino Linotype"/>
+          <w:sz w:val="28"/>
+          <w:szCs w:val="28"/>
+          <w:lang w:val="en-US"/>
+        </w:rPr>
+        <w:t>файл</w:t>
+      </w:r>
+      <w:r>
+        <w:rPr>
+          <w:rFonts w:ascii="Palatino Linotype" w:hAnsi="Palatino Linotype"/>
+          <w:sz w:val="28"/>
+          <w:szCs w:val="28"/>
+          <w:lang w:val="en-US"/>
+        </w:rPr>
+        <w:t xml:space="preserve">, </w:t>
+      </w:r>
+      <w:r>
+        <w:rPr>
+          <w:rFonts w:ascii="Palatino Linotype" w:hAnsi="Palatino Linotype"/>
+          <w:sz w:val="28"/>
+          <w:szCs w:val="28"/>
+          <w:lang w:val="en-US"/>
+        </w:rPr>
+        <w:t>чтобы</w:t>
+      </w:r>
+      <w:r>
+        <w:rPr>
+          <w:rFonts w:ascii="Palatino Linotype" w:hAnsi="Palatino Linotype"/>
+          <w:sz w:val="28"/>
+          <w:szCs w:val="28"/>
+          <w:lang w:val="en-US"/>
+        </w:rPr>
+        <w:t xml:space="preserve"> </w:t>
+      </w:r>
+      <w:r>
+        <w:rPr>
+          <w:rFonts w:ascii="Palatino Linotype" w:hAnsi="Palatino Linotype"/>
+          <w:sz w:val="28"/>
+          <w:szCs w:val="28"/>
+          <w:lang w:val="en-US"/>
+        </w:rPr>
+        <w:t>изменения</w:t>
+      </w:r>
+      <w:r>
+        <w:rPr>
+          <w:rFonts w:ascii="Palatino Linotype" w:hAnsi="Palatino Linotype"/>
+          <w:sz w:val="28"/>
+          <w:szCs w:val="28"/>
+          <w:lang w:val="en-US"/>
+        </w:rPr>
+        <w:t xml:space="preserve"> </w:t>
+      </w:r>
+      <w:r>
+        <w:rPr>
+          <w:rFonts w:ascii="Palatino Linotype" w:hAnsi="Palatino Linotype"/>
+          <w:sz w:val="28"/>
+          <w:szCs w:val="28"/>
+          <w:lang w:val="en-US"/>
+        </w:rPr>
+        <w:t>были</w:t>
+      </w:r>
+      <w:r>
+        <w:rPr>
+          <w:rFonts w:ascii="Palatino Linotype" w:hAnsi="Palatino Linotype"/>
+          <w:sz w:val="28"/>
+          <w:szCs w:val="28"/>
+          <w:lang w:val="en-US"/>
+        </w:rPr>
+        <w:t xml:space="preserve"> </w:t>
+      </w:r>
+      <w:r>
+        <w:rPr>
+          <w:rFonts w:ascii="Palatino Linotype" w:hAnsi="Palatino Linotype"/>
+          <w:sz w:val="28"/>
+          <w:szCs w:val="28"/>
+          <w:lang w:val="en-US"/>
+        </w:rPr>
+        <w:t>включены</w:t>
+      </w:r>
+      <w:r>
+        <w:rPr>
+          <w:rFonts w:ascii="Palatino Linotype" w:hAnsi="Palatino Linotype"/>
+          <w:sz w:val="28"/>
+          <w:szCs w:val="28"/>
+          <w:lang w:val="en-US"/>
+        </w:rPr>
+        <w:t xml:space="preserve"> в </w:t>
+      </w:r>
+      <w:r>
+        <w:rPr>
+          <w:rFonts w:ascii="Palatino Linotype" w:hAnsi="Palatino Linotype"/>
+          <w:sz w:val="28"/>
+          <w:szCs w:val="28"/>
+          <w:lang w:val="en-US"/>
+        </w:rPr>
+        <w:t>следующий</w:t>
+      </w:r>
+      <w:r>
+        <w:rPr>
+          <w:rFonts w:ascii="Palatino Linotype" w:hAnsi="Palatino Linotype"/>
+          <w:sz w:val="28"/>
+          <w:szCs w:val="28"/>
+          <w:lang w:val="en-US"/>
+        </w:rPr>
+        <w:t xml:space="preserve"> </w:t>
+      </w:r>
+      <w:r>
+        <w:rPr>
+          <w:rFonts w:ascii="Palatino Linotype" w:hAnsi="Palatino Linotype"/>
+          <w:sz w:val="28"/>
+          <w:szCs w:val="28"/>
+          <w:lang w:val="en-US"/>
+        </w:rPr>
+        <w:t>коммит</w:t>
+      </w:r>
+      <w:r>
+        <w:rPr>
+          <w:rFonts w:ascii="Palatino Linotype" w:hAnsi="Palatino Linotype"/>
+          <w:sz w:val="28"/>
+          <w:szCs w:val="28"/>
+          <w:lang w:val="en-US"/>
+        </w:rPr>
+        <w:t>.</w:t>
+      </w:r>
+    </w:p>
+    <w:p>
+      <w:pPr>
+        <w:pStyle w:val="ListParagraph"/>
+        <w:numPr>
+          <w:ilvl w:val="0"/>
+          <w:numId w:val="3"/>
+        </w:numPr>
+        <w:rPr>
+          <w:rFonts w:ascii="Palatino Linotype" w:hAnsi="Palatino Linotype"/>
+          <w:color w:val="000000" w:themeColor="text1" w:themeTint="FF" w:themeShade="FF"/>
+          <w:sz w:val="28"/>
+          <w:szCs w:val="28"/>
+          <w:lang w:val="en-US"/>
+        </w:rPr>
+      </w:pPr>
+      <w:r>
+        <w:rPr>
+          <w:rFonts w:ascii="Palatino Linotype" w:hAnsi="Palatino Linotype"/>
+          <w:sz w:val="28"/>
+          <w:szCs w:val="28"/>
+          <w:lang w:val="en-US"/>
+        </w:rPr>
+        <w:t>Нам</w:t>
+      </w:r>
+      <w:r>
+        <w:rPr>
+          <w:rFonts w:ascii="Palatino Linotype" w:hAnsi="Palatino Linotype"/>
+          <w:sz w:val="28"/>
+          <w:szCs w:val="28"/>
+          <w:lang w:val="en-US"/>
+        </w:rPr>
+        <w:t xml:space="preserve"> </w:t>
+      </w:r>
+      <w:r>
+        <w:rPr>
+          <w:rFonts w:ascii="Palatino Linotype" w:hAnsi="Palatino Linotype"/>
+          <w:sz w:val="28"/>
+          <w:szCs w:val="28"/>
+          <w:lang w:val="en-US"/>
+        </w:rPr>
+        <w:t>нужно</w:t>
+      </w:r>
+      <w:r>
+        <w:rPr>
+          <w:rFonts w:ascii="Palatino Linotype" w:hAnsi="Palatino Linotype"/>
+          <w:sz w:val="28"/>
+          <w:szCs w:val="28"/>
+          <w:lang w:val="en-US"/>
+        </w:rPr>
+        <w:t xml:space="preserve"> </w:t>
+      </w:r>
+      <w:r>
+        <w:rPr>
+          <w:rFonts w:ascii="Palatino Linotype" w:hAnsi="Palatino Linotype"/>
+          <w:sz w:val="28"/>
+          <w:szCs w:val="28"/>
+          <w:lang w:val="en-US"/>
+        </w:rPr>
+        <w:t>внести</w:t>
+      </w:r>
+      <w:r>
+        <w:rPr>
+          <w:rFonts w:ascii="Palatino Linotype" w:hAnsi="Palatino Linotype"/>
+          <w:sz w:val="28"/>
+          <w:szCs w:val="28"/>
+          <w:lang w:val="en-US"/>
+        </w:rPr>
+        <w:t xml:space="preserve"> </w:t>
+      </w:r>
+      <w:r>
+        <w:rPr>
+          <w:rFonts w:ascii="Palatino Linotype" w:hAnsi="Palatino Linotype"/>
+          <w:sz w:val="28"/>
+          <w:szCs w:val="28"/>
+          <w:lang w:val="en-US"/>
+        </w:rPr>
+        <w:t>изменения</w:t>
+      </w:r>
+      <w:r>
+        <w:rPr>
+          <w:rFonts w:ascii="Palatino Linotype" w:hAnsi="Palatino Linotype"/>
+          <w:sz w:val="28"/>
+          <w:szCs w:val="28"/>
+          <w:lang w:val="en-US"/>
+        </w:rPr>
+        <w:t xml:space="preserve"> в </w:t>
+      </w:r>
+      <w:r>
+        <w:rPr>
+          <w:rFonts w:ascii="Palatino Linotype" w:hAnsi="Palatino Linotype"/>
+          <w:sz w:val="28"/>
+          <w:szCs w:val="28"/>
+          <w:lang w:val="en-US"/>
+        </w:rPr>
+        <w:t>репозиторий</w:t>
+      </w:r>
+      <w:r>
+        <w:rPr>
+          <w:rFonts w:ascii="Palatino Linotype" w:hAnsi="Palatino Linotype"/>
+          <w:sz w:val="28"/>
+          <w:szCs w:val="28"/>
+          <w:lang w:val="en-US"/>
+        </w:rPr>
+        <w:t xml:space="preserve"> (закоммитить)</w:t>
+      </w:r>
+      <w:r>
+        <w:rPr>
+          <w:rFonts w:ascii="Palatino Linotype" w:hAnsi="Palatino Linotype"/>
+          <w:sz w:val="28"/>
+          <w:szCs w:val="28"/>
+          <w:lang w:val="en-US"/>
+        </w:rPr>
+        <w:t>.</w:t>
+      </w:r>
+    </w:p>
+    <w:p>
+      <w:pPr>
+        <w:pStyle w:val="ListParagraph"/>
+        <w:numPr>
+          <w:ilvl w:val="0"/>
+          <w:numId w:val="3"/>
+        </w:numPr>
+        <w:rPr>
+          <w:rFonts w:ascii="Palatino Linotype" w:hAnsi="Palatino Linotype"/>
+          <w:color w:val="000000" w:themeColor="text1" w:themeTint="FF" w:themeShade="FF"/>
+          <w:sz w:val="28"/>
+          <w:szCs w:val="28"/>
+          <w:lang w:val="en-US"/>
+        </w:rPr>
+      </w:pPr>
+      <w:r>
+        <w:rPr>
+          <w:rFonts w:ascii="Palatino Linotype" w:hAnsi="Palatino Linotype"/>
+          <w:sz w:val="28"/>
+          <w:szCs w:val="28"/>
+          <w:lang w:val="en-US"/>
+        </w:rPr>
+        <w:t>Нам</w:t>
+      </w:r>
+      <w:r>
+        <w:rPr>
+          <w:rFonts w:ascii="Palatino Linotype" w:hAnsi="Palatino Linotype"/>
+          <w:sz w:val="28"/>
+          <w:szCs w:val="28"/>
+          <w:lang w:val="en-US"/>
+        </w:rPr>
+        <w:t xml:space="preserve"> </w:t>
+      </w:r>
+      <w:r>
+        <w:rPr>
+          <w:rFonts w:ascii="Palatino Linotype" w:hAnsi="Palatino Linotype"/>
+          <w:sz w:val="28"/>
+          <w:szCs w:val="28"/>
+          <w:lang w:val="en-US"/>
+        </w:rPr>
+        <w:t>нужно</w:t>
+      </w:r>
+      <w:r>
+        <w:rPr>
+          <w:rFonts w:ascii="Palatino Linotype" w:hAnsi="Palatino Linotype"/>
+          <w:sz w:val="28"/>
+          <w:szCs w:val="28"/>
+          <w:lang w:val="en-US"/>
+        </w:rPr>
+        <w:t xml:space="preserve"> </w:t>
+      </w:r>
+      <w:r>
+        <w:rPr>
+          <w:rFonts w:ascii="Palatino Linotype" w:hAnsi="Palatino Linotype"/>
+          <w:sz w:val="28"/>
+          <w:szCs w:val="28"/>
+          <w:lang w:val="en-US"/>
+        </w:rPr>
+        <w:t>добавить</w:t>
+      </w:r>
+      <w:r>
+        <w:rPr>
+          <w:rFonts w:ascii="Palatino Linotype" w:hAnsi="Palatino Linotype"/>
+          <w:sz w:val="28"/>
+          <w:szCs w:val="28"/>
+          <w:lang w:val="en-US"/>
+        </w:rPr>
+        <w:t xml:space="preserve"> </w:t>
+      </w:r>
+      <w:r>
+        <w:rPr>
+          <w:rFonts w:ascii="Palatino Linotype" w:hAnsi="Palatino Linotype"/>
+          <w:sz w:val="28"/>
+          <w:szCs w:val="28"/>
+          <w:lang w:val="en-US"/>
+        </w:rPr>
+        <w:t>файл</w:t>
+      </w:r>
+      <w:r>
+        <w:rPr>
+          <w:rFonts w:ascii="Palatino Linotype" w:hAnsi="Palatino Linotype"/>
+          <w:sz w:val="28"/>
+          <w:szCs w:val="28"/>
+          <w:lang w:val="en-US"/>
+        </w:rPr>
+        <w:t xml:space="preserve"> в </w:t>
+      </w:r>
+      <w:r>
+        <w:rPr>
+          <w:rFonts w:ascii="Palatino Linotype" w:hAnsi="Palatino Linotype"/>
+          <w:sz w:val="28"/>
+          <w:szCs w:val="28"/>
+          <w:lang w:val="en-US"/>
+        </w:rPr>
+        <w:t>каталог</w:t>
+      </w:r>
+      <w:r>
+        <w:rPr>
+          <w:rFonts w:ascii="Palatino Linotype" w:hAnsi="Palatino Linotype"/>
+          <w:sz w:val="28"/>
+          <w:szCs w:val="28"/>
+          <w:lang w:val="en-US"/>
+        </w:rPr>
+        <w:t xml:space="preserve"> Git.</w:t>
+      </w:r>
+    </w:p>
+    <w:p>
+      <w:pPr>
+        <w:pStyle w:val="ListParagraph"/>
+        <w:numPr>
+          <w:ilvl w:val="0"/>
+          <w:numId w:val="3"/>
+        </w:numPr>
+        <w:rPr>
+          <w:rFonts w:ascii="Palatino Linotype" w:hAnsi="Palatino Linotype"/>
+          <w:color w:val="000000" w:themeColor="text1" w:themeTint="FF" w:themeShade="FF"/>
+          <w:sz w:val="28"/>
+          <w:szCs w:val="28"/>
+          <w:lang w:val="en-US"/>
+        </w:rPr>
+      </w:pPr>
+      <w:r>
+        <w:rPr>
+          <w:rFonts w:ascii="Palatino Linotype" w:hAnsi="Palatino Linotype"/>
+          <w:sz w:val="28"/>
+          <w:szCs w:val="28"/>
+          <w:lang w:val="en-US"/>
+        </w:rPr>
+        <w:t>Нам</w:t>
+      </w:r>
+      <w:r>
+        <w:rPr>
+          <w:rFonts w:ascii="Palatino Linotype" w:hAnsi="Palatino Linotype"/>
+          <w:sz w:val="28"/>
+          <w:szCs w:val="28"/>
+          <w:lang w:val="en-US"/>
+        </w:rPr>
+        <w:t xml:space="preserve"> </w:t>
+      </w:r>
+      <w:r>
+        <w:rPr>
+          <w:rFonts w:ascii="Palatino Linotype" w:hAnsi="Palatino Linotype"/>
+          <w:sz w:val="28"/>
+          <w:szCs w:val="28"/>
+          <w:lang w:val="en-US"/>
+        </w:rPr>
+        <w:t>нужно</w:t>
+      </w:r>
+      <w:r>
+        <w:rPr>
+          <w:rFonts w:ascii="Palatino Linotype" w:hAnsi="Palatino Linotype"/>
+          <w:sz w:val="28"/>
+          <w:szCs w:val="28"/>
+          <w:lang w:val="en-US"/>
+        </w:rPr>
+        <w:t xml:space="preserve"> </w:t>
+      </w:r>
+      <w:r>
+        <w:rPr>
+          <w:rFonts w:ascii="Palatino Linotype" w:hAnsi="Palatino Linotype"/>
+          <w:sz w:val="28"/>
+          <w:szCs w:val="28"/>
+          <w:lang w:val="en-US"/>
+        </w:rPr>
+        <w:t>переключиться</w:t>
+      </w:r>
+      <w:r>
+        <w:rPr>
+          <w:rFonts w:ascii="Palatino Linotype" w:hAnsi="Palatino Linotype"/>
+          <w:sz w:val="28"/>
+          <w:szCs w:val="28"/>
+          <w:lang w:val="en-US"/>
+        </w:rPr>
+        <w:t xml:space="preserve"> </w:t>
+      </w:r>
+      <w:r>
+        <w:rPr>
+          <w:rFonts w:ascii="Palatino Linotype" w:hAnsi="Palatino Linotype"/>
+          <w:sz w:val="28"/>
+          <w:szCs w:val="28"/>
+          <w:lang w:val="en-US"/>
+        </w:rPr>
+        <w:t>на</w:t>
+      </w:r>
+      <w:r>
+        <w:rPr>
+          <w:rFonts w:ascii="Palatino Linotype" w:hAnsi="Palatino Linotype"/>
+          <w:sz w:val="28"/>
+          <w:szCs w:val="28"/>
+          <w:lang w:val="en-US"/>
+        </w:rPr>
+        <w:t xml:space="preserve"> </w:t>
+      </w:r>
+      <w:r>
+        <w:rPr>
+          <w:rFonts w:ascii="Palatino Linotype" w:hAnsi="Palatino Linotype"/>
+          <w:sz w:val="28"/>
+          <w:szCs w:val="28"/>
+          <w:lang w:val="en-US"/>
+        </w:rPr>
+        <w:t>другую</w:t>
+      </w:r>
+      <w:r>
+        <w:rPr>
+          <w:rFonts w:ascii="Palatino Linotype" w:hAnsi="Palatino Linotype"/>
+          <w:sz w:val="28"/>
+          <w:szCs w:val="28"/>
+          <w:lang w:val="en-US"/>
+        </w:rPr>
+        <w:t xml:space="preserve"> </w:t>
+      </w:r>
+      <w:r>
+        <w:rPr>
+          <w:rFonts w:ascii="Palatino Linotype" w:hAnsi="Palatino Linotype"/>
+          <w:sz w:val="28"/>
+          <w:szCs w:val="28"/>
+          <w:lang w:val="en-US"/>
+        </w:rPr>
+        <w:t>ветку</w:t>
+      </w:r>
+      <w:r>
+        <w:rPr>
+          <w:rFonts w:ascii="Palatino Linotype" w:hAnsi="Palatino Linotype"/>
+          <w:sz w:val="28"/>
+          <w:szCs w:val="28"/>
+          <w:lang w:val="en-US"/>
+        </w:rPr>
+        <w:t>.</w:t>
+      </w:r>
+    </w:p>
+    <w:p>
+      <w:pPr>
+        <w:pStyle w:val="a"/>
+        <w:ind w:left="0"/>
+        <w:rPr>
+          <w:rFonts w:ascii="Palatino Linotype" w:hAnsi="Palatino Linotype"/>
+          <w:color w:val="000000" w:themeColor="text1" w:themeTint="FF" w:themeShade="FF"/>
+          <w:sz w:val="28"/>
+          <w:szCs w:val="28"/>
+          <w:lang w:val="en-US"/>
+        </w:rPr>
+      </w:pPr>
+      <w:r>
+        <w:rPr>
+          <w:rFonts w:ascii="Palatino Linotype" w:hAnsi="Palatino Linotype"/>
+          <w:color w:val="000000" w:themeColor="text1" w:themeTint="FF" w:themeShade="FF"/>
+          <w:sz w:val="28"/>
+          <w:szCs w:val="28"/>
+          <w:lang w:val="en-US"/>
+        </w:rPr>
+        <w:t>Верный</w:t>
+      </w:r>
+      <w:r>
+        <w:rPr>
+          <w:rFonts w:ascii="Palatino Linotype" w:hAnsi="Palatino Linotype"/>
+          <w:color w:val="000000" w:themeColor="text1" w:themeTint="FF" w:themeShade="FF"/>
+          <w:sz w:val="28"/>
+          <w:szCs w:val="28"/>
+          <w:lang w:val="en-US"/>
+        </w:rPr>
+        <w:t xml:space="preserve"> </w:t>
+      </w:r>
+      <w:r>
+        <w:rPr>
+          <w:rFonts w:ascii="Palatino Linotype" w:hAnsi="Palatino Linotype"/>
+          <w:color w:val="000000" w:themeColor="text1" w:themeTint="FF" w:themeShade="FF"/>
+          <w:sz w:val="28"/>
+          <w:szCs w:val="28"/>
+          <w:lang w:val="en-US"/>
+        </w:rPr>
+        <w:t>ответ</w:t>
+      </w:r>
+      <w:r>
+        <w:rPr>
+          <w:rFonts w:ascii="Palatino Linotype" w:hAnsi="Palatino Linotype"/>
+          <w:color w:val="000000" w:themeColor="text1" w:themeTint="FF" w:themeShade="FF"/>
+          <w:sz w:val="28"/>
+          <w:szCs w:val="28"/>
+          <w:lang w:val="en-US"/>
+        </w:rPr>
+        <w:t>: a</w:t>
+      </w:r>
+    </w:p>
+    <w:p>
+      <w:pPr>
+        <w:pStyle w:val="a"/>
+        <w:ind w:left="0"/>
+        <w:rPr>
+          <w:rFonts w:ascii="Palatino Linotype" w:hAnsi="Palatino Linotype"/>
+          <w:color w:val="000000" w:themeColor="text1" w:themeTint="FF" w:themeShade="FF"/>
+          <w:sz w:val="28"/>
+          <w:szCs w:val="28"/>
+          <w:lang w:val="en-US"/>
+        </w:rPr>
+      </w:pPr>
+    </w:p>
+    <w:p>
+      <w:pPr>
+        <w:pStyle w:val="a"/>
+        <w:ind w:left="0"/>
+        <w:rPr>
+          <w:rFonts w:ascii="Palatino Linotype" w:hAnsi="Palatino Linotype"/>
+          <w:color w:val="000000" w:themeColor="text1" w:themeTint="FF" w:themeShade="FF"/>
+          <w:sz w:val="28"/>
+          <w:szCs w:val="28"/>
+          <w:lang w:val="en-US"/>
+        </w:rPr>
+      </w:pPr>
+      <w:r>
+        <w:rPr>
+          <w:rFonts w:ascii="Palatino Linotype" w:hAnsi="Palatino Linotype"/>
+          <w:color w:val="000000" w:themeColor="text1" w:themeTint="FF" w:themeShade="FF"/>
+          <w:sz w:val="28"/>
+          <w:szCs w:val="28"/>
+          <w:lang w:val="en-US"/>
+        </w:rPr>
+        <w:t>Вопрос</w:t>
+      </w:r>
+      <w:r>
+        <w:rPr>
+          <w:rFonts w:ascii="Palatino Linotype" w:hAnsi="Palatino Linotype"/>
+          <w:color w:val="000000" w:themeColor="text1" w:themeTint="FF" w:themeShade="FF"/>
+          <w:sz w:val="28"/>
+          <w:szCs w:val="28"/>
+          <w:lang w:val="en-US"/>
+        </w:rPr>
+        <w:t xml:space="preserve"> 8:</w:t>
+      </w:r>
+    </w:p>
+    <w:p>
+      <w:pPr>
+        <w:pStyle w:val="a"/>
+        <w:ind w:left="0"/>
+        <w:rPr>
+          <w:rFonts w:ascii="Palatino Linotype" w:hAnsi="Palatino Linotype"/>
+          <w:color w:val="000000" w:themeColor="text1" w:themeTint="FF" w:themeShade="FF"/>
+          <w:sz w:val="28"/>
+          <w:szCs w:val="28"/>
+          <w:lang w:val="en-US"/>
+        </w:rPr>
+      </w:pPr>
+      <w:r>
+        <w:rPr>
+          <w:rFonts w:ascii="Palatino Linotype" w:hAnsi="Palatino Linotype"/>
+          <w:color w:val="000000" w:themeColor="text1" w:themeTint="FF" w:themeShade="FF"/>
+          <w:sz w:val="28"/>
+          <w:szCs w:val="28"/>
+          <w:lang w:val="en-US"/>
+        </w:rPr>
+        <w:t>Какой файл не будет зафиксирован командой git commit -a?</w:t>
+      </w:r>
+    </w:p>
+    <w:p>
+      <w:pPr>
+        <w:pStyle w:val="ListParagraph"/>
+        <w:numPr>
+          <w:ilvl w:val="0"/>
+          <w:numId w:val="4"/>
+        </w:numPr>
+        <w:rPr>
+          <w:rFonts w:ascii="Palatino Linotype" w:hAnsi="Palatino Linotype" w:eastAsia="Palatino Linotype" w:cs="Palatino Linotype"/>
+          <w:color w:val="000000" w:themeColor="text1" w:themeTint="FF" w:themeShade="FF"/>
+          <w:sz w:val="28"/>
+          <w:szCs w:val="28"/>
+        </w:rPr>
+      </w:pPr>
+      <w:r>
+        <w:rPr>
+          <w:rFonts w:ascii="Palatino Linotype" w:hAnsi="Palatino Linotype" w:eastAsia="Palatino Linotype" w:cs="Palatino Linotype"/>
+          <w:sz w:val="28"/>
+          <w:szCs w:val="28"/>
+        </w:rPr>
+        <w:t>Отслеживаемые файлы</w:t>
+      </w:r>
+    </w:p>
+    <w:p>
+      <w:pPr>
+        <w:pStyle w:val="ListParagraph"/>
+        <w:numPr>
+          <w:ilvl w:val="0"/>
+          <w:numId w:val="4"/>
+        </w:numPr>
+        <w:rPr>
+          <w:rFonts w:ascii="Palatino Linotype" w:hAnsi="Palatino Linotype" w:eastAsia="Palatino Linotype" w:cs="Palatino Linotype"/>
+          <w:color w:val="000000" w:themeColor="text1" w:themeTint="FF" w:themeShade="FF"/>
+          <w:sz w:val="28"/>
+          <w:szCs w:val="28"/>
+        </w:rPr>
+      </w:pPr>
+      <w:r>
+        <w:rPr>
+          <w:rFonts w:ascii="Palatino Linotype" w:hAnsi="Palatino Linotype" w:eastAsia="Palatino Linotype" w:cs="Palatino Linotype"/>
+          <w:sz w:val="28"/>
+          <w:szCs w:val="28"/>
+        </w:rPr>
+        <w:t>Новые файлы</w:t>
+      </w:r>
+    </w:p>
+    <w:p>
+      <w:pPr>
+        <w:pStyle w:val="ListParagraph"/>
+        <w:numPr>
+          <w:ilvl w:val="0"/>
+          <w:numId w:val="4"/>
+        </w:numPr>
+        <w:rPr>
+          <w:rFonts w:ascii="Palatino Linotype" w:hAnsi="Palatino Linotype" w:eastAsia="Palatino Linotype" w:cs="Palatino Linotype"/>
+          <w:color w:val="000000" w:themeColor="text1" w:themeTint="FF" w:themeShade="FF"/>
+          <w:sz w:val="28"/>
+          <w:szCs w:val="28"/>
+        </w:rPr>
+      </w:pPr>
+      <w:r>
+        <w:rPr>
+          <w:rFonts w:ascii="Palatino Linotype" w:hAnsi="Palatino Linotype" w:eastAsia="Palatino Linotype" w:cs="Palatino Linotype"/>
+          <w:sz w:val="28"/>
+          <w:szCs w:val="28"/>
+        </w:rPr>
+        <w:t>Старые файлы</w:t>
+      </w:r>
+    </w:p>
+    <w:p>
+      <w:pPr>
+        <w:pStyle w:val="ListParagraph"/>
+        <w:numPr>
+          <w:ilvl w:val="0"/>
+          <w:numId w:val="4"/>
+        </w:numPr>
+        <w:rPr>
+          <w:rFonts w:ascii="Palatino Linotype" w:hAnsi="Palatino Linotype" w:eastAsia="Palatino Linotype" w:cs="Palatino Linotype"/>
+          <w:color w:val="000000" w:themeColor="text1" w:themeTint="FF" w:themeShade="FF"/>
+          <w:sz w:val="28"/>
+          <w:szCs w:val="28"/>
+        </w:rPr>
+      </w:pPr>
+      <w:r>
+        <w:rPr>
+          <w:rFonts w:ascii="Palatino Linotype" w:hAnsi="Palatino Linotype" w:eastAsia="Palatino Linotype" w:cs="Palatino Linotype"/>
+          <w:sz w:val="28"/>
+          <w:szCs w:val="28"/>
+        </w:rPr>
+        <w:t>Поэтапные файлы</w:t>
+      </w:r>
+    </w:p>
+    <w:p>
+      <w:pPr>
+        <w:pStyle w:val="a"/>
+        <w:ind w:left="0"/>
+        <w:rPr>
+          <w:rFonts w:ascii="Palatino Linotype" w:hAnsi="Palatino Linotype"/>
+          <w:color w:val="000000" w:themeColor="text1" w:themeTint="FF" w:themeShade="FF"/>
+          <w:sz w:val="28"/>
+          <w:szCs w:val="28"/>
+          <w:lang w:val="en-US"/>
+        </w:rPr>
+      </w:pPr>
+      <w:r>
+        <w:rPr>
+          <w:rFonts w:ascii="Palatino Linotype" w:hAnsi="Palatino Linotype"/>
+          <w:color w:val="000000" w:themeColor="text1" w:themeTint="FF" w:themeShade="FF"/>
+          <w:sz w:val="28"/>
+          <w:szCs w:val="28"/>
+          <w:lang w:val="en-US"/>
+        </w:rPr>
+        <w:t>Верный</w:t>
+      </w:r>
+      <w:r>
+        <w:rPr>
+          <w:rFonts w:ascii="Palatino Linotype" w:hAnsi="Palatino Linotype"/>
+          <w:color w:val="000000" w:themeColor="text1" w:themeTint="FF" w:themeShade="FF"/>
+          <w:sz w:val="28"/>
+          <w:szCs w:val="28"/>
+          <w:lang w:val="en-US"/>
+        </w:rPr>
+        <w:t xml:space="preserve"> </w:t>
+      </w:r>
+      <w:r>
+        <w:rPr>
+          <w:rFonts w:ascii="Palatino Linotype" w:hAnsi="Palatino Linotype"/>
+          <w:color w:val="000000" w:themeColor="text1" w:themeTint="FF" w:themeShade="FF"/>
+          <w:sz w:val="28"/>
+          <w:szCs w:val="28"/>
+          <w:lang w:val="en-US"/>
+        </w:rPr>
+        <w:t>ответ</w:t>
+      </w:r>
+      <w:r>
+        <w:rPr>
+          <w:rFonts w:ascii="Palatino Linotype" w:hAnsi="Palatino Linotype"/>
+          <w:color w:val="000000" w:themeColor="text1" w:themeTint="FF" w:themeShade="FF"/>
+          <w:sz w:val="28"/>
+          <w:szCs w:val="28"/>
+          <w:lang w:val="en-US"/>
+        </w:rPr>
+        <w:t>: b</w:t>
+      </w:r>
+    </w:p>
+    <w:p>
+      <w:pPr>
+        <w:pStyle w:val="a"/>
+        <w:ind w:left="0"/>
+        <w:rPr>
+          <w:rFonts w:ascii="Palatino Linotype" w:hAnsi="Palatino Linotype"/>
+          <w:color w:val="000000" w:themeColor="text1" w:themeTint="FF" w:themeShade="FF"/>
+          <w:sz w:val="28"/>
+          <w:szCs w:val="28"/>
+          <w:lang w:val="en-US"/>
+        </w:rPr>
+      </w:pPr>
+    </w:p>
+    <w:p>
+      <w:pPr>
+        <w:pStyle w:val="a"/>
+        <w:ind w:left="0"/>
+        <w:rPr>
+          <w:rFonts w:ascii="Palatino Linotype" w:hAnsi="Palatino Linotype"/>
+          <w:color w:val="000000" w:themeColor="text1" w:themeTint="FF" w:themeShade="FF"/>
+          <w:sz w:val="28"/>
+          <w:szCs w:val="28"/>
+          <w:lang w:val="en-US"/>
+        </w:rPr>
+      </w:pPr>
+      <w:r>
+        <w:rPr>
+          <w:rFonts w:ascii="Palatino Linotype" w:hAnsi="Palatino Linotype"/>
+          <w:color w:val="000000" w:themeColor="text1" w:themeTint="FF" w:themeShade="FF"/>
+          <w:sz w:val="28"/>
+          <w:szCs w:val="28"/>
+          <w:lang w:val="en-US"/>
+        </w:rPr>
+        <w:t>Вопрос</w:t>
+      </w:r>
+      <w:r>
+        <w:rPr>
+          <w:rFonts w:ascii="Palatino Linotype" w:hAnsi="Palatino Linotype"/>
+          <w:color w:val="000000" w:themeColor="text1" w:themeTint="FF" w:themeShade="FF"/>
+          <w:sz w:val="28"/>
+          <w:szCs w:val="28"/>
+          <w:lang w:val="en-US"/>
+        </w:rPr>
+        <w:t xml:space="preserve"> 9:</w:t>
+      </w:r>
+    </w:p>
+    <w:p>
+      <w:pPr>
+        <w:pStyle w:val="a"/>
+        <w:ind w:left="0"/>
+        <w:rPr>
+          <w:rFonts w:ascii="Palatino Linotype" w:hAnsi="Palatino Linotype"/>
+          <w:color w:val="000000" w:themeColor="text1" w:themeTint="FF" w:themeShade="FF"/>
+          <w:sz w:val="28"/>
+          <w:szCs w:val="28"/>
+          <w:lang w:val="en-US"/>
+        </w:rPr>
+      </w:pPr>
+      <w:r>
+        <w:rPr>
+          <w:rFonts w:ascii="Palatino Linotype" w:hAnsi="Palatino Linotype"/>
+          <w:color w:val="000000" w:themeColor="text1" w:themeTint="FF" w:themeShade="FF"/>
+          <w:sz w:val="28"/>
+          <w:szCs w:val="28"/>
+          <w:lang w:val="en-US"/>
+        </w:rPr>
+        <w:t>Как</w:t>
+      </w:r>
+      <w:r>
+        <w:rPr>
+          <w:rFonts w:ascii="Palatino Linotype" w:hAnsi="Palatino Linotype"/>
+          <w:color w:val="000000" w:themeColor="text1" w:themeTint="FF" w:themeShade="FF"/>
+          <w:sz w:val="28"/>
+          <w:szCs w:val="28"/>
+          <w:lang w:val="en-US"/>
+        </w:rPr>
+        <w:t xml:space="preserve"> </w:t>
+      </w:r>
+      <w:r>
+        <w:rPr>
+          <w:rFonts w:ascii="Palatino Linotype" w:hAnsi="Palatino Linotype"/>
+          <w:color w:val="000000" w:themeColor="text1" w:themeTint="FF" w:themeShade="FF"/>
+          <w:sz w:val="28"/>
+          <w:szCs w:val="28"/>
+          <w:lang w:val="en-US"/>
+        </w:rPr>
+        <w:t>отобразить</w:t>
+      </w:r>
+      <w:r>
+        <w:rPr>
+          <w:rFonts w:ascii="Palatino Linotype" w:hAnsi="Palatino Linotype"/>
+          <w:color w:val="000000" w:themeColor="text1" w:themeTint="FF" w:themeShade="FF"/>
+          <w:sz w:val="28"/>
+          <w:szCs w:val="28"/>
+          <w:lang w:val="en-US"/>
+        </w:rPr>
+        <w:t xml:space="preserve"> </w:t>
+      </w:r>
+      <w:r>
+        <w:rPr>
+          <w:rFonts w:ascii="Palatino Linotype" w:hAnsi="Palatino Linotype"/>
+          <w:color w:val="000000" w:themeColor="text1" w:themeTint="FF" w:themeShade="FF"/>
+          <w:sz w:val="28"/>
+          <w:szCs w:val="28"/>
+          <w:lang w:val="en-US"/>
+        </w:rPr>
+        <w:t>сводную</w:t>
+      </w:r>
+      <w:r>
+        <w:rPr>
+          <w:rFonts w:ascii="Palatino Linotype" w:hAnsi="Palatino Linotype"/>
+          <w:color w:val="000000" w:themeColor="text1" w:themeTint="FF" w:themeShade="FF"/>
+          <w:sz w:val="28"/>
+          <w:szCs w:val="28"/>
+          <w:lang w:val="en-US"/>
+        </w:rPr>
+        <w:t xml:space="preserve"> </w:t>
+      </w:r>
+      <w:r>
+        <w:rPr>
+          <w:rFonts w:ascii="Palatino Linotype" w:hAnsi="Palatino Linotype"/>
+          <w:color w:val="000000" w:themeColor="text1" w:themeTint="FF" w:themeShade="FF"/>
+          <w:sz w:val="28"/>
+          <w:szCs w:val="28"/>
+          <w:lang w:val="en-US"/>
+        </w:rPr>
+        <w:t>информацию</w:t>
+      </w:r>
+      <w:r>
+        <w:rPr>
+          <w:rFonts w:ascii="Palatino Linotype" w:hAnsi="Palatino Linotype"/>
+          <w:color w:val="000000" w:themeColor="text1" w:themeTint="FF" w:themeShade="FF"/>
+          <w:sz w:val="28"/>
+          <w:szCs w:val="28"/>
+          <w:lang w:val="en-US"/>
+        </w:rPr>
+        <w:t xml:space="preserve"> </w:t>
+      </w:r>
+      <w:r>
+        <w:rPr>
+          <w:rFonts w:ascii="Palatino Linotype" w:hAnsi="Palatino Linotype"/>
+          <w:color w:val="000000" w:themeColor="text1" w:themeTint="FF" w:themeShade="FF"/>
+          <w:sz w:val="28"/>
+          <w:szCs w:val="28"/>
+          <w:lang w:val="en-US"/>
+        </w:rPr>
+        <w:t>об</w:t>
+      </w:r>
+      <w:r>
+        <w:rPr>
+          <w:rFonts w:ascii="Palatino Linotype" w:hAnsi="Palatino Linotype"/>
+          <w:color w:val="000000" w:themeColor="text1" w:themeTint="FF" w:themeShade="FF"/>
+          <w:sz w:val="28"/>
+          <w:szCs w:val="28"/>
+          <w:lang w:val="en-US"/>
+        </w:rPr>
+        <w:t xml:space="preserve"> </w:t>
+      </w:r>
+      <w:r>
+        <w:rPr>
+          <w:rFonts w:ascii="Palatino Linotype" w:hAnsi="Palatino Linotype"/>
+          <w:color w:val="000000" w:themeColor="text1" w:themeTint="FF" w:themeShade="FF"/>
+          <w:sz w:val="28"/>
+          <w:szCs w:val="28"/>
+          <w:lang w:val="en-US"/>
+        </w:rPr>
+        <w:t>истории</w:t>
+      </w:r>
+      <w:r>
+        <w:rPr>
+          <w:rFonts w:ascii="Palatino Linotype" w:hAnsi="Palatino Linotype"/>
+          <w:color w:val="000000" w:themeColor="text1" w:themeTint="FF" w:themeShade="FF"/>
+          <w:sz w:val="28"/>
+          <w:szCs w:val="28"/>
+          <w:lang w:val="en-US"/>
+        </w:rPr>
+        <w:t xml:space="preserve"> </w:t>
+      </w:r>
+      <w:r>
+        <w:rPr>
+          <w:rFonts w:ascii="Palatino Linotype" w:hAnsi="Palatino Linotype"/>
+          <w:color w:val="000000" w:themeColor="text1" w:themeTint="FF" w:themeShade="FF"/>
+          <w:sz w:val="28"/>
+          <w:szCs w:val="28"/>
+          <w:lang w:val="en-US"/>
+        </w:rPr>
+        <w:t>коммитов</w:t>
+      </w:r>
+      <w:r>
+        <w:rPr>
+          <w:rFonts w:ascii="Palatino Linotype" w:hAnsi="Palatino Linotype"/>
+          <w:color w:val="000000" w:themeColor="text1" w:themeTint="FF" w:themeShade="FF"/>
+          <w:sz w:val="28"/>
+          <w:szCs w:val="28"/>
+          <w:lang w:val="en-US"/>
+        </w:rPr>
+        <w:t xml:space="preserve"> в </w:t>
+      </w:r>
+      <w:r>
+        <w:rPr>
+          <w:rFonts w:ascii="Palatino Linotype" w:hAnsi="Palatino Linotype"/>
+          <w:color w:val="000000" w:themeColor="text1" w:themeTint="FF" w:themeShade="FF"/>
+          <w:sz w:val="28"/>
+          <w:szCs w:val="28"/>
+          <w:lang w:val="en-US"/>
+        </w:rPr>
+        <w:t>репозитории</w:t>
+      </w:r>
+      <w:r>
+        <w:rPr>
+          <w:rFonts w:ascii="Palatino Linotype" w:hAnsi="Palatino Linotype"/>
+          <w:color w:val="000000" w:themeColor="text1" w:themeTint="FF" w:themeShade="FF"/>
+          <w:sz w:val="28"/>
+          <w:szCs w:val="28"/>
+          <w:lang w:val="en-US"/>
+        </w:rPr>
+        <w:t xml:space="preserve">, </w:t>
+      </w:r>
+      <w:r>
+        <w:rPr>
+          <w:rFonts w:ascii="Palatino Linotype" w:hAnsi="Palatino Linotype"/>
+          <w:color w:val="000000" w:themeColor="text1" w:themeTint="FF" w:themeShade="FF"/>
+          <w:sz w:val="28"/>
+          <w:szCs w:val="28"/>
+          <w:lang w:val="en-US"/>
+        </w:rPr>
+        <w:t>показывая</w:t>
+      </w:r>
+      <w:r>
+        <w:rPr>
+          <w:rFonts w:ascii="Palatino Linotype" w:hAnsi="Palatino Linotype"/>
+          <w:color w:val="000000" w:themeColor="text1" w:themeTint="FF" w:themeShade="FF"/>
+          <w:sz w:val="28"/>
+          <w:szCs w:val="28"/>
+          <w:lang w:val="en-US"/>
+        </w:rPr>
+        <w:t xml:space="preserve"> </w:t>
+      </w:r>
+      <w:r>
+        <w:rPr>
+          <w:rFonts w:ascii="Palatino Linotype" w:hAnsi="Palatino Linotype"/>
+          <w:color w:val="000000" w:themeColor="text1" w:themeTint="FF" w:themeShade="FF"/>
+          <w:sz w:val="28"/>
+          <w:szCs w:val="28"/>
+          <w:lang w:val="en-US"/>
+        </w:rPr>
+        <w:t>по</w:t>
+      </w:r>
+      <w:r>
+        <w:rPr>
+          <w:rFonts w:ascii="Palatino Linotype" w:hAnsi="Palatino Linotype"/>
+          <w:color w:val="000000" w:themeColor="text1" w:themeTint="FF" w:themeShade="FF"/>
+          <w:sz w:val="28"/>
+          <w:szCs w:val="28"/>
+          <w:lang w:val="en-US"/>
+        </w:rPr>
+        <w:t xml:space="preserve"> </w:t>
+      </w:r>
+      <w:r>
+        <w:rPr>
+          <w:rFonts w:ascii="Palatino Linotype" w:hAnsi="Palatino Linotype"/>
+          <w:color w:val="000000" w:themeColor="text1" w:themeTint="FF" w:themeShade="FF"/>
+          <w:sz w:val="28"/>
+          <w:szCs w:val="28"/>
+          <w:lang w:val="en-US"/>
+        </w:rPr>
+        <w:t>одной</w:t>
+      </w:r>
+      <w:r>
+        <w:rPr>
+          <w:rFonts w:ascii="Palatino Linotype" w:hAnsi="Palatino Linotype"/>
+          <w:color w:val="000000" w:themeColor="text1" w:themeTint="FF" w:themeShade="FF"/>
+          <w:sz w:val="28"/>
+          <w:szCs w:val="28"/>
+          <w:lang w:val="en-US"/>
+        </w:rPr>
+        <w:t xml:space="preserve"> </w:t>
+      </w:r>
+      <w:r>
+        <w:rPr>
+          <w:rFonts w:ascii="Palatino Linotype" w:hAnsi="Palatino Linotype"/>
+          <w:color w:val="000000" w:themeColor="text1" w:themeTint="FF" w:themeShade="FF"/>
+          <w:sz w:val="28"/>
+          <w:szCs w:val="28"/>
+          <w:lang w:val="en-US"/>
+        </w:rPr>
+        <w:t>строке</w:t>
+      </w:r>
+      <w:r>
+        <w:rPr>
+          <w:rFonts w:ascii="Palatino Linotype" w:hAnsi="Palatino Linotype"/>
+          <w:color w:val="000000" w:themeColor="text1" w:themeTint="FF" w:themeShade="FF"/>
+          <w:sz w:val="28"/>
+          <w:szCs w:val="28"/>
+          <w:lang w:val="en-US"/>
+        </w:rPr>
+        <w:t xml:space="preserve"> </w:t>
+      </w:r>
+      <w:r>
+        <w:rPr>
+          <w:rFonts w:ascii="Palatino Linotype" w:hAnsi="Palatino Linotype"/>
+          <w:color w:val="000000" w:themeColor="text1" w:themeTint="FF" w:themeShade="FF"/>
+          <w:sz w:val="28"/>
+          <w:szCs w:val="28"/>
+          <w:lang w:val="en-US"/>
+        </w:rPr>
+        <w:t>на</w:t>
+      </w:r>
+      <w:r>
+        <w:rPr>
+          <w:rFonts w:ascii="Palatino Linotype" w:hAnsi="Palatino Linotype"/>
+          <w:color w:val="000000" w:themeColor="text1" w:themeTint="FF" w:themeShade="FF"/>
+          <w:sz w:val="28"/>
+          <w:szCs w:val="28"/>
+          <w:lang w:val="en-US"/>
+        </w:rPr>
+        <w:t xml:space="preserve"> </w:t>
+      </w:r>
+      <w:r>
+        <w:rPr>
+          <w:rFonts w:ascii="Palatino Linotype" w:hAnsi="Palatino Linotype"/>
+          <w:color w:val="000000" w:themeColor="text1" w:themeTint="FF" w:themeShade="FF"/>
+          <w:sz w:val="28"/>
+          <w:szCs w:val="28"/>
+          <w:lang w:val="en-US"/>
+        </w:rPr>
+        <w:t>каждый</w:t>
+      </w:r>
+      <w:r>
+        <w:rPr>
+          <w:rFonts w:ascii="Palatino Linotype" w:hAnsi="Palatino Linotype"/>
+          <w:color w:val="000000" w:themeColor="text1" w:themeTint="FF" w:themeShade="FF"/>
+          <w:sz w:val="28"/>
+          <w:szCs w:val="28"/>
+          <w:lang w:val="en-US"/>
+        </w:rPr>
+        <w:t xml:space="preserve"> </w:t>
+      </w:r>
+      <w:r>
+        <w:rPr>
+          <w:rFonts w:ascii="Palatino Linotype" w:hAnsi="Palatino Linotype"/>
+          <w:color w:val="000000" w:themeColor="text1" w:themeTint="FF" w:themeShade="FF"/>
+          <w:sz w:val="28"/>
+          <w:szCs w:val="28"/>
+          <w:lang w:val="en-US"/>
+        </w:rPr>
+        <w:t>коммит</w:t>
+      </w:r>
+      <w:r>
+        <w:rPr>
+          <w:rFonts w:ascii="Palatino Linotype" w:hAnsi="Palatino Linotype"/>
+          <w:color w:val="000000" w:themeColor="text1" w:themeTint="FF" w:themeShade="FF"/>
+          <w:sz w:val="28"/>
+          <w:szCs w:val="28"/>
+          <w:lang w:val="en-US"/>
+        </w:rPr>
+        <w:t>?</w:t>
+      </w:r>
+    </w:p>
+    <w:p>
+      <w:pPr>
+        <w:pStyle w:val="ListParagraph"/>
+        <w:numPr>
+          <w:ilvl w:val="0"/>
+          <w:numId w:val="5"/>
+        </w:numPr>
+        <w:rPr>
+          <w:rFonts w:ascii="Palatino Linotype" w:hAnsi="Palatino Linotype"/>
+          <w:color w:val="000000" w:themeColor="text1" w:themeTint="FF" w:themeShade="FF"/>
+          <w:sz w:val="28"/>
+          <w:szCs w:val="28"/>
+          <w:lang w:val="en-US"/>
+        </w:rPr>
+      </w:pPr>
+      <w:r>
+        <w:rPr>
+          <w:rFonts w:ascii="Palatino Linotype" w:hAnsi="Palatino Linotype"/>
+          <w:color w:val="000000" w:themeColor="text1" w:themeTint="FF" w:themeShade="FF"/>
+          <w:sz w:val="28"/>
+          <w:szCs w:val="28"/>
+          <w:lang w:val="en-US"/>
+        </w:rPr>
+        <w:t>git log –format=short</w:t>
+      </w:r>
+    </w:p>
+    <w:p>
+      <w:pPr>
+        <w:pStyle w:val="ListParagraph"/>
+        <w:numPr>
+          <w:ilvl w:val="0"/>
+          <w:numId w:val="5"/>
+        </w:numPr>
+        <w:rPr>
+          <w:color w:val="000000" w:themeColor="text1" w:themeTint="FF" w:themeShade="FF"/>
+          <w:sz w:val="28"/>
+          <w:szCs w:val="28"/>
+        </w:rPr>
+      </w:pPr>
+      <w:r>
+        <w:rPr>
+          <w:sz w:val="28"/>
+          <w:szCs w:val="28"/>
+        </w:rPr>
+        <w:t>git</w:t>
+      </w:r>
+      <w:r>
+        <w:rPr>
+          <w:sz w:val="28"/>
+          <w:szCs w:val="28"/>
+        </w:rPr>
+        <w:t xml:space="preserve"> </w:t>
+      </w:r>
+      <w:r>
+        <w:rPr>
+          <w:sz w:val="28"/>
+          <w:szCs w:val="28"/>
+        </w:rPr>
+        <w:t>branch</w:t>
+      </w:r>
+      <w:r>
+        <w:rPr>
+          <w:sz w:val="28"/>
+          <w:szCs w:val="28"/>
+        </w:rPr>
+        <w:t xml:space="preserve"> -D</w:t>
+      </w:r>
+    </w:p>
+    <w:p>
+      <w:pPr>
+        <w:pStyle w:val="ListParagraph"/>
+        <w:numPr>
+          <w:ilvl w:val="0"/>
+          <w:numId w:val="5"/>
+        </w:numPr>
+        <w:rPr>
+          <w:color w:val="000000" w:themeColor="text1" w:themeTint="FF" w:themeShade="FF"/>
+          <w:sz w:val="28"/>
+          <w:szCs w:val="28"/>
+        </w:rPr>
+      </w:pPr>
+      <w:r>
+        <w:rPr>
+          <w:sz w:val="28"/>
+          <w:szCs w:val="28"/>
+        </w:rPr>
+        <w:t>git</w:t>
+      </w:r>
+      <w:r>
+        <w:rPr>
+          <w:sz w:val="28"/>
+          <w:szCs w:val="28"/>
+        </w:rPr>
+        <w:t xml:space="preserve"> </w:t>
+      </w:r>
+      <w:r>
+        <w:rPr>
+          <w:sz w:val="28"/>
+          <w:szCs w:val="28"/>
+        </w:rPr>
+        <w:t>log</w:t>
+      </w:r>
+      <w:r>
+        <w:rPr>
+          <w:sz w:val="28"/>
+          <w:szCs w:val="28"/>
+        </w:rPr>
+        <w:t xml:space="preserve"> –</w:t>
+      </w:r>
+      <w:r>
+        <w:rPr>
+          <w:sz w:val="28"/>
+          <w:szCs w:val="28"/>
+        </w:rPr>
+        <w:t>graph</w:t>
+      </w:r>
+      <w:r>
+        <w:rPr>
+          <w:sz w:val="28"/>
+          <w:szCs w:val="28"/>
+        </w:rPr>
+        <w:t xml:space="preserve"> –</w:t>
+      </w:r>
+      <w:r>
+        <w:rPr>
+          <w:sz w:val="28"/>
+          <w:szCs w:val="28"/>
+        </w:rPr>
+        <w:t>oneline</w:t>
+      </w:r>
+    </w:p>
+    <w:p>
+      <w:pPr>
+        <w:pStyle w:val="ListParagraph"/>
+        <w:numPr>
+          <w:ilvl w:val="0"/>
+          <w:numId w:val="5"/>
+        </w:numPr>
+        <w:rPr>
+          <w:color w:val="000000" w:themeColor="text1" w:themeTint="FF" w:themeShade="FF"/>
+          <w:sz w:val="28"/>
+          <w:szCs w:val="28"/>
+          <w:lang w:val="en-US"/>
+        </w:rPr>
+      </w:pPr>
+      <w:r>
+        <w:rPr>
+          <w:sz w:val="28"/>
+          <w:szCs w:val="28"/>
+        </w:rPr>
+        <w:t>git</w:t>
+      </w:r>
+      <w:r>
+        <w:rPr>
+          <w:sz w:val="28"/>
+          <w:szCs w:val="28"/>
+        </w:rPr>
+        <w:t xml:space="preserve"> </w:t>
+      </w:r>
+      <w:r>
+        <w:rPr>
+          <w:sz w:val="28"/>
+          <w:szCs w:val="28"/>
+        </w:rPr>
+        <w:t>checkout</w:t>
+      </w:r>
+      <w:r>
+        <w:rPr>
+          <w:sz w:val="28"/>
+          <w:szCs w:val="28"/>
+        </w:rPr>
+        <w:t xml:space="preserve"> -b</w:t>
+      </w:r>
+    </w:p>
+    <w:p>
+      <w:pPr>
+        <w:pStyle w:val="a"/>
+        <w:ind w:left="0"/>
+        <w:rPr>
+          <w:rFonts w:ascii="Palatino Linotype" w:hAnsi="Palatino Linotype"/>
+          <w:color w:val="000000" w:themeColor="text1" w:themeTint="FF" w:themeShade="FF"/>
+          <w:sz w:val="28"/>
+          <w:szCs w:val="28"/>
+          <w:lang w:val="en-US"/>
+        </w:rPr>
+      </w:pPr>
+      <w:r>
+        <w:rPr>
+          <w:rFonts w:ascii="Palatino Linotype" w:hAnsi="Palatino Linotype"/>
+          <w:color w:val="000000" w:themeColor="text1" w:themeTint="FF" w:themeShade="FF"/>
+          <w:sz w:val="28"/>
+          <w:szCs w:val="28"/>
+          <w:lang w:val="en-US"/>
+        </w:rPr>
+        <w:t>Верный</w:t>
+      </w:r>
+      <w:r>
+        <w:rPr>
+          <w:rFonts w:ascii="Palatino Linotype" w:hAnsi="Palatino Linotype"/>
+          <w:color w:val="000000" w:themeColor="text1" w:themeTint="FF" w:themeShade="FF"/>
+          <w:sz w:val="28"/>
+          <w:szCs w:val="28"/>
+          <w:lang w:val="en-US"/>
+        </w:rPr>
+        <w:t xml:space="preserve"> </w:t>
+      </w:r>
+      <w:r>
+        <w:rPr>
+          <w:rFonts w:ascii="Palatino Linotype" w:hAnsi="Palatino Linotype"/>
+          <w:color w:val="000000" w:themeColor="text1" w:themeTint="FF" w:themeShade="FF"/>
+          <w:sz w:val="28"/>
+          <w:szCs w:val="28"/>
+          <w:lang w:val="en-US"/>
+        </w:rPr>
+        <w:t>ответ</w:t>
+      </w:r>
+      <w:r>
+        <w:rPr>
+          <w:rFonts w:ascii="Palatino Linotype" w:hAnsi="Palatino Linotype"/>
+          <w:color w:val="000000" w:themeColor="text1" w:themeTint="FF" w:themeShade="FF"/>
+          <w:sz w:val="28"/>
+          <w:szCs w:val="28"/>
+          <w:lang w:val="en-US"/>
+        </w:rPr>
+        <w:t>: c</w:t>
+      </w:r>
+    </w:p>
+    <w:p>
+      <w:pPr>
+        <w:pStyle w:val="a"/>
+        <w:rPr>
+          <w:rFonts w:ascii="Palatino Linotype" w:hAnsi="Palatino Linotype"/>
+          <w:sz w:val="28"/>
+          <w:szCs w:val="28"/>
+          <w:lang w:val="en-US"/>
+        </w:rPr>
+      </w:pPr>
+    </w:p>
+    <w:p>
+      <w:pPr>
+        <w:pStyle w:val="a"/>
+        <w:rPr>
+          <w:rFonts w:ascii="Palatino Linotype" w:hAnsi="Palatino Linotype"/>
+          <w:sz w:val="28"/>
+          <w:szCs w:val="28"/>
+          <w:lang w:val="en-US"/>
+        </w:rPr>
+      </w:pPr>
+      <w:r>
+        <w:rPr>
+          <w:rFonts w:ascii="Palatino Linotype" w:hAnsi="Palatino Linotype"/>
+          <w:sz w:val="28"/>
+          <w:szCs w:val="28"/>
+          <w:lang w:val="en-US"/>
+        </w:rPr>
+        <w:t>Вопрос</w:t>
+      </w:r>
+      <w:r>
+        <w:rPr>
+          <w:rFonts w:ascii="Palatino Linotype" w:hAnsi="Palatino Linotype"/>
+          <w:sz w:val="28"/>
+          <w:szCs w:val="28"/>
+          <w:lang w:val="en-US"/>
+        </w:rPr>
+        <w:t xml:space="preserve">  10:</w:t>
+      </w:r>
+    </w:p>
+    <w:p>
+      <w:pPr>
+        <w:pStyle w:val="a"/>
+        <w:rPr>
+          <w:rFonts w:ascii="Palatino Linotype" w:hAnsi="Palatino Linotype"/>
+          <w:sz w:val="28"/>
+          <w:szCs w:val="28"/>
+          <w:lang w:val="en-US"/>
+        </w:rPr>
+      </w:pPr>
+      <w:r>
+        <w:rPr>
+          <w:rFonts w:ascii="Palatino Linotype" w:hAnsi="Palatino Linotype"/>
+          <w:sz w:val="28"/>
+          <w:szCs w:val="28"/>
+          <w:lang w:val="en-US"/>
+        </w:rPr>
+        <w:t>Какая</w:t>
+      </w:r>
+      <w:r>
+        <w:rPr>
+          <w:rFonts w:ascii="Palatino Linotype" w:hAnsi="Palatino Linotype"/>
+          <w:sz w:val="28"/>
+          <w:szCs w:val="28"/>
+          <w:lang w:val="en-US"/>
+        </w:rPr>
+        <w:t xml:space="preserve"> </w:t>
+      </w:r>
+      <w:r>
+        <w:rPr>
+          <w:rFonts w:ascii="Palatino Linotype" w:hAnsi="Palatino Linotype"/>
+          <w:sz w:val="28"/>
+          <w:szCs w:val="28"/>
+          <w:lang w:val="en-US"/>
+        </w:rPr>
+        <w:t>команда</w:t>
+      </w:r>
+      <w:r>
+        <w:rPr>
+          <w:rFonts w:ascii="Palatino Linotype" w:hAnsi="Palatino Linotype"/>
+          <w:sz w:val="28"/>
+          <w:szCs w:val="28"/>
+          <w:lang w:val="en-US"/>
+        </w:rPr>
+        <w:t xml:space="preserve"> </w:t>
+      </w:r>
+      <w:r>
+        <w:rPr>
+          <w:rFonts w:ascii="Palatino Linotype" w:hAnsi="Palatino Linotype"/>
+          <w:sz w:val="28"/>
+          <w:szCs w:val="28"/>
+          <w:lang w:val="en-US"/>
+        </w:rPr>
+        <w:t>позволяет</w:t>
+      </w:r>
+      <w:r>
+        <w:rPr>
+          <w:rFonts w:ascii="Palatino Linotype" w:hAnsi="Palatino Linotype"/>
+          <w:sz w:val="28"/>
+          <w:szCs w:val="28"/>
+          <w:lang w:val="en-US"/>
+        </w:rPr>
+        <w:t xml:space="preserve"> </w:t>
+      </w:r>
+      <w:r>
+        <w:rPr>
+          <w:rFonts w:ascii="Palatino Linotype" w:hAnsi="Palatino Linotype"/>
+          <w:sz w:val="28"/>
+          <w:szCs w:val="28"/>
+          <w:lang w:val="en-US"/>
+        </w:rPr>
+        <w:t>загружать</w:t>
+      </w:r>
+      <w:r>
+        <w:rPr>
+          <w:rFonts w:ascii="Palatino Linotype" w:hAnsi="Palatino Linotype"/>
+          <w:sz w:val="28"/>
+          <w:szCs w:val="28"/>
+          <w:lang w:val="en-US"/>
+        </w:rPr>
+        <w:t xml:space="preserve"> </w:t>
+      </w:r>
+      <w:r>
+        <w:rPr>
+          <w:rFonts w:ascii="Palatino Linotype" w:hAnsi="Palatino Linotype"/>
+          <w:sz w:val="28"/>
+          <w:szCs w:val="28"/>
+          <w:lang w:val="en-US"/>
+        </w:rPr>
+        <w:t>удалённые</w:t>
+      </w:r>
+      <w:r>
+        <w:rPr>
+          <w:rFonts w:ascii="Palatino Linotype" w:hAnsi="Palatino Linotype"/>
+          <w:sz w:val="28"/>
+          <w:szCs w:val="28"/>
+          <w:lang w:val="en-US"/>
+        </w:rPr>
+        <w:t xml:space="preserve"> </w:t>
+      </w:r>
+      <w:r>
+        <w:rPr>
+          <w:rFonts w:ascii="Palatino Linotype" w:hAnsi="Palatino Linotype"/>
+          <w:sz w:val="28"/>
+          <w:szCs w:val="28"/>
+          <w:lang w:val="en-US"/>
+        </w:rPr>
+        <w:t>ветки</w:t>
+      </w:r>
+      <w:r>
+        <w:rPr>
+          <w:rFonts w:ascii="Palatino Linotype" w:hAnsi="Palatino Linotype"/>
+          <w:sz w:val="28"/>
+          <w:szCs w:val="28"/>
+          <w:lang w:val="en-US"/>
+        </w:rPr>
+        <w:t xml:space="preserve"> </w:t>
+      </w:r>
+      <w:r>
+        <w:rPr>
+          <w:rFonts w:ascii="Palatino Linotype" w:hAnsi="Palatino Linotype"/>
+          <w:sz w:val="28"/>
+          <w:szCs w:val="28"/>
+          <w:lang w:val="en-US"/>
+        </w:rPr>
+        <w:t>из</w:t>
+      </w:r>
+      <w:r>
+        <w:rPr>
+          <w:rFonts w:ascii="Palatino Linotype" w:hAnsi="Palatino Linotype"/>
+          <w:sz w:val="28"/>
+          <w:szCs w:val="28"/>
+          <w:lang w:val="en-US"/>
+        </w:rPr>
+        <w:t xml:space="preserve"> </w:t>
+      </w:r>
+      <w:r>
+        <w:rPr>
+          <w:rFonts w:ascii="Palatino Linotype" w:hAnsi="Palatino Linotype"/>
+          <w:sz w:val="28"/>
+          <w:szCs w:val="28"/>
+          <w:lang w:val="en-US"/>
+        </w:rPr>
+        <w:t>удалённых</w:t>
+      </w:r>
+      <w:r>
+        <w:rPr>
+          <w:rFonts w:ascii="Palatino Linotype" w:hAnsi="Palatino Linotype"/>
+          <w:sz w:val="28"/>
+          <w:szCs w:val="28"/>
+          <w:lang w:val="en-US"/>
+        </w:rPr>
+        <w:t xml:space="preserve"> </w:t>
+      </w:r>
+      <w:r>
+        <w:rPr>
+          <w:rFonts w:ascii="Palatino Linotype" w:hAnsi="Palatino Linotype"/>
+          <w:sz w:val="28"/>
+          <w:szCs w:val="28"/>
+          <w:lang w:val="en-US"/>
+        </w:rPr>
+        <w:t>репозиториев</w:t>
+      </w:r>
+      <w:r>
+        <w:rPr>
+          <w:rFonts w:ascii="Palatino Linotype" w:hAnsi="Palatino Linotype"/>
+          <w:sz w:val="28"/>
+          <w:szCs w:val="28"/>
+          <w:lang w:val="en-US"/>
+        </w:rPr>
+        <w:t xml:space="preserve"> </w:t>
+      </w:r>
+      <w:r>
+        <w:rPr>
+          <w:rFonts w:ascii="Palatino Linotype" w:hAnsi="Palatino Linotype"/>
+          <w:sz w:val="28"/>
+          <w:szCs w:val="28"/>
+          <w:lang w:val="en-US"/>
+        </w:rPr>
+        <w:t>без</w:t>
+      </w:r>
+      <w:r>
+        <w:rPr>
+          <w:rFonts w:ascii="Palatino Linotype" w:hAnsi="Palatino Linotype"/>
+          <w:sz w:val="28"/>
+          <w:szCs w:val="28"/>
+          <w:lang w:val="en-US"/>
+        </w:rPr>
+        <w:t xml:space="preserve"> </w:t>
+      </w:r>
+      <w:r>
+        <w:rPr>
+          <w:rFonts w:ascii="Palatino Linotype" w:hAnsi="Palatino Linotype"/>
+          <w:sz w:val="28"/>
+          <w:szCs w:val="28"/>
+          <w:lang w:val="en-US"/>
+        </w:rPr>
+        <w:t>автоматического</w:t>
+      </w:r>
+      <w:r>
+        <w:rPr>
+          <w:rFonts w:ascii="Palatino Linotype" w:hAnsi="Palatino Linotype"/>
+          <w:sz w:val="28"/>
+          <w:szCs w:val="28"/>
+          <w:lang w:val="en-US"/>
+        </w:rPr>
+        <w:t xml:space="preserve"> </w:t>
+      </w:r>
+      <w:r>
+        <w:rPr>
+          <w:rFonts w:ascii="Palatino Linotype" w:hAnsi="Palatino Linotype"/>
+          <w:sz w:val="28"/>
+          <w:szCs w:val="28"/>
+          <w:lang w:val="en-US"/>
+        </w:rPr>
+        <w:t>объединения</w:t>
+      </w:r>
+      <w:r>
+        <w:rPr>
+          <w:rFonts w:ascii="Palatino Linotype" w:hAnsi="Palatino Linotype"/>
+          <w:sz w:val="28"/>
+          <w:szCs w:val="28"/>
+          <w:lang w:val="en-US"/>
+        </w:rPr>
+        <w:t xml:space="preserve"> </w:t>
+      </w:r>
+      <w:r>
+        <w:rPr>
+          <w:rFonts w:ascii="Palatino Linotype" w:hAnsi="Palatino Linotype"/>
+          <w:sz w:val="28"/>
+          <w:szCs w:val="28"/>
+          <w:lang w:val="en-US"/>
+        </w:rPr>
+        <w:t>содержимого</w:t>
+      </w:r>
+      <w:r>
+        <w:rPr>
+          <w:rFonts w:ascii="Palatino Linotype" w:hAnsi="Palatino Linotype"/>
+          <w:sz w:val="28"/>
+          <w:szCs w:val="28"/>
+          <w:lang w:val="en-US"/>
+        </w:rPr>
+        <w:t xml:space="preserve"> с </w:t>
+      </w:r>
+      <w:r>
+        <w:rPr>
+          <w:rFonts w:ascii="Palatino Linotype" w:hAnsi="Palatino Linotype"/>
+          <w:sz w:val="28"/>
+          <w:szCs w:val="28"/>
+          <w:lang w:val="en-US"/>
+        </w:rPr>
+        <w:t>текущим</w:t>
+      </w:r>
+      <w:r>
+        <w:rPr>
+          <w:rFonts w:ascii="Palatino Linotype" w:hAnsi="Palatino Linotype"/>
+          <w:sz w:val="28"/>
+          <w:szCs w:val="28"/>
+          <w:lang w:val="en-US"/>
+        </w:rPr>
+        <w:t xml:space="preserve"> </w:t>
+      </w:r>
+      <w:r>
+        <w:rPr>
+          <w:rFonts w:ascii="Palatino Linotype" w:hAnsi="Palatino Linotype"/>
+          <w:sz w:val="28"/>
+          <w:szCs w:val="28"/>
+          <w:lang w:val="en-US"/>
+        </w:rPr>
+        <w:t>рабочим</w:t>
+      </w:r>
+      <w:r>
+        <w:rPr>
+          <w:rFonts w:ascii="Palatino Linotype" w:hAnsi="Palatino Linotype"/>
+          <w:sz w:val="28"/>
+          <w:szCs w:val="28"/>
+          <w:lang w:val="en-US"/>
+        </w:rPr>
+        <w:t xml:space="preserve"> </w:t>
+      </w:r>
+      <w:r>
+        <w:rPr>
+          <w:rFonts w:ascii="Palatino Linotype" w:hAnsi="Palatino Linotype"/>
+          <w:sz w:val="28"/>
+          <w:szCs w:val="28"/>
+          <w:lang w:val="en-US"/>
+        </w:rPr>
+        <w:t>пространством</w:t>
+      </w:r>
+      <w:r>
+        <w:rPr>
+          <w:rFonts w:ascii="Palatino Linotype" w:hAnsi="Palatino Linotype"/>
+          <w:sz w:val="28"/>
+          <w:szCs w:val="28"/>
+          <w:lang w:val="en-US"/>
+        </w:rPr>
+        <w:t>?</w:t>
+      </w:r>
+    </w:p>
+    <w:p>
+      <w:pPr>
+        <w:pStyle w:val="ListParagraph"/>
+        <w:numPr>
+          <w:ilvl w:val="0"/>
+          <w:numId w:val="10"/>
+        </w:numPr>
+        <w:rPr>
+          <w:rFonts w:ascii="Palatino Linotype" w:hAnsi="Palatino Linotype" w:eastAsia="Palatino Linotype" w:cs="Palatino Linotype"/>
+          <w:color w:val="000000" w:themeColor="text1" w:themeTint="FF" w:themeShade="FF"/>
+          <w:sz w:val="28"/>
+          <w:szCs w:val="28"/>
+          <w:lang w:val="en-US"/>
+        </w:rPr>
+      </w:pPr>
+      <w:r>
+        <w:rPr>
+          <w:rFonts w:ascii="Palatino Linotype" w:hAnsi="Palatino Linotype" w:eastAsia="Palatino Linotype" w:cs="Palatino Linotype"/>
+          <w:color w:val="000000" w:themeColor="text1" w:themeTint="FF" w:themeShade="FF"/>
+          <w:sz w:val="28"/>
+          <w:szCs w:val="28"/>
+          <w:lang w:val="en-US"/>
+        </w:rPr>
+        <w:t>git push</w:t>
+      </w:r>
+    </w:p>
+    <w:p>
+      <w:pPr>
+        <w:pStyle w:val="ListParagraph"/>
+        <w:numPr>
+          <w:ilvl w:val="0"/>
+          <w:numId w:val="10"/>
+        </w:numPr>
+        <w:rPr>
+          <w:rFonts w:ascii="Palatino Linotype" w:hAnsi="Palatino Linotype" w:eastAsia="Palatino Linotype" w:cs="Palatino Linotype"/>
+          <w:color w:val="000000" w:themeColor="text1" w:themeTint="FF" w:themeShade="FF"/>
+          <w:sz w:val="28"/>
+          <w:szCs w:val="28"/>
+        </w:rPr>
+      </w:pPr>
+      <w:r>
+        <w:rPr>
+          <w:rFonts w:ascii="Palatino Linotype" w:hAnsi="Palatino Linotype" w:eastAsia="Palatino Linotype" w:cs="Palatino Linotype"/>
+          <w:sz w:val="28"/>
+          <w:szCs w:val="28"/>
+        </w:rPr>
+        <w:t>git</w:t>
+      </w:r>
+      <w:r>
+        <w:rPr>
+          <w:rFonts w:ascii="Palatino Linotype" w:hAnsi="Palatino Linotype" w:eastAsia="Palatino Linotype" w:cs="Palatino Linotype"/>
+          <w:sz w:val="28"/>
+          <w:szCs w:val="28"/>
+        </w:rPr>
+        <w:t xml:space="preserve"> </w:t>
+      </w:r>
+      <w:r>
+        <w:rPr>
+          <w:rFonts w:ascii="Palatino Linotype" w:hAnsi="Palatino Linotype" w:eastAsia="Palatino Linotype" w:cs="Palatino Linotype"/>
+          <w:sz w:val="28"/>
+          <w:szCs w:val="28"/>
+        </w:rPr>
+        <w:t>pull</w:t>
+      </w:r>
+    </w:p>
+    <w:p>
+      <w:pPr>
+        <w:pStyle w:val="ListParagraph"/>
+        <w:numPr>
+          <w:ilvl w:val="0"/>
+          <w:numId w:val="10"/>
+        </w:numPr>
+        <w:rPr>
+          <w:rFonts w:ascii="Palatino Linotype" w:hAnsi="Palatino Linotype" w:eastAsia="Palatino Linotype" w:cs="Palatino Linotype"/>
+          <w:color w:val="000000" w:themeColor="text1" w:themeTint="FF" w:themeShade="FF"/>
+          <w:sz w:val="28"/>
+          <w:szCs w:val="28"/>
+        </w:rPr>
+      </w:pPr>
+      <w:r>
+        <w:rPr>
+          <w:rFonts w:ascii="Palatino Linotype" w:hAnsi="Palatino Linotype" w:eastAsia="Palatino Linotype" w:cs="Palatino Linotype"/>
+          <w:sz w:val="28"/>
+          <w:szCs w:val="28"/>
+        </w:rPr>
+        <w:t>git</w:t>
+      </w:r>
+      <w:r>
+        <w:rPr>
+          <w:rFonts w:ascii="Palatino Linotype" w:hAnsi="Palatino Linotype" w:eastAsia="Palatino Linotype" w:cs="Palatino Linotype"/>
+          <w:sz w:val="28"/>
+          <w:szCs w:val="28"/>
+        </w:rPr>
+        <w:t xml:space="preserve"> </w:t>
+      </w:r>
+      <w:r>
+        <w:rPr>
+          <w:rFonts w:ascii="Palatino Linotype" w:hAnsi="Palatino Linotype" w:eastAsia="Palatino Linotype" w:cs="Palatino Linotype"/>
+          <w:sz w:val="28"/>
+          <w:szCs w:val="28"/>
+        </w:rPr>
+        <w:t>fetch</w:t>
+      </w:r>
+    </w:p>
+    <w:p>
+      <w:pPr>
+        <w:pStyle w:val="ListParagraph"/>
+        <w:numPr>
+          <w:ilvl w:val="0"/>
+          <w:numId w:val="10"/>
+        </w:numPr>
+        <w:rPr>
+          <w:rFonts w:ascii="Palatino Linotype" w:hAnsi="Palatino Linotype" w:eastAsia="Palatino Linotype" w:cs="Palatino Linotype"/>
+          <w:color w:val="000000" w:themeColor="text1" w:themeTint="FF" w:themeShade="FF"/>
+          <w:sz w:val="28"/>
+          <w:szCs w:val="28"/>
+        </w:rPr>
+      </w:pPr>
+      <w:r>
+        <w:rPr>
+          <w:rFonts w:ascii="Palatino Linotype" w:hAnsi="Palatino Linotype" w:eastAsia="Palatino Linotype" w:cs="Palatino Linotype"/>
+          <w:sz w:val="28"/>
+          <w:szCs w:val="28"/>
+        </w:rPr>
+        <w:t>git</w:t>
+      </w:r>
+      <w:r>
+        <w:rPr>
+          <w:rFonts w:ascii="Palatino Linotype" w:hAnsi="Palatino Linotype" w:eastAsia="Palatino Linotype" w:cs="Palatino Linotype"/>
+          <w:sz w:val="28"/>
+          <w:szCs w:val="28"/>
+        </w:rPr>
+        <w:t xml:space="preserve"> </w:t>
+      </w:r>
+      <w:r>
+        <w:rPr>
+          <w:rFonts w:ascii="Palatino Linotype" w:hAnsi="Palatino Linotype" w:eastAsia="Palatino Linotype" w:cs="Palatino Linotype"/>
+          <w:sz w:val="28"/>
+          <w:szCs w:val="28"/>
+        </w:rPr>
+        <w:t>remote</w:t>
+      </w:r>
+      <w:r>
+        <w:rPr>
+          <w:rFonts w:ascii="Palatino Linotype" w:hAnsi="Palatino Linotype" w:eastAsia="Palatino Linotype" w:cs="Palatino Linotype"/>
+          <w:sz w:val="28"/>
+          <w:szCs w:val="28"/>
+        </w:rPr>
+        <w:t xml:space="preserve"> </w:t>
+      </w:r>
+      <w:r>
+        <w:rPr>
+          <w:rFonts w:ascii="Palatino Linotype" w:hAnsi="Palatino Linotype" w:eastAsia="Palatino Linotype" w:cs="Palatino Linotype"/>
+          <w:sz w:val="28"/>
+          <w:szCs w:val="28"/>
+        </w:rPr>
+        <w:t>update</w:t>
+      </w:r>
+    </w:p>
+    <w:p>
+      <w:pPr>
+        <w:pStyle w:val="a"/>
+        <w:ind w:left="0"/>
+        <w:rPr>
+          <w:rFonts w:ascii="Palatino Linotype" w:hAnsi="Palatino Linotype" w:eastAsia="Palatino Linotype" w:cs="Palatino Linotype"/>
+          <w:color w:val="000000" w:themeColor="text1" w:themeTint="FF" w:themeShade="FF"/>
+          <w:sz w:val="28"/>
+          <w:szCs w:val="28"/>
+        </w:rPr>
+      </w:pPr>
+      <w:r>
+        <w:rPr>
+          <w:rFonts w:ascii="Palatino Linotype" w:hAnsi="Palatino Linotype" w:eastAsia="Palatino Linotype" w:cs="Palatino Linotype"/>
+          <w:color w:val="000000" w:themeColor="text1" w:themeTint="FF" w:themeShade="FF"/>
+          <w:sz w:val="28"/>
+          <w:szCs w:val="28"/>
+        </w:rPr>
+        <w:t>Верный ответ: d</w:t>
+      </w:r>
+    </w:p>
+    <w:p w14:noSpellErr="1">
+      <w:pPr>
+        <w:ind w:left="0"/>
         <w:rPr>
           <w:rFonts w:ascii="Palatino Linotype" w:hAnsi="Palatino Linotype"/>
           <w:sz w:val="40"/>
-          <w:szCs w:val="28"/>
+          <w:szCs w:val="40"/>
+          <w:u w:val="single"/>
         </w:rPr>
       </w:pPr>
       <w:r>
         <w:rPr>
           <w:rFonts w:ascii="Palatino Linotype" w:hAnsi="Palatino Linotype"/>
           <w:sz w:val="40"/>
-          <w:szCs w:val="28"/>
+          <w:szCs w:val="40"/>
+          <w:u w:val="single"/>
         </w:rPr>
         <w:t xml:space="preserve">Вопросы по работе в </w:t>
       </w:r>
@@ -1719,7 +3890,8 @@
         <w:rPr>
           <w:rFonts w:ascii="Palatino Linotype" w:hAnsi="Palatino Linotype"/>
           <w:sz w:val="40"/>
-          <w:szCs w:val="28"/>
+          <w:szCs w:val="40"/>
+          <w:u w:val="single"/>
           <w:lang w:val="en-US"/>
         </w:rPr>
         <w:t>GitHub</w:t>
@@ -1728,7 +3900,8 @@
         <w:rPr>
           <w:rFonts w:ascii="Palatino Linotype" w:hAnsi="Palatino Linotype"/>
           <w:sz w:val="40"/>
-          <w:szCs w:val="28"/>
+          <w:szCs w:val="40"/>
+          <w:u w:val="single"/>
         </w:rPr>
         <w:t xml:space="preserve"> </w:t>
       </w:r>
@@ -2124,6 +4297,7 @@
         <w:rPr>
           <w:rFonts w:ascii="Palatino Linotype" w:hAnsi="Palatino Linotype"/>
           <w:sz w:val="28"/>
+          <w:szCs w:val="28"/>
         </w:rPr>
         <w:t>Верный</w:t>
       </w:r>
@@ -2131,6 +4305,7 @@
         <w:rPr>
           <w:rFonts w:ascii="Palatino Linotype" w:hAnsi="Palatino Linotype"/>
           <w:sz w:val="28"/>
+          <w:szCs w:val="28"/>
         </w:rPr>
         <w:t xml:space="preserve"> </w:t>
       </w:r>
@@ -2138,6 +4313,7 @@
         <w:rPr>
           <w:rFonts w:ascii="Palatino Linotype" w:hAnsi="Palatino Linotype"/>
           <w:sz w:val="28"/>
+          <w:szCs w:val="28"/>
         </w:rPr>
         <w:t>ответ</w:t>
       </w:r>
@@ -2145,6 +4321,7 @@
         <w:rPr>
           <w:rFonts w:ascii="Palatino Linotype" w:hAnsi="Palatino Linotype"/>
           <w:sz w:val="28"/>
+          <w:szCs w:val="28"/>
         </w:rPr>
         <w:t xml:space="preserve">: </w:t>
       </w:r>
@@ -2152,10 +4329,20 @@
         <w:rPr>
           <w:rFonts w:ascii="Palatino Linotype" w:hAnsi="Palatino Linotype"/>
           <w:sz w:val="28"/>
+          <w:szCs w:val="28"/>
           <w:lang w:val="en-US"/>
         </w:rPr>
         <w:t>b</w:t>
       </w:r>
+    </w:p>
+    <w:p>
+      <w:pPr>
+        <w:rPr>
+          <w:rFonts w:ascii="Palatino Linotype" w:hAnsi="Palatino Linotype" w:cs="Palatino Linotype"/>
+          <w:sz w:val="32"/>
+          <w:szCs w:val="32"/>
+        </w:rPr>
+      </w:pPr>
     </w:p>
     <w:p>
       <w:pPr>
@@ -2366,6 +4553,7 @@
         <w:rPr>
           <w:rFonts w:ascii="Palatino Linotype" w:hAnsi="Palatino Linotype"/>
           <w:sz w:val="28"/>
+          <w:szCs w:val="28"/>
         </w:rPr>
         <w:t>Верный ответ:</w:t>
       </w:r>
@@ -2373,6 +4561,7 @@
         <w:rPr>
           <w:rFonts w:ascii="Palatino Linotype" w:hAnsi="Palatino Linotype"/>
           <w:sz w:val="28"/>
+          <w:szCs w:val="28"/>
           <w:lang w:val="en-US"/>
         </w:rPr>
         <w:t xml:space="preserve"> b</w:t>
@@ -2383,12 +4572,1246 @@
         <w:rPr>
           <w:rFonts w:ascii="Palatino Linotype" w:hAnsi="Palatino Linotype"/>
           <w:sz w:val="28"/>
+          <w:szCs w:val="28"/>
+          <w:lang w:val="en-US"/>
+        </w:rPr>
+      </w:pPr>
+    </w:p>
+    <w:p>
+      <w:pPr>
+        <w:rPr>
+          <w:rFonts w:ascii="Palatino Linotype" w:hAnsi="Palatino Linotype"/>
+          <w:sz w:val="36"/>
+          <w:szCs w:val="36"/>
+          <w:lang w:val="en-US"/>
+        </w:rPr>
+      </w:pPr>
+      <w:r>
+        <w:rPr>
+          <w:rFonts w:ascii="Palatino Linotype" w:hAnsi="Palatino Linotype"/>
+          <w:sz w:val="32"/>
+          <w:szCs w:val="32"/>
+          <w:lang w:val="en-US"/>
+        </w:rPr>
+        <w:t>Вопрос</w:t>
+      </w:r>
+      <w:r>
+        <w:rPr>
+          <w:rFonts w:ascii="Palatino Linotype" w:hAnsi="Palatino Linotype"/>
+          <w:sz w:val="32"/>
+          <w:szCs w:val="32"/>
+          <w:lang w:val="en-US"/>
+        </w:rPr>
+        <w:t xml:space="preserve"> 4: </w:t>
+      </w:r>
+    </w:p>
+    <w:p>
+      <w:pPr>
+        <w:rPr>
+          <w:rFonts w:ascii="Palatino Linotype" w:hAnsi="Palatino Linotype"/>
+          <w:sz w:val="28"/>
+          <w:szCs w:val="28"/>
+          <w:lang w:val="en-US"/>
+        </w:rPr>
+      </w:pPr>
+    </w:p>
+    <w:p>
+      <w:pPr>
+        <w:rPr>
+          <w:rFonts w:ascii="Palatino Linotype" w:hAnsi="Palatino Linotype"/>
+          <w:sz w:val="36"/>
+          <w:szCs w:val="36"/>
+          <w:lang w:val="en-US"/>
+        </w:rPr>
+      </w:pPr>
+      <w:r>
+        <w:rPr>
+          <w:rFonts w:ascii="Palatino Linotype" w:hAnsi="Palatino Linotype"/>
+          <w:sz w:val="32"/>
+          <w:szCs w:val="32"/>
+          <w:lang w:val="en-US"/>
+        </w:rPr>
+        <w:t>Команда</w:t>
+      </w:r>
+      <w:r>
+        <w:rPr>
+          <w:rFonts w:ascii="Palatino Linotype" w:hAnsi="Palatino Linotype"/>
+          <w:sz w:val="32"/>
+          <w:szCs w:val="32"/>
+          <w:lang w:val="en-US"/>
+        </w:rPr>
+        <w:t xml:space="preserve"> </w:t>
+      </w:r>
+      <w:r>
+        <w:rPr>
+          <w:rFonts w:ascii="Palatino Linotype" w:hAnsi="Palatino Linotype"/>
+          <w:sz w:val="32"/>
+          <w:szCs w:val="32"/>
+          <w:lang w:val="en-US"/>
+        </w:rPr>
+        <w:t xml:space="preserve">$git config –global </w:t>
+      </w:r>
+      <w:r>
+        <w:rPr>
+          <w:rFonts w:ascii="Palatino Linotype" w:hAnsi="Palatino Linotype"/>
+          <w:sz w:val="32"/>
+          <w:szCs w:val="32"/>
+          <w:lang w:val="en-US"/>
+        </w:rPr>
+        <w:t>credential.helper</w:t>
+      </w:r>
+      <w:r>
+        <w:rPr>
+          <w:rFonts w:ascii="Palatino Linotype" w:hAnsi="Palatino Linotype"/>
+          <w:sz w:val="32"/>
+          <w:szCs w:val="32"/>
+          <w:lang w:val="en-US"/>
+        </w:rPr>
+        <w:t xml:space="preserve"> cache” </w:t>
+      </w:r>
+      <w:r>
+        <w:rPr>
+          <w:rFonts w:ascii="Palatino Linotype" w:hAnsi="Palatino Linotype"/>
+          <w:sz w:val="32"/>
+          <w:szCs w:val="32"/>
+          <w:lang w:val="en-US"/>
+        </w:rPr>
+        <w:t>позволяет</w:t>
+      </w:r>
+      <w:r>
+        <w:rPr>
+          <w:rFonts w:ascii="Palatino Linotype" w:hAnsi="Palatino Linotype"/>
+          <w:sz w:val="32"/>
+          <w:szCs w:val="32"/>
+          <w:lang w:val="en-US"/>
+        </w:rPr>
+        <w:t xml:space="preserve"> </w:t>
+      </w:r>
+      <w:r>
+        <w:rPr>
+          <w:rFonts w:ascii="Palatino Linotype" w:hAnsi="Palatino Linotype"/>
+          <w:sz w:val="32"/>
+          <w:szCs w:val="32"/>
+          <w:lang w:val="en-US"/>
+        </w:rPr>
+        <w:t>настроить</w:t>
+      </w:r>
+      <w:r>
+        <w:rPr>
+          <w:rFonts w:ascii="Palatino Linotype" w:hAnsi="Palatino Linotype"/>
+          <w:sz w:val="32"/>
+          <w:szCs w:val="32"/>
+          <w:lang w:val="en-US"/>
+        </w:rPr>
+        <w:t xml:space="preserve"> </w:t>
+      </w:r>
+      <w:r>
+        <w:rPr>
+          <w:rFonts w:ascii="Palatino Linotype" w:hAnsi="Palatino Linotype"/>
+          <w:sz w:val="32"/>
+          <w:szCs w:val="32"/>
+          <w:lang w:val="en-US"/>
+        </w:rPr>
+        <w:t>помощник</w:t>
+      </w:r>
+      <w:r>
+        <w:rPr>
+          <w:rFonts w:ascii="Palatino Linotype" w:hAnsi="Palatino Linotype"/>
+          <w:sz w:val="32"/>
+          <w:szCs w:val="32"/>
+          <w:lang w:val="en-US"/>
+        </w:rPr>
+        <w:t xml:space="preserve"> </w:t>
+      </w:r>
+      <w:r>
+        <w:rPr>
+          <w:rFonts w:ascii="Palatino Linotype" w:hAnsi="Palatino Linotype"/>
+          <w:sz w:val="32"/>
+          <w:szCs w:val="32"/>
+          <w:lang w:val="en-US"/>
+        </w:rPr>
+        <w:t>по</w:t>
+      </w:r>
+      <w:r>
+        <w:rPr>
+          <w:rFonts w:ascii="Palatino Linotype" w:hAnsi="Palatino Linotype"/>
+          <w:sz w:val="32"/>
+          <w:szCs w:val="32"/>
+          <w:lang w:val="en-US"/>
+        </w:rPr>
+        <w:t xml:space="preserve"> </w:t>
+      </w:r>
+      <w:r>
+        <w:rPr>
+          <w:rFonts w:ascii="Palatino Linotype" w:hAnsi="Palatino Linotype"/>
+          <w:sz w:val="32"/>
+          <w:szCs w:val="32"/>
+          <w:lang w:val="en-US"/>
+        </w:rPr>
+        <w:t>учётным</w:t>
+      </w:r>
+      <w:r>
+        <w:rPr>
+          <w:rFonts w:ascii="Palatino Linotype" w:hAnsi="Palatino Linotype"/>
+          <w:sz w:val="32"/>
+          <w:szCs w:val="32"/>
+          <w:lang w:val="en-US"/>
+        </w:rPr>
+        <w:t xml:space="preserve"> </w:t>
+      </w:r>
+      <w:r>
+        <w:rPr>
+          <w:rFonts w:ascii="Palatino Linotype" w:hAnsi="Palatino Linotype"/>
+          <w:sz w:val="32"/>
+          <w:szCs w:val="32"/>
+          <w:lang w:val="en-US"/>
+        </w:rPr>
+        <w:t>данным</w:t>
+      </w:r>
+      <w:r>
+        <w:rPr>
+          <w:rFonts w:ascii="Palatino Linotype" w:hAnsi="Palatino Linotype"/>
+          <w:sz w:val="32"/>
+          <w:szCs w:val="32"/>
+          <w:lang w:val="en-US"/>
+        </w:rPr>
+        <w:t xml:space="preserve">, </w:t>
+      </w:r>
+      <w:r>
+        <w:rPr>
+          <w:rFonts w:ascii="Palatino Linotype" w:hAnsi="Palatino Linotype"/>
+          <w:sz w:val="32"/>
+          <w:szCs w:val="32"/>
+          <w:lang w:val="en-US"/>
+        </w:rPr>
+        <w:t>который</w:t>
+      </w:r>
+      <w:r>
+        <w:rPr>
+          <w:rFonts w:ascii="Palatino Linotype" w:hAnsi="Palatino Linotype"/>
+          <w:sz w:val="32"/>
+          <w:szCs w:val="32"/>
+          <w:lang w:val="en-US"/>
+        </w:rPr>
+        <w:t xml:space="preserve"> </w:t>
+      </w:r>
+      <w:r>
+        <w:rPr>
+          <w:rFonts w:ascii="Palatino Linotype" w:hAnsi="Palatino Linotype"/>
+          <w:sz w:val="32"/>
+          <w:szCs w:val="32"/>
+          <w:lang w:val="en-US"/>
+        </w:rPr>
+        <w:t>используется</w:t>
+      </w:r>
+      <w:r>
+        <w:rPr>
+          <w:rFonts w:ascii="Palatino Linotype" w:hAnsi="Palatino Linotype"/>
+          <w:sz w:val="32"/>
+          <w:szCs w:val="32"/>
+          <w:lang w:val="en-US"/>
+        </w:rPr>
+        <w:t xml:space="preserve"> </w:t>
+      </w:r>
+      <w:r>
+        <w:rPr>
+          <w:rFonts w:ascii="Palatino Linotype" w:hAnsi="Palatino Linotype"/>
+          <w:sz w:val="32"/>
+          <w:szCs w:val="32"/>
+          <w:lang w:val="en-US"/>
+        </w:rPr>
+        <w:t>для</w:t>
+      </w:r>
+      <w:r>
+        <w:rPr>
+          <w:rFonts w:ascii="Palatino Linotype" w:hAnsi="Palatino Linotype"/>
+          <w:sz w:val="32"/>
+          <w:szCs w:val="32"/>
+          <w:lang w:val="en-US"/>
+        </w:rPr>
+        <w:t xml:space="preserve"> </w:t>
+      </w:r>
+      <w:r>
+        <w:rPr>
+          <w:rFonts w:ascii="Palatino Linotype" w:hAnsi="Palatino Linotype"/>
+          <w:sz w:val="32"/>
+          <w:szCs w:val="32"/>
+          <w:lang w:val="en-US"/>
+        </w:rPr>
+        <w:t>чего</w:t>
+      </w:r>
+      <w:r>
+        <w:rPr>
+          <w:rFonts w:ascii="Palatino Linotype" w:hAnsi="Palatino Linotype"/>
+          <w:sz w:val="32"/>
+          <w:szCs w:val="32"/>
+          <w:lang w:val="en-US"/>
+        </w:rPr>
+        <w:t>?</w:t>
+      </w:r>
+    </w:p>
+    <w:p>
+      <w:pPr>
+        <w:pStyle w:val="ListParagraph"/>
+        <w:numPr>
+          <w:ilvl w:val="0"/>
+          <w:numId w:val="2"/>
+        </w:numPr>
+        <w:rPr>
+          <w:rFonts w:ascii="Palatino Linotype" w:hAnsi="Palatino Linotype" w:eastAsia="Palatino Linotype" w:cs="Palatino Linotype"/>
+          <w:color w:val="000000" w:themeColor="text1" w:themeTint="FF" w:themeShade="FF"/>
+          <w:sz w:val="28"/>
+          <w:szCs w:val="28"/>
+          <w:lang w:val="en-US"/>
+        </w:rPr>
+      </w:pPr>
+      <w:r>
+        <w:rPr>
+          <w:rFonts w:ascii="Palatino Linotype" w:hAnsi="Palatino Linotype" w:eastAsia="Palatino Linotype" w:cs="Palatino Linotype"/>
+          <w:color w:val="000000" w:themeColor="text1" w:themeTint="FF" w:themeShade="FF"/>
+          <w:sz w:val="28"/>
+          <w:szCs w:val="28"/>
+          <w:lang w:val="en-US"/>
+        </w:rPr>
+        <w:t>Устранить</w:t>
+      </w:r>
+      <w:r>
+        <w:rPr>
+          <w:rFonts w:ascii="Palatino Linotype" w:hAnsi="Palatino Linotype" w:eastAsia="Palatino Linotype" w:cs="Palatino Linotype"/>
+          <w:color w:val="000000" w:themeColor="text1" w:themeTint="FF" w:themeShade="FF"/>
+          <w:sz w:val="28"/>
+          <w:szCs w:val="28"/>
+          <w:lang w:val="en-US"/>
+        </w:rPr>
+        <w:t xml:space="preserve"> неполад</w:t>
+      </w:r>
+      <w:r>
+        <w:rPr>
+          <w:rFonts w:ascii="Palatino Linotype" w:hAnsi="Palatino Linotype" w:eastAsia="Palatino Linotype" w:cs="Palatino Linotype"/>
+          <w:color w:val="000000" w:themeColor="text1" w:themeTint="FF" w:themeShade="FF"/>
+          <w:sz w:val="28"/>
+          <w:szCs w:val="28"/>
+          <w:lang w:val="en-US"/>
+        </w:rPr>
+        <w:t>ки</w:t>
+      </w:r>
+      <w:r>
+        <w:rPr>
+          <w:rFonts w:ascii="Palatino Linotype" w:hAnsi="Palatino Linotype" w:eastAsia="Palatino Linotype" w:cs="Palatino Linotype"/>
+          <w:color w:val="000000" w:themeColor="text1" w:themeTint="FF" w:themeShade="FF"/>
+          <w:sz w:val="28"/>
+          <w:szCs w:val="28"/>
+          <w:lang w:val="en-US"/>
+        </w:rPr>
+        <w:t xml:space="preserve"> в </w:t>
+      </w:r>
+      <w:r>
+        <w:rPr>
+          <w:rFonts w:ascii="Palatino Linotype" w:hAnsi="Palatino Linotype" w:eastAsia="Palatino Linotype" w:cs="Palatino Linotype"/>
+          <w:color w:val="000000" w:themeColor="text1" w:themeTint="FF" w:themeShade="FF"/>
+          <w:sz w:val="28"/>
+          <w:szCs w:val="28"/>
+          <w:lang w:val="en-US"/>
+        </w:rPr>
+        <w:t>процессе</w:t>
+      </w:r>
+      <w:r>
+        <w:rPr>
+          <w:rFonts w:ascii="Palatino Linotype" w:hAnsi="Palatino Linotype" w:eastAsia="Palatino Linotype" w:cs="Palatino Linotype"/>
+          <w:color w:val="000000" w:themeColor="text1" w:themeTint="FF" w:themeShade="FF"/>
+          <w:sz w:val="28"/>
+          <w:szCs w:val="28"/>
+          <w:lang w:val="en-US"/>
+        </w:rPr>
+        <w:t xml:space="preserve"> </w:t>
+      </w:r>
+      <w:r>
+        <w:rPr>
+          <w:rFonts w:ascii="Palatino Linotype" w:hAnsi="Palatino Linotype" w:eastAsia="Palatino Linotype" w:cs="Palatino Linotype"/>
+          <w:color w:val="000000" w:themeColor="text1" w:themeTint="FF" w:themeShade="FF"/>
+          <w:sz w:val="28"/>
+          <w:szCs w:val="28"/>
+          <w:lang w:val="en-US"/>
+        </w:rPr>
+        <w:t>входа</w:t>
+      </w:r>
+      <w:r>
+        <w:rPr>
+          <w:rFonts w:ascii="Palatino Linotype" w:hAnsi="Palatino Linotype" w:eastAsia="Palatino Linotype" w:cs="Palatino Linotype"/>
+          <w:color w:val="000000" w:themeColor="text1" w:themeTint="FF" w:themeShade="FF"/>
+          <w:sz w:val="28"/>
+          <w:szCs w:val="28"/>
+          <w:lang w:val="en-US"/>
+        </w:rPr>
+        <w:t xml:space="preserve"> в </w:t>
+      </w:r>
+      <w:r>
+        <w:rPr>
+          <w:rFonts w:ascii="Palatino Linotype" w:hAnsi="Palatino Linotype" w:eastAsia="Palatino Linotype" w:cs="Palatino Linotype"/>
+          <w:color w:val="000000" w:themeColor="text1" w:themeTint="FF" w:themeShade="FF"/>
+          <w:sz w:val="28"/>
+          <w:szCs w:val="28"/>
+          <w:lang w:val="en-US"/>
+        </w:rPr>
+        <w:t>систему</w:t>
+      </w:r>
+    </w:p>
+    <w:p>
+      <w:pPr>
+        <w:pStyle w:val="ListParagraph"/>
+        <w:numPr>
+          <w:ilvl w:val="0"/>
+          <w:numId w:val="2"/>
+        </w:numPr>
+        <w:rPr>
+          <w:rFonts w:ascii="Palatino Linotype" w:hAnsi="Palatino Linotype" w:eastAsia="Palatino Linotype" w:cs="Palatino Linotype"/>
+          <w:sz w:val="28"/>
+          <w:szCs w:val="28"/>
+        </w:rPr>
+      </w:pPr>
+      <w:r>
+        <w:rPr>
+          <w:rFonts w:ascii="Palatino Linotype" w:hAnsi="Palatino Linotype" w:eastAsia="Palatino Linotype" w:cs="Palatino Linotype"/>
+          <w:sz w:val="28"/>
+          <w:szCs w:val="28"/>
+        </w:rPr>
+        <w:t>Предлагать д</w:t>
+      </w:r>
+      <w:r>
+        <w:rPr>
+          <w:rFonts w:ascii="Palatino Linotype" w:hAnsi="Palatino Linotype" w:eastAsia="Palatino Linotype" w:cs="Palatino Linotype"/>
+          <w:sz w:val="28"/>
+          <w:szCs w:val="28"/>
+        </w:rPr>
+        <w:t>инамически</w:t>
+      </w:r>
+      <w:r>
+        <w:rPr>
+          <w:rFonts w:ascii="Palatino Linotype" w:hAnsi="Palatino Linotype" w:eastAsia="Palatino Linotype" w:cs="Palatino Linotype"/>
+          <w:sz w:val="28"/>
+          <w:szCs w:val="28"/>
+        </w:rPr>
+        <w:t>е</w:t>
+      </w:r>
+      <w:r>
+        <w:rPr>
+          <w:rFonts w:ascii="Palatino Linotype" w:hAnsi="Palatino Linotype" w:eastAsia="Palatino Linotype" w:cs="Palatino Linotype"/>
+          <w:sz w:val="28"/>
+          <w:szCs w:val="28"/>
+        </w:rPr>
+        <w:t xml:space="preserve"> сообщения о фиксации</w:t>
+      </w:r>
+    </w:p>
+    <w:p>
+      <w:pPr>
+        <w:pStyle w:val="ListParagraph"/>
+        <w:numPr>
+          <w:ilvl w:val="0"/>
+          <w:numId w:val="2"/>
+        </w:numPr>
+        <w:rPr>
+          <w:rFonts w:ascii="Palatino Linotype" w:hAnsi="Palatino Linotype" w:eastAsia="Palatino Linotype" w:cs="Palatino Linotype"/>
+          <w:sz w:val="28"/>
+          <w:szCs w:val="28"/>
+        </w:rPr>
+      </w:pPr>
+      <w:r>
+        <w:rPr>
+          <w:rFonts w:ascii="Palatino Linotype" w:hAnsi="Palatino Linotype" w:eastAsia="Palatino Linotype" w:cs="Palatino Linotype"/>
+          <w:sz w:val="28"/>
+          <w:szCs w:val="28"/>
+        </w:rPr>
+        <w:t>Настро</w:t>
+      </w:r>
+      <w:r>
+        <w:rPr>
+          <w:rFonts w:ascii="Palatino Linotype" w:hAnsi="Palatino Linotype" w:eastAsia="Palatino Linotype" w:cs="Palatino Linotype"/>
+          <w:sz w:val="28"/>
+          <w:szCs w:val="28"/>
+        </w:rPr>
+        <w:t>ить</w:t>
+      </w:r>
+      <w:r>
+        <w:rPr>
+          <w:rFonts w:ascii="Palatino Linotype" w:hAnsi="Palatino Linotype" w:eastAsia="Palatino Linotype" w:cs="Palatino Linotype"/>
+          <w:sz w:val="28"/>
+          <w:szCs w:val="28"/>
+        </w:rPr>
+        <w:t xml:space="preserve"> автоматическо</w:t>
+      </w:r>
+      <w:r>
+        <w:rPr>
+          <w:rFonts w:ascii="Palatino Linotype" w:hAnsi="Palatino Linotype" w:eastAsia="Palatino Linotype" w:cs="Palatino Linotype"/>
+          <w:sz w:val="28"/>
+          <w:szCs w:val="28"/>
+        </w:rPr>
+        <w:t>е</w:t>
+      </w:r>
+      <w:r>
+        <w:rPr>
+          <w:rFonts w:ascii="Palatino Linotype" w:hAnsi="Palatino Linotype" w:eastAsia="Palatino Linotype" w:cs="Palatino Linotype"/>
+          <w:sz w:val="28"/>
+          <w:szCs w:val="28"/>
+        </w:rPr>
+        <w:t xml:space="preserve"> извлечени</w:t>
+      </w:r>
+      <w:r>
+        <w:rPr>
+          <w:rFonts w:ascii="Palatino Linotype" w:hAnsi="Palatino Linotype" w:eastAsia="Palatino Linotype" w:cs="Palatino Linotype"/>
+          <w:sz w:val="28"/>
+          <w:szCs w:val="28"/>
+        </w:rPr>
+        <w:t>е</w:t>
+      </w:r>
+      <w:r>
+        <w:rPr>
+          <w:rFonts w:ascii="Palatino Linotype" w:hAnsi="Palatino Linotype" w:eastAsia="Palatino Linotype" w:cs="Palatino Linotype"/>
+          <w:sz w:val="28"/>
+          <w:szCs w:val="28"/>
+        </w:rPr>
+        <w:t xml:space="preserve"> данных из репозитория</w:t>
+      </w:r>
+    </w:p>
+    <w:p>
+      <w:pPr>
+        <w:pStyle w:val="ListParagraph"/>
+        <w:numPr>
+          <w:ilvl w:val="0"/>
+          <w:numId w:val="2"/>
+        </w:numPr>
+        <w:rPr>
+          <w:rFonts w:ascii="Palatino Linotype" w:hAnsi="Palatino Linotype" w:eastAsia="Palatino Linotype" w:cs="Palatino Linotype"/>
+          <w:color w:val="000000" w:themeColor="text1" w:themeTint="FF" w:themeShade="FF"/>
+          <w:sz w:val="28"/>
+          <w:szCs w:val="28"/>
+        </w:rPr>
+      </w:pPr>
+      <w:r>
+        <w:rPr>
+          <w:rFonts w:ascii="Palatino Linotype" w:hAnsi="Palatino Linotype" w:eastAsia="Palatino Linotype" w:cs="Palatino Linotype"/>
+          <w:sz w:val="28"/>
+          <w:szCs w:val="28"/>
+        </w:rPr>
+        <w:t xml:space="preserve">Разрешить автоматический вход на </w:t>
+      </w:r>
+      <w:r>
+        <w:rPr>
+          <w:rFonts w:ascii="Palatino Linotype" w:hAnsi="Palatino Linotype" w:eastAsia="Palatino Linotype" w:cs="Palatino Linotype"/>
+          <w:sz w:val="28"/>
+          <w:szCs w:val="28"/>
+        </w:rPr>
+        <w:t>GitHub</w:t>
+      </w:r>
+    </w:p>
+    <w:p w14:noSpellErr="1">
+      <w:pPr>
+        <w:rPr>
+          <w:rFonts w:ascii="Palatino Linotype" w:hAnsi="Palatino Linotype"/>
+          <w:sz w:val="28"/>
+          <w:szCs w:val="28"/>
+          <w:lang w:val="en-US"/>
+        </w:rPr>
+      </w:pPr>
+      <w:r>
+        <w:rPr>
+          <w:rFonts w:ascii="Palatino Linotype" w:hAnsi="Palatino Linotype"/>
+          <w:sz w:val="28"/>
+          <w:szCs w:val="28"/>
+        </w:rPr>
+        <w:t>Верный ответ:</w:t>
+      </w:r>
+      <w:r>
+        <w:rPr>
+          <w:rFonts w:ascii="Palatino Linotype" w:hAnsi="Palatino Linotype"/>
+          <w:sz w:val="28"/>
+          <w:szCs w:val="28"/>
+          <w:lang w:val="en-US"/>
+        </w:rPr>
+        <w:t xml:space="preserve"> d</w:t>
+      </w:r>
+    </w:p>
+    <w:p>
+      <w:pPr>
+        <w:pStyle w:val="a"/>
+        <w:ind w:left="0"/>
+        <w:rPr>
+          <w:rFonts w:ascii="Palatino Linotype" w:hAnsi="Palatino Linotype" w:eastAsia="Palatino Linotype" w:cs="Palatino Linotype"/>
+          <w:color w:val="000000" w:themeColor="text1" w:themeTint="FF" w:themeShade="FF"/>
+          <w:sz w:val="28"/>
+          <w:szCs w:val="28"/>
+        </w:rPr>
+      </w:pPr>
+    </w:p>
+    <w:p>
+      <w:pPr>
+        <w:pStyle w:val="a"/>
+        <w:ind w:left="0"/>
+        <w:rPr>
+          <w:rFonts w:ascii="Palatino Linotype" w:hAnsi="Palatino Linotype" w:eastAsia="Palatino Linotype" w:cs="Palatino Linotype"/>
+          <w:color w:val="000000" w:themeColor="text1" w:themeTint="FF" w:themeShade="FF"/>
+          <w:sz w:val="36"/>
+          <w:szCs w:val="36"/>
+        </w:rPr>
+      </w:pPr>
+      <w:r>
+        <w:rPr>
+          <w:rFonts w:ascii="Palatino Linotype" w:hAnsi="Palatino Linotype" w:eastAsia="Palatino Linotype" w:cs="Palatino Linotype"/>
+          <w:color w:val="000000" w:themeColor="text1" w:themeTint="FF" w:themeShade="FF"/>
+          <w:sz w:val="32"/>
+          <w:szCs w:val="32"/>
+        </w:rPr>
+        <w:t>Вопрос 5:</w:t>
+      </w:r>
+    </w:p>
+    <w:p>
+      <w:pPr>
+        <w:pStyle w:val="a"/>
+        <w:ind w:left="0"/>
+        <w:rPr>
+          <w:rFonts w:ascii="Palatino Linotype" w:hAnsi="Palatino Linotype" w:eastAsia="Palatino Linotype" w:cs="Palatino Linotype"/>
+          <w:color w:val="000000" w:themeColor="text1" w:themeTint="FF" w:themeShade="FF"/>
+          <w:sz w:val="32"/>
+          <w:szCs w:val="32"/>
+        </w:rPr>
+      </w:pPr>
+    </w:p>
+    <w:p>
+      <w:pPr>
+        <w:pStyle w:val="a"/>
+        <w:ind w:left="0"/>
+        <w:rPr>
+          <w:rFonts w:ascii="Palatino Linotype" w:hAnsi="Palatino Linotype" w:eastAsia="Palatino Linotype" w:cs="Palatino Linotype"/>
+          <w:color w:val="000000" w:themeColor="text1" w:themeTint="FF" w:themeShade="FF"/>
+          <w:sz w:val="36"/>
+          <w:szCs w:val="36"/>
+        </w:rPr>
+      </w:pPr>
+      <w:r>
+        <w:rPr>
+          <w:rFonts w:ascii="Palatino Linotype" w:hAnsi="Palatino Linotype" w:eastAsia="Palatino Linotype" w:cs="Palatino Linotype"/>
+          <w:color w:val="000000" w:themeColor="text1" w:themeTint="FF" w:themeShade="FF"/>
+          <w:sz w:val="32"/>
+          <w:szCs w:val="32"/>
+        </w:rPr>
+        <w:t xml:space="preserve">README-файл содержит базовую информацию о проекте. Какое разрешение </w:t>
+      </w:r>
+      <w:r>
+        <w:rPr>
+          <w:rFonts w:ascii="Palatino Linotype" w:hAnsi="Palatino Linotype" w:eastAsia="Palatino Linotype" w:cs="Palatino Linotype"/>
+          <w:color w:val="000000" w:themeColor="text1" w:themeTint="FF" w:themeShade="FF"/>
+          <w:sz w:val="32"/>
+          <w:szCs w:val="32"/>
+        </w:rPr>
+        <w:t>у данного файла?</w:t>
+      </w:r>
+    </w:p>
+    <w:p>
+      <w:pPr>
+        <w:pStyle w:val="ListParagraph"/>
+        <w:numPr>
+          <w:ilvl w:val="0"/>
+          <w:numId w:val="11"/>
+        </w:numPr>
+        <w:rPr>
+          <w:rFonts w:ascii="Palatino Linotype" w:hAnsi="Palatino Linotype" w:eastAsia="Palatino Linotype" w:cs="Palatino Linotype"/>
+          <w:color w:val="000000" w:themeColor="text1" w:themeTint="FF" w:themeShade="FF"/>
+          <w:sz w:val="28"/>
+          <w:szCs w:val="28"/>
+        </w:rPr>
+      </w:pPr>
+      <w:r>
+        <w:rPr>
+          <w:rFonts w:ascii="Palatino Linotype" w:hAnsi="Palatino Linotype" w:eastAsia="Palatino Linotype" w:cs="Palatino Linotype"/>
+          <w:color w:val="000000" w:themeColor="text1" w:themeTint="FF" w:themeShade="FF"/>
+          <w:sz w:val="28"/>
+          <w:szCs w:val="28"/>
+        </w:rPr>
+        <w:t>.bat</w:t>
+      </w:r>
+    </w:p>
+    <w:p>
+      <w:pPr>
+        <w:pStyle w:val="ListParagraph"/>
+        <w:numPr>
+          <w:ilvl w:val="0"/>
+          <w:numId w:val="11"/>
+        </w:numPr>
+        <w:rPr>
+          <w:rFonts w:ascii="Palatino Linotype" w:hAnsi="Palatino Linotype" w:eastAsia="Palatino Linotype" w:cs="Palatino Linotype"/>
+          <w:color w:val="000000" w:themeColor="text1" w:themeTint="FF" w:themeShade="FF"/>
+          <w:sz w:val="28"/>
+          <w:szCs w:val="28"/>
+        </w:rPr>
+      </w:pPr>
+      <w:r>
+        <w:rPr>
+          <w:rFonts w:ascii="Palatino Linotype" w:hAnsi="Palatino Linotype" w:eastAsia="Palatino Linotype" w:cs="Palatino Linotype"/>
+          <w:color w:val="000000" w:themeColor="text1" w:themeTint="FF" w:themeShade="FF"/>
+          <w:sz w:val="28"/>
+          <w:szCs w:val="28"/>
+        </w:rPr>
+        <w:t>.html</w:t>
+      </w:r>
+    </w:p>
+    <w:p>
+      <w:pPr>
+        <w:pStyle w:val="ListParagraph"/>
+        <w:numPr>
+          <w:ilvl w:val="0"/>
+          <w:numId w:val="11"/>
+        </w:numPr>
+        <w:rPr>
+          <w:rFonts w:ascii="Palatino Linotype" w:hAnsi="Palatino Linotype" w:eastAsia="Palatino Linotype" w:cs="Palatino Linotype"/>
+          <w:color w:val="000000" w:themeColor="text1" w:themeTint="FF" w:themeShade="FF"/>
+          <w:sz w:val="28"/>
+          <w:szCs w:val="28"/>
+        </w:rPr>
+      </w:pPr>
+      <w:r>
+        <w:rPr>
+          <w:rFonts w:ascii="Palatino Linotype" w:hAnsi="Palatino Linotype" w:eastAsia="Palatino Linotype" w:cs="Palatino Linotype"/>
+          <w:color w:val="000000" w:themeColor="text1" w:themeTint="FF" w:themeShade="FF"/>
+          <w:sz w:val="28"/>
+          <w:szCs w:val="28"/>
+        </w:rPr>
+        <w:t>.md</w:t>
+      </w:r>
+    </w:p>
+    <w:p>
+      <w:pPr>
+        <w:pStyle w:val="ListParagraph"/>
+        <w:numPr>
+          <w:ilvl w:val="0"/>
+          <w:numId w:val="11"/>
+        </w:numPr>
+        <w:rPr>
+          <w:rFonts w:ascii="Palatino Linotype" w:hAnsi="Palatino Linotype" w:eastAsia="Palatino Linotype" w:cs="Palatino Linotype"/>
+          <w:color w:val="000000" w:themeColor="text1" w:themeTint="FF" w:themeShade="FF"/>
+          <w:sz w:val="28"/>
+          <w:szCs w:val="28"/>
+        </w:rPr>
+      </w:pPr>
+      <w:r>
+        <w:rPr>
+          <w:rFonts w:ascii="Palatino Linotype" w:hAnsi="Palatino Linotype" w:eastAsia="Palatino Linotype" w:cs="Palatino Linotype"/>
+          <w:color w:val="000000" w:themeColor="text1" w:themeTint="FF" w:themeShade="FF"/>
+          <w:sz w:val="28"/>
+          <w:szCs w:val="28"/>
+        </w:rPr>
+        <w:t>.</w:t>
+      </w:r>
+      <w:r>
+        <w:rPr>
+          <w:rFonts w:ascii="Palatino Linotype" w:hAnsi="Palatino Linotype" w:eastAsia="Palatino Linotype" w:cs="Palatino Linotype"/>
+          <w:color w:val="000000" w:themeColor="text1" w:themeTint="FF" w:themeShade="FF"/>
+          <w:sz w:val="28"/>
+          <w:szCs w:val="28"/>
+        </w:rPr>
+        <w:t>fmt</w:t>
+      </w:r>
+    </w:p>
+    <w:p w14:noSpellErr="1">
+      <w:pPr>
+        <w:rPr>
+          <w:rFonts w:ascii="Palatino Linotype" w:hAnsi="Palatino Linotype"/>
+          <w:sz w:val="28"/>
+          <w:szCs w:val="28"/>
+          <w:lang w:val="en-US"/>
+        </w:rPr>
+      </w:pPr>
+      <w:r>
+        <w:rPr>
+          <w:rFonts w:ascii="Palatino Linotype" w:hAnsi="Palatino Linotype"/>
+          <w:sz w:val="28"/>
+          <w:szCs w:val="28"/>
+        </w:rPr>
+        <w:t>Верный ответ:</w:t>
+      </w:r>
+      <w:r>
+        <w:rPr>
+          <w:rFonts w:ascii="Palatino Linotype" w:hAnsi="Palatino Linotype"/>
+          <w:sz w:val="28"/>
+          <w:szCs w:val="28"/>
+          <w:lang w:val="en-US"/>
+        </w:rPr>
+        <w:t xml:space="preserve"> c</w:t>
+      </w:r>
+    </w:p>
+    <w:p>
+      <w:pPr>
+        <w:pStyle w:val="a"/>
+        <w:ind w:left="0"/>
+        <w:rPr>
+          <w:rFonts w:ascii="Palatino Linotype" w:hAnsi="Palatino Linotype" w:eastAsia="Palatino Linotype" w:cs="Palatino Linotype"/>
+          <w:color w:val="000000" w:themeColor="text1" w:themeTint="FF" w:themeShade="FF"/>
+          <w:sz w:val="28"/>
+          <w:szCs w:val="28"/>
+        </w:rPr>
+      </w:pPr>
+    </w:p>
+    <w:p>
+      <w:pPr>
+        <w:pStyle w:val="a"/>
+        <w:ind w:left="0"/>
+        <w:rPr>
+          <w:rFonts w:ascii="Palatino Linotype" w:hAnsi="Palatino Linotype" w:eastAsia="Palatino Linotype" w:cs="Palatino Linotype"/>
+          <w:color w:val="000000" w:themeColor="text1" w:themeTint="FF" w:themeShade="FF"/>
+          <w:sz w:val="28"/>
+          <w:szCs w:val="28"/>
+        </w:rPr>
+      </w:pPr>
+      <w:r>
+        <w:rPr>
+          <w:rFonts w:ascii="Palatino Linotype" w:hAnsi="Palatino Linotype" w:eastAsia="Palatino Linotype" w:cs="Palatino Linotype"/>
+          <w:color w:val="000000" w:themeColor="text1" w:themeTint="FF" w:themeShade="FF"/>
+          <w:sz w:val="28"/>
+          <w:szCs w:val="28"/>
+        </w:rPr>
+        <w:t>Вопрос 6:</w:t>
+      </w:r>
+    </w:p>
+    <w:p>
+      <w:pPr>
+        <w:pStyle w:val="a"/>
+        <w:ind w:left="0"/>
+        <w:rPr>
+          <w:rFonts w:ascii="Palatino Linotype" w:hAnsi="Palatino Linotype" w:eastAsia="Palatino Linotype" w:cs="Palatino Linotype"/>
+          <w:noProof w:val="0"/>
+          <w:sz w:val="28"/>
+          <w:szCs w:val="28"/>
+          <w:lang w:val="ru-RU"/>
+        </w:rPr>
+      </w:pPr>
+      <w:r>
+        <w:rPr>
+          <w:rFonts w:ascii="Palatino Linotype" w:hAnsi="Palatino Linotype" w:eastAsia="Palatino Linotype" w:cs="Palatino Linotype"/>
+          <w:color w:val="000000" w:themeColor="text1" w:themeTint="FF" w:themeShade="FF"/>
+          <w:sz w:val="28"/>
+          <w:szCs w:val="28"/>
+        </w:rPr>
+        <w:t>В файле .</w:t>
+      </w:r>
+      <w:r>
+        <w:rPr>
+          <w:rFonts w:ascii="Palatino Linotype" w:hAnsi="Palatino Linotype" w:eastAsia="Palatino Linotype" w:cs="Palatino Linotype"/>
+          <w:color w:val="000000" w:themeColor="text1" w:themeTint="FF" w:themeShade="FF"/>
+          <w:sz w:val="28"/>
+          <w:szCs w:val="28"/>
+        </w:rPr>
+        <w:t>gitignore</w:t>
+      </w:r>
+      <w:r>
+        <w:rPr>
+          <w:rFonts w:ascii="Palatino Linotype" w:hAnsi="Palatino Linotype" w:eastAsia="Palatino Linotype" w:cs="Palatino Linotype"/>
+          <w:color w:val="000000" w:themeColor="text1" w:themeTint="FF" w:themeShade="FF"/>
+          <w:sz w:val="28"/>
+          <w:szCs w:val="28"/>
+        </w:rPr>
+        <w:t xml:space="preserve"> прописаны две </w:t>
+      </w:r>
+      <w:r>
+        <w:rPr>
+          <w:rFonts w:ascii="Palatino Linotype" w:hAnsi="Palatino Linotype" w:eastAsia="Palatino Linotype" w:cs="Palatino Linotype"/>
+          <w:color w:val="000000" w:themeColor="text1" w:themeTint="FF" w:themeShade="FF"/>
+          <w:sz w:val="28"/>
+          <w:szCs w:val="28"/>
+        </w:rPr>
+        <w:t>строчки :</w:t>
+      </w:r>
+      <w:r>
+        <w:rPr>
+          <w:rFonts w:ascii="Palatino Linotype" w:hAnsi="Palatino Linotype" w:eastAsia="Palatino Linotype" w:cs="Palatino Linotype"/>
+          <w:color w:val="000000" w:themeColor="text1" w:themeTint="FF" w:themeShade="FF"/>
+          <w:sz w:val="28"/>
+          <w:szCs w:val="28"/>
+        </w:rPr>
+        <w:t xml:space="preserve"> </w:t>
+      </w:r>
+    </w:p>
+    <w:p>
+      <w:pPr>
+        <w:pStyle w:val="a"/>
+        <w:ind w:left="0"/>
+        <w:rPr>
+          <w:rFonts w:ascii="Palatino Linotype" w:hAnsi="Palatino Linotype" w:eastAsia="Palatino Linotype" w:cs="Palatino Linotype"/>
+          <w:noProof w:val="0"/>
+          <w:sz w:val="24"/>
+          <w:szCs w:val="24"/>
+          <w:lang w:val="ru-RU"/>
+        </w:rPr>
+      </w:pPr>
+      <w:r>
+        <w:rPr>
+          <w:rFonts w:ascii="Palatino Linotype" w:hAnsi="Palatino Linotype" w:eastAsia="Palatino Linotype" w:cs="Palatino Linotype"/>
+          <w:noProof w:val="0"/>
+          <w:sz w:val="24"/>
+          <w:szCs w:val="24"/>
+          <w:lang w:val="ru-RU"/>
+        </w:rPr>
+        <w:t>*.a</w:t>
+      </w:r>
+    </w:p>
+    <w:p>
+      <w:pPr>
+        <w:pStyle w:val="a"/>
+        <w:ind w:left="0"/>
+        <w:rPr>
+          <w:rFonts w:ascii="Palatino Linotype" w:hAnsi="Palatino Linotype" w:eastAsia="Palatino Linotype" w:cs="Palatino Linotype"/>
+          <w:noProof w:val="0"/>
+          <w:sz w:val="24"/>
+          <w:szCs w:val="24"/>
+          <w:lang w:val="ru-RU"/>
+        </w:rPr>
+      </w:pPr>
+      <w:r>
+        <w:rPr>
+          <w:rFonts w:ascii="Palatino Linotype" w:hAnsi="Palatino Linotype" w:eastAsia="Palatino Linotype" w:cs="Palatino Linotype"/>
+          <w:noProof w:val="0"/>
+          <w:sz w:val="24"/>
+          <w:szCs w:val="24"/>
+          <w:lang w:val="ru-RU"/>
+        </w:rPr>
+        <w:t>!</w:t>
+      </w:r>
+      <w:r>
+        <w:rPr>
+          <w:rFonts w:ascii="Palatino Linotype" w:hAnsi="Palatino Linotype" w:eastAsia="Palatino Linotype" w:cs="Palatino Linotype"/>
+          <w:noProof w:val="0"/>
+          <w:sz w:val="24"/>
+          <w:szCs w:val="24"/>
+          <w:lang w:val="ru-RU"/>
+        </w:rPr>
+        <w:t>lib.a</w:t>
+      </w:r>
+    </w:p>
+    <w:p>
+      <w:pPr>
+        <w:pStyle w:val="a"/>
+        <w:ind w:left="0"/>
+        <w:rPr>
+          <w:rFonts w:ascii="Palatino Linotype" w:hAnsi="Palatino Linotype" w:eastAsia="Palatino Linotype" w:cs="Palatino Linotype"/>
+          <w:noProof w:val="0"/>
+          <w:sz w:val="28"/>
+          <w:szCs w:val="28"/>
+          <w:lang w:val="ru-RU"/>
+        </w:rPr>
+      </w:pPr>
+      <w:r>
+        <w:rPr>
+          <w:rFonts w:ascii="Palatino Linotype" w:hAnsi="Palatino Linotype" w:eastAsia="Palatino Linotype" w:cs="Palatino Linotype"/>
+          <w:noProof w:val="0"/>
+          <w:sz w:val="28"/>
+          <w:szCs w:val="28"/>
+          <w:lang w:val="ru-RU"/>
+        </w:rPr>
+        <w:t>Что представляют эти шаблоны?</w:t>
+      </w:r>
+    </w:p>
+    <w:p>
+      <w:pPr>
+        <w:pStyle w:val="ListParagraph"/>
+        <w:numPr>
+          <w:ilvl w:val="0"/>
+          <w:numId w:val="12"/>
+        </w:numPr>
+        <w:rPr>
+          <w:rFonts w:ascii="Palatino Linotype" w:hAnsi="Palatino Linotype" w:eastAsia="Palatino Linotype" w:cs="Palatino Linotype"/>
+          <w:noProof w:val="0"/>
+          <w:sz w:val="28"/>
+          <w:szCs w:val="28"/>
+          <w:lang w:val="ru-RU"/>
+        </w:rPr>
+      </w:pPr>
+      <w:r>
+        <w:rPr>
+          <w:rFonts w:ascii="Palatino Linotype" w:hAnsi="Palatino Linotype" w:eastAsia="Palatino Linotype" w:cs="Palatino Linotype"/>
+          <w:noProof w:val="0"/>
+          <w:color w:val="000000" w:themeColor="text1" w:themeTint="FF" w:themeShade="FF"/>
+          <w:sz w:val="28"/>
+          <w:szCs w:val="28"/>
+          <w:lang w:val="ru-RU"/>
+        </w:rPr>
+        <w:t xml:space="preserve">Игнорировать все файлы с </w:t>
+      </w:r>
+      <w:r>
+        <w:rPr>
+          <w:rFonts w:ascii="Palatino Linotype" w:hAnsi="Palatino Linotype" w:eastAsia="Palatino Linotype" w:cs="Palatino Linotype"/>
+          <w:noProof w:val="0"/>
+          <w:color w:val="000000" w:themeColor="text1" w:themeTint="FF" w:themeShade="FF"/>
+          <w:sz w:val="28"/>
+          <w:szCs w:val="28"/>
+          <w:lang w:val="ru-RU"/>
+        </w:rPr>
+        <w:t>расширением .a</w:t>
+      </w:r>
+      <w:r>
+        <w:rPr>
+          <w:rFonts w:ascii="Palatino Linotype" w:hAnsi="Palatino Linotype" w:eastAsia="Palatino Linotype" w:cs="Palatino Linotype"/>
+          <w:noProof w:val="0"/>
+          <w:color w:val="000000" w:themeColor="text1" w:themeTint="FF" w:themeShade="FF"/>
+          <w:sz w:val="28"/>
+          <w:szCs w:val="28"/>
+          <w:lang w:val="ru-RU"/>
+        </w:rPr>
+        <w:t xml:space="preserve">, но отслеживать файл </w:t>
+      </w:r>
+      <w:r>
+        <w:rPr>
+          <w:rFonts w:ascii="Palatino Linotype" w:hAnsi="Palatino Linotype" w:eastAsia="Palatino Linotype" w:cs="Palatino Linotype"/>
+          <w:noProof w:val="0"/>
+          <w:sz w:val="28"/>
+          <w:szCs w:val="28"/>
+          <w:lang w:val="ru-RU"/>
+        </w:rPr>
+        <w:t>lib.a</w:t>
+      </w:r>
+      <w:r>
+        <w:rPr>
+          <w:rFonts w:ascii="Palatino Linotype" w:hAnsi="Palatino Linotype" w:eastAsia="Palatino Linotype" w:cs="Palatino Linotype"/>
+          <w:noProof w:val="0"/>
+          <w:sz w:val="28"/>
+          <w:szCs w:val="28"/>
+          <w:lang w:val="ru-RU"/>
+        </w:rPr>
+        <w:t>.</w:t>
+      </w:r>
+    </w:p>
+    <w:p>
+      <w:pPr>
+        <w:pStyle w:val="ListParagraph"/>
+        <w:numPr>
+          <w:ilvl w:val="0"/>
+          <w:numId w:val="12"/>
+        </w:numPr>
+        <w:suppressLineNumbers w:val="0"/>
+        <w:bidi w:val="0"/>
+        <w:spacing w:before="0" w:beforeAutospacing="off" w:after="0" w:afterAutospacing="off" w:line="259" w:lineRule="auto"/>
+        <w:ind w:left="720" w:right="0" w:hanging="360"/>
+        <w:jc w:val="left"/>
+        <w:rPr>
+          <w:rFonts w:ascii="Palatino Linotype" w:hAnsi="Palatino Linotype" w:eastAsia="Palatino Linotype" w:cs="Palatino Linotype"/>
+          <w:noProof w:val="0"/>
+          <w:color w:val="000000" w:themeColor="text1" w:themeTint="FF" w:themeShade="FF"/>
+          <w:sz w:val="28"/>
+          <w:szCs w:val="28"/>
+          <w:lang w:val="ru-RU"/>
+        </w:rPr>
+      </w:pPr>
+      <w:r>
+        <w:rPr>
+          <w:rFonts w:ascii="Palatino Linotype" w:hAnsi="Palatino Linotype" w:eastAsia="Palatino Linotype" w:cs="Palatino Linotype"/>
+          <w:noProof w:val="0"/>
+          <w:color w:val="000000" w:themeColor="text1" w:themeTint="FF" w:themeShade="FF"/>
+          <w:sz w:val="28"/>
+          <w:szCs w:val="28"/>
+          <w:lang w:val="ru-RU"/>
+        </w:rPr>
+        <w:t xml:space="preserve">Игнорировать файл </w:t>
+      </w:r>
+      <w:r>
+        <w:rPr>
+          <w:rFonts w:ascii="Palatino Linotype" w:hAnsi="Palatino Linotype" w:eastAsia="Palatino Linotype" w:cs="Palatino Linotype"/>
+          <w:noProof w:val="0"/>
+          <w:color w:val="000000" w:themeColor="text1" w:themeTint="FF" w:themeShade="FF"/>
+          <w:sz w:val="28"/>
+          <w:szCs w:val="28"/>
+          <w:lang w:val="ru-RU"/>
+        </w:rPr>
+        <w:t>lib.a</w:t>
+      </w:r>
+      <w:r>
+        <w:rPr>
+          <w:rFonts w:ascii="Palatino Linotype" w:hAnsi="Palatino Linotype" w:eastAsia="Palatino Linotype" w:cs="Palatino Linotype"/>
+          <w:noProof w:val="0"/>
+          <w:color w:val="000000" w:themeColor="text1" w:themeTint="FF" w:themeShade="FF"/>
+          <w:sz w:val="28"/>
+          <w:szCs w:val="28"/>
+          <w:lang w:val="ru-RU"/>
+        </w:rPr>
+        <w:t xml:space="preserve">, но отслеживать другие файлы с </w:t>
+      </w:r>
+      <w:r>
+        <w:rPr>
+          <w:rFonts w:ascii="Palatino Linotype" w:hAnsi="Palatino Linotype" w:eastAsia="Palatino Linotype" w:cs="Palatino Linotype"/>
+          <w:noProof w:val="0"/>
+          <w:color w:val="000000" w:themeColor="text1" w:themeTint="FF" w:themeShade="FF"/>
+          <w:sz w:val="28"/>
+          <w:szCs w:val="28"/>
+          <w:lang w:val="ru-RU"/>
+        </w:rPr>
+        <w:t>расширением .a.</w:t>
+      </w:r>
+    </w:p>
+    <w:p>
+      <w:pPr>
+        <w:pStyle w:val="ListParagraph"/>
+        <w:numPr>
+          <w:ilvl w:val="0"/>
+          <w:numId w:val="12"/>
+        </w:numPr>
+        <w:rPr>
+          <w:rFonts w:ascii="Palatino Linotype" w:hAnsi="Palatino Linotype" w:eastAsia="Palatino Linotype" w:cs="Palatino Linotype"/>
+          <w:noProof w:val="0"/>
+          <w:sz w:val="28"/>
+          <w:szCs w:val="28"/>
+          <w:lang w:val="ru-RU"/>
+        </w:rPr>
+      </w:pPr>
+      <w:r>
+        <w:rPr>
+          <w:rFonts w:ascii="Palatino Linotype" w:hAnsi="Palatino Linotype" w:eastAsia="Palatino Linotype" w:cs="Palatino Linotype"/>
+          <w:noProof w:val="0"/>
+          <w:color w:val="000000" w:themeColor="text1" w:themeTint="FF" w:themeShade="FF"/>
+          <w:sz w:val="28"/>
+          <w:szCs w:val="28"/>
+          <w:lang w:val="ru-RU"/>
+        </w:rPr>
+        <w:t xml:space="preserve">Игнорировать все файлы с </w:t>
+      </w:r>
+      <w:r>
+        <w:rPr>
+          <w:rFonts w:ascii="Palatino Linotype" w:hAnsi="Palatino Linotype" w:eastAsia="Palatino Linotype" w:cs="Palatino Linotype"/>
+          <w:noProof w:val="0"/>
+          <w:color w:val="000000" w:themeColor="text1" w:themeTint="FF" w:themeShade="FF"/>
+          <w:sz w:val="28"/>
+          <w:szCs w:val="28"/>
+          <w:lang w:val="ru-RU"/>
+        </w:rPr>
+        <w:t>расширением .a</w:t>
+      </w:r>
+    </w:p>
+    <w:p>
+      <w:pPr>
+        <w:pStyle w:val="ListParagraph"/>
+        <w:numPr>
+          <w:ilvl w:val="0"/>
+          <w:numId w:val="12"/>
+        </w:numPr>
+        <w:rPr>
+          <w:rFonts w:ascii="Palatino Linotype" w:hAnsi="Palatino Linotype" w:eastAsia="Palatino Linotype" w:cs="Palatino Linotype"/>
+          <w:noProof w:val="0"/>
+          <w:color w:val="000000" w:themeColor="text1" w:themeTint="FF" w:themeShade="FF"/>
+          <w:sz w:val="28"/>
+          <w:szCs w:val="28"/>
+          <w:lang w:val="ru-RU"/>
+        </w:rPr>
+      </w:pPr>
+      <w:r>
+        <w:rPr>
+          <w:rFonts w:ascii="Palatino Linotype" w:hAnsi="Palatino Linotype" w:eastAsia="Palatino Linotype" w:cs="Palatino Linotype"/>
+          <w:noProof w:val="0"/>
+          <w:color w:val="000000" w:themeColor="text1" w:themeTint="FF" w:themeShade="FF"/>
+          <w:sz w:val="28"/>
+          <w:szCs w:val="28"/>
+          <w:lang w:val="ru-RU"/>
+        </w:rPr>
+        <w:t xml:space="preserve">Игнорировать все файлы с </w:t>
+      </w:r>
+      <w:r>
+        <w:rPr>
+          <w:rFonts w:ascii="Palatino Linotype" w:hAnsi="Palatino Linotype" w:eastAsia="Palatino Linotype" w:cs="Palatino Linotype"/>
+          <w:noProof w:val="0"/>
+          <w:color w:val="000000" w:themeColor="text1" w:themeTint="FF" w:themeShade="FF"/>
+          <w:sz w:val="28"/>
+          <w:szCs w:val="28"/>
+          <w:lang w:val="ru-RU"/>
+        </w:rPr>
+        <w:t>расширением .a</w:t>
+      </w:r>
+      <w:r>
+        <w:rPr>
+          <w:rFonts w:ascii="Palatino Linotype" w:hAnsi="Palatino Linotype" w:eastAsia="Palatino Linotype" w:cs="Palatino Linotype"/>
+          <w:noProof w:val="0"/>
+          <w:color w:val="000000" w:themeColor="text1" w:themeTint="FF" w:themeShade="FF"/>
+          <w:sz w:val="28"/>
+          <w:szCs w:val="28"/>
+          <w:lang w:val="ru-RU"/>
+        </w:rPr>
+        <w:t xml:space="preserve">, если в проекте есть файл </w:t>
+      </w:r>
+      <w:r>
+        <w:rPr>
+          <w:rFonts w:ascii="Palatino Linotype" w:hAnsi="Palatino Linotype" w:eastAsia="Palatino Linotype" w:cs="Palatino Linotype"/>
+          <w:noProof w:val="0"/>
+          <w:color w:val="000000" w:themeColor="text1" w:themeTint="FF" w:themeShade="FF"/>
+          <w:sz w:val="28"/>
+          <w:szCs w:val="28"/>
+          <w:lang w:val="ru-RU"/>
+        </w:rPr>
+        <w:t>lib.a</w:t>
+      </w:r>
+      <w:r>
+        <w:rPr>
+          <w:rFonts w:ascii="Palatino Linotype" w:hAnsi="Palatino Linotype" w:eastAsia="Palatino Linotype" w:cs="Palatino Linotype"/>
+          <w:noProof w:val="0"/>
+          <w:color w:val="000000" w:themeColor="text1" w:themeTint="FF" w:themeShade="FF"/>
+          <w:sz w:val="28"/>
+          <w:szCs w:val="28"/>
+          <w:lang w:val="ru-RU"/>
+        </w:rPr>
+        <w:t>.</w:t>
+      </w:r>
+    </w:p>
+    <w:p>
+      <w:pPr>
+        <w:pStyle w:val="a"/>
+        <w:ind w:left="0"/>
+        <w:rPr>
+          <w:rFonts w:ascii="Palatino Linotype" w:hAnsi="Palatino Linotype" w:eastAsia="Palatino Linotype" w:cs="Palatino Linotype"/>
+          <w:noProof w:val="0"/>
+          <w:color w:val="000000" w:themeColor="text1" w:themeTint="FF" w:themeShade="FF"/>
+          <w:sz w:val="28"/>
+          <w:szCs w:val="28"/>
+          <w:lang w:val="ru-RU"/>
+        </w:rPr>
+      </w:pPr>
+      <w:r>
+        <w:rPr>
+          <w:rFonts w:ascii="Palatino Linotype" w:hAnsi="Palatino Linotype" w:eastAsia="Palatino Linotype" w:cs="Palatino Linotype"/>
+          <w:noProof w:val="0"/>
+          <w:color w:val="000000" w:themeColor="text1" w:themeTint="FF" w:themeShade="FF"/>
+          <w:sz w:val="28"/>
+          <w:szCs w:val="28"/>
+          <w:lang w:val="ru-RU"/>
+        </w:rPr>
+        <w:t>Верный ответ: a</w:t>
+      </w:r>
+    </w:p>
+    <w:p>
+      <w:pPr>
+        <w:pStyle w:val="a"/>
+        <w:ind w:left="0"/>
+        <w:rPr>
+          <w:rFonts w:ascii="Palatino Linotype" w:hAnsi="Palatino Linotype" w:eastAsia="Palatino Linotype" w:cs="Palatino Linotype"/>
+          <w:color w:val="000000" w:themeColor="text1" w:themeTint="FF" w:themeShade="FF"/>
+          <w:sz w:val="28"/>
+          <w:szCs w:val="28"/>
+        </w:rPr>
+      </w:pPr>
+    </w:p>
+    <w:p>
+      <w:pPr>
+        <w:pStyle w:val="a"/>
+        <w:ind w:left="0"/>
+        <w:rPr>
+          <w:rFonts w:ascii="Palatino Linotype" w:hAnsi="Palatino Linotype" w:eastAsia="Palatino Linotype" w:cs="Palatino Linotype"/>
+          <w:color w:val="000000" w:themeColor="text1" w:themeTint="FF" w:themeShade="FF"/>
+          <w:sz w:val="28"/>
+          <w:szCs w:val="28"/>
+        </w:rPr>
+      </w:pPr>
+    </w:p>
+    <w:p>
+      <w:pPr>
+        <w:rPr>
+          <w:rFonts w:ascii="Palatino Linotype" w:hAnsi="Palatino Linotype"/>
+          <w:sz w:val="28"/>
           <w:lang w:val="en-US"/>
         </w:rPr>
       </w:pPr>
     </w:p>
     <w:sectPr>
-      <w:pgSz w:w="11906" w:h="16838"/>
+      <w:pgSz w:w="11906" w:h="16838" w:orient="portrait"/>
       <w:pgMar w:top="1440" w:right="1800" w:bottom="1440" w:left="1800" w:header="720" w:footer="720" w:gutter="0"/>
       <w:cols w:space="720"/>
     </w:sectPr>
@@ -2436,6 +5859,941 @@
 
 <file path=word/numbering.xml><?xml version="1.0" encoding="utf-8"?>
 <w:numbering xmlns:wpc="http://schemas.microsoft.com/office/word/2010/wordprocessingCanvas" xmlns:cx="http://schemas.microsoft.com/office/drawing/2014/chartex" xmlns:cx1="http://schemas.microsoft.com/office/drawing/2015/9/8/chartex" xmlns:cx2="http://schemas.microsoft.com/office/drawing/2015/10/21/chartex" xmlns:cx3="http://schemas.microsoft.com/office/drawing/2016/5/9/chartex" xmlns:cx4="http://schemas.microsoft.com/office/drawing/2016/5/10/chartex" xmlns:cx5="http://schemas.microsoft.com/office/drawing/2016/5/11/chartex" xmlns:cx6="http://schemas.microsoft.com/office/drawing/2016/5/12/chartex" xmlns:cx7="http://schemas.microsoft.com/office/drawing/2016/5/13/chartex" xmlns:cx8="http://schemas.microsoft.com/office/drawing/2016/5/14/chartex" xmlns:mc="http://schemas.openxmlformats.org/markup-compatibility/2006" xmlns:aink="http://schemas.microsoft.com/office/drawing/2016/ink" xmlns:am3d="http://schemas.microsoft.com/office/drawing/2017/model3d" xmlns:o="urn:schemas-microsoft-com:office:office" xmlns:oel="http://schemas.microsoft.com/office/2019/extlst" xmlns:r="http://schemas.openxmlformats.org/officeDocument/2006/relationships" xmlns:m="http://schemas.openxmlformats.org/officeDocument/2006/math" xmlns:v="urn:schemas-microsoft-com:vml" xmlns:wp14="http://schemas.microsoft.com/office/word/2010/wordprocessingDrawing" xmlns:wp="http://schemas.openxmlformats.org/drawingml/2006/wordprocessingDrawing" xmlns:w10="urn:schemas-microsoft-com:office:word" xmlns:w="http://schemas.openxmlformats.org/wordprocessingml/2006/main" xmlns:w14="http://schemas.microsoft.com/office/word/2010/wordml" xmlns:w15="http://schemas.microsoft.com/office/word/2012/wordml" xmlns:w16cex="http://schemas.microsoft.com/office/word/2018/wordml/cex" xmlns:w16cid="http://schemas.microsoft.com/office/word/2016/wordml/cid" xmlns:w16="http://schemas.microsoft.com/office/word/2018/wordml" xmlns:w16sdtdh="http://schemas.microsoft.com/office/word/2020/wordml/sdtdatahash" xmlns:w16se="http://schemas.microsoft.com/office/word/2015/wordml/symex" xmlns:wpg="http://schemas.microsoft.com/office/word/2010/wordprocessingGroup" xmlns:wpi="http://schemas.microsoft.com/office/word/2010/wordprocessingInk" xmlns:wne="http://schemas.microsoft.com/office/word/2006/wordml" xmlns:wps="http://schemas.microsoft.com/office/word/2010/wordprocessingShape" mc:Ignorable="w14 w15 w16se w16cid w16 w16cex w16sdtdh wp14">
+  <w:abstractNum xmlns:w="http://schemas.openxmlformats.org/wordprocessingml/2006/main" w:abstractNumId="11">
+    <w:nsid w:val="7676265c"/>
+    <w:multiLevelType xmlns:w="http://schemas.openxmlformats.org/wordprocessingml/2006/main" w:val="hybridMultilevel"/>
+    <w:lvl xmlns:w="http://schemas.openxmlformats.org/wordprocessingml/2006/main" w:ilvl="0">
+      <w:start w:val="1"/>
+      <w:numFmt w:val="lowerLetter"/>
+      <w:lvlText w:val="%1)"/>
+      <w:lvlJc w:val="left"/>
+      <w:pPr>
+        <w:ind w:left="720" w:hanging="360"/>
+      </w:pPr>
+    </w:lvl>
+    <w:lvl xmlns:w="http://schemas.openxmlformats.org/wordprocessingml/2006/main" w:ilvl="1">
+      <w:start w:val="1"/>
+      <w:numFmt w:val="lowerLetter"/>
+      <w:lvlText w:val="%2."/>
+      <w:lvlJc w:val="left"/>
+      <w:pPr>
+        <w:ind w:left="1440" w:hanging="360"/>
+      </w:pPr>
+    </w:lvl>
+    <w:lvl xmlns:w="http://schemas.openxmlformats.org/wordprocessingml/2006/main" w:ilvl="2">
+      <w:start w:val="1"/>
+      <w:numFmt w:val="lowerRoman"/>
+      <w:lvlText w:val="%3."/>
+      <w:lvlJc w:val="right"/>
+      <w:pPr>
+        <w:ind w:left="2160" w:hanging="180"/>
+      </w:pPr>
+    </w:lvl>
+    <w:lvl xmlns:w="http://schemas.openxmlformats.org/wordprocessingml/2006/main" w:ilvl="3">
+      <w:start w:val="1"/>
+      <w:numFmt w:val="decimal"/>
+      <w:lvlText w:val="%4."/>
+      <w:lvlJc w:val="left"/>
+      <w:pPr>
+        <w:ind w:left="2880" w:hanging="360"/>
+      </w:pPr>
+    </w:lvl>
+    <w:lvl xmlns:w="http://schemas.openxmlformats.org/wordprocessingml/2006/main" w:ilvl="4">
+      <w:start w:val="1"/>
+      <w:numFmt w:val="lowerLetter"/>
+      <w:lvlText w:val="%5."/>
+      <w:lvlJc w:val="left"/>
+      <w:pPr>
+        <w:ind w:left="3600" w:hanging="360"/>
+      </w:pPr>
+    </w:lvl>
+    <w:lvl xmlns:w="http://schemas.openxmlformats.org/wordprocessingml/2006/main" w:ilvl="5">
+      <w:start w:val="1"/>
+      <w:numFmt w:val="lowerRoman"/>
+      <w:lvlText w:val="%6."/>
+      <w:lvlJc w:val="right"/>
+      <w:pPr>
+        <w:ind w:left="4320" w:hanging="180"/>
+      </w:pPr>
+    </w:lvl>
+    <w:lvl xmlns:w="http://schemas.openxmlformats.org/wordprocessingml/2006/main" w:ilvl="6">
+      <w:start w:val="1"/>
+      <w:numFmt w:val="decimal"/>
+      <w:lvlText w:val="%7."/>
+      <w:lvlJc w:val="left"/>
+      <w:pPr>
+        <w:ind w:left="5040" w:hanging="360"/>
+      </w:pPr>
+    </w:lvl>
+    <w:lvl xmlns:w="http://schemas.openxmlformats.org/wordprocessingml/2006/main" w:ilvl="7">
+      <w:start w:val="1"/>
+      <w:numFmt w:val="lowerLetter"/>
+      <w:lvlText w:val="%8."/>
+      <w:lvlJc w:val="left"/>
+      <w:pPr>
+        <w:ind w:left="5760" w:hanging="360"/>
+      </w:pPr>
+    </w:lvl>
+    <w:lvl xmlns:w="http://schemas.openxmlformats.org/wordprocessingml/2006/main" w:ilvl="8">
+      <w:start w:val="1"/>
+      <w:numFmt w:val="lowerRoman"/>
+      <w:lvlText w:val="%9."/>
+      <w:lvlJc w:val="right"/>
+      <w:pPr>
+        <w:ind w:left="6480" w:hanging="180"/>
+      </w:pPr>
+    </w:lvl>
+  </w:abstractNum>
+  <w:abstractNum xmlns:w="http://schemas.openxmlformats.org/wordprocessingml/2006/main" w:abstractNumId="10">
+    <w:nsid w:val="86e2a3f"/>
+    <w:multiLevelType xmlns:w="http://schemas.openxmlformats.org/wordprocessingml/2006/main" w:val="hybridMultilevel"/>
+    <w:lvl xmlns:w="http://schemas.openxmlformats.org/wordprocessingml/2006/main" w:ilvl="0">
+      <w:start w:val="1"/>
+      <w:numFmt w:val="lowerLetter"/>
+      <w:lvlText w:val="%1)"/>
+      <w:lvlJc w:val="left"/>
+      <w:pPr>
+        <w:ind w:left="720" w:hanging="360"/>
+      </w:pPr>
+    </w:lvl>
+    <w:lvl xmlns:w="http://schemas.openxmlformats.org/wordprocessingml/2006/main" w:ilvl="1">
+      <w:start w:val="1"/>
+      <w:numFmt w:val="lowerLetter"/>
+      <w:lvlText w:val="%2."/>
+      <w:lvlJc w:val="left"/>
+      <w:pPr>
+        <w:ind w:left="1440" w:hanging="360"/>
+      </w:pPr>
+    </w:lvl>
+    <w:lvl xmlns:w="http://schemas.openxmlformats.org/wordprocessingml/2006/main" w:ilvl="2">
+      <w:start w:val="1"/>
+      <w:numFmt w:val="lowerRoman"/>
+      <w:lvlText w:val="%3."/>
+      <w:lvlJc w:val="right"/>
+      <w:pPr>
+        <w:ind w:left="2160" w:hanging="180"/>
+      </w:pPr>
+    </w:lvl>
+    <w:lvl xmlns:w="http://schemas.openxmlformats.org/wordprocessingml/2006/main" w:ilvl="3">
+      <w:start w:val="1"/>
+      <w:numFmt w:val="decimal"/>
+      <w:lvlText w:val="%4."/>
+      <w:lvlJc w:val="left"/>
+      <w:pPr>
+        <w:ind w:left="2880" w:hanging="360"/>
+      </w:pPr>
+    </w:lvl>
+    <w:lvl xmlns:w="http://schemas.openxmlformats.org/wordprocessingml/2006/main" w:ilvl="4">
+      <w:start w:val="1"/>
+      <w:numFmt w:val="lowerLetter"/>
+      <w:lvlText w:val="%5."/>
+      <w:lvlJc w:val="left"/>
+      <w:pPr>
+        <w:ind w:left="3600" w:hanging="360"/>
+      </w:pPr>
+    </w:lvl>
+    <w:lvl xmlns:w="http://schemas.openxmlformats.org/wordprocessingml/2006/main" w:ilvl="5">
+      <w:start w:val="1"/>
+      <w:numFmt w:val="lowerRoman"/>
+      <w:lvlText w:val="%6."/>
+      <w:lvlJc w:val="right"/>
+      <w:pPr>
+        <w:ind w:left="4320" w:hanging="180"/>
+      </w:pPr>
+    </w:lvl>
+    <w:lvl xmlns:w="http://schemas.openxmlformats.org/wordprocessingml/2006/main" w:ilvl="6">
+      <w:start w:val="1"/>
+      <w:numFmt w:val="decimal"/>
+      <w:lvlText w:val="%7."/>
+      <w:lvlJc w:val="left"/>
+      <w:pPr>
+        <w:ind w:left="5040" w:hanging="360"/>
+      </w:pPr>
+    </w:lvl>
+    <w:lvl xmlns:w="http://schemas.openxmlformats.org/wordprocessingml/2006/main" w:ilvl="7">
+      <w:start w:val="1"/>
+      <w:numFmt w:val="lowerLetter"/>
+      <w:lvlText w:val="%8."/>
+      <w:lvlJc w:val="left"/>
+      <w:pPr>
+        <w:ind w:left="5760" w:hanging="360"/>
+      </w:pPr>
+    </w:lvl>
+    <w:lvl xmlns:w="http://schemas.openxmlformats.org/wordprocessingml/2006/main" w:ilvl="8">
+      <w:start w:val="1"/>
+      <w:numFmt w:val="lowerRoman"/>
+      <w:lvlText w:val="%9."/>
+      <w:lvlJc w:val="right"/>
+      <w:pPr>
+        <w:ind w:left="6480" w:hanging="180"/>
+      </w:pPr>
+    </w:lvl>
+  </w:abstractNum>
+  <w:abstractNum xmlns:w="http://schemas.openxmlformats.org/wordprocessingml/2006/main" w:abstractNumId="9">
+    <w:nsid w:val="4c7a07e6"/>
+    <w:multiLevelType xmlns:w="http://schemas.openxmlformats.org/wordprocessingml/2006/main" w:val="hybridMultilevel"/>
+    <w:lvl xmlns:w="http://schemas.openxmlformats.org/wordprocessingml/2006/main" w:ilvl="0">
+      <w:start w:val="1"/>
+      <w:numFmt w:val="lowerLetter"/>
+      <w:lvlText w:val="%1)"/>
+      <w:lvlJc w:val="left"/>
+      <w:pPr>
+        <w:ind w:left="720" w:hanging="360"/>
+      </w:pPr>
+    </w:lvl>
+    <w:lvl xmlns:w="http://schemas.openxmlformats.org/wordprocessingml/2006/main" w:ilvl="1">
+      <w:start w:val="1"/>
+      <w:numFmt w:val="lowerLetter"/>
+      <w:lvlText w:val="%2."/>
+      <w:lvlJc w:val="left"/>
+      <w:pPr>
+        <w:ind w:left="1440" w:hanging="360"/>
+      </w:pPr>
+    </w:lvl>
+    <w:lvl xmlns:w="http://schemas.openxmlformats.org/wordprocessingml/2006/main" w:ilvl="2">
+      <w:start w:val="1"/>
+      <w:numFmt w:val="lowerRoman"/>
+      <w:lvlText w:val="%3."/>
+      <w:lvlJc w:val="right"/>
+      <w:pPr>
+        <w:ind w:left="2160" w:hanging="180"/>
+      </w:pPr>
+    </w:lvl>
+    <w:lvl xmlns:w="http://schemas.openxmlformats.org/wordprocessingml/2006/main" w:ilvl="3">
+      <w:start w:val="1"/>
+      <w:numFmt w:val="decimal"/>
+      <w:lvlText w:val="%4."/>
+      <w:lvlJc w:val="left"/>
+      <w:pPr>
+        <w:ind w:left="2880" w:hanging="360"/>
+      </w:pPr>
+    </w:lvl>
+    <w:lvl xmlns:w="http://schemas.openxmlformats.org/wordprocessingml/2006/main" w:ilvl="4">
+      <w:start w:val="1"/>
+      <w:numFmt w:val="lowerLetter"/>
+      <w:lvlText w:val="%5."/>
+      <w:lvlJc w:val="left"/>
+      <w:pPr>
+        <w:ind w:left="3600" w:hanging="360"/>
+      </w:pPr>
+    </w:lvl>
+    <w:lvl xmlns:w="http://schemas.openxmlformats.org/wordprocessingml/2006/main" w:ilvl="5">
+      <w:start w:val="1"/>
+      <w:numFmt w:val="lowerRoman"/>
+      <w:lvlText w:val="%6."/>
+      <w:lvlJc w:val="right"/>
+      <w:pPr>
+        <w:ind w:left="4320" w:hanging="180"/>
+      </w:pPr>
+    </w:lvl>
+    <w:lvl xmlns:w="http://schemas.openxmlformats.org/wordprocessingml/2006/main" w:ilvl="6">
+      <w:start w:val="1"/>
+      <w:numFmt w:val="decimal"/>
+      <w:lvlText w:val="%7."/>
+      <w:lvlJc w:val="left"/>
+      <w:pPr>
+        <w:ind w:left="5040" w:hanging="360"/>
+      </w:pPr>
+    </w:lvl>
+    <w:lvl xmlns:w="http://schemas.openxmlformats.org/wordprocessingml/2006/main" w:ilvl="7">
+      <w:start w:val="1"/>
+      <w:numFmt w:val="lowerLetter"/>
+      <w:lvlText w:val="%8."/>
+      <w:lvlJc w:val="left"/>
+      <w:pPr>
+        <w:ind w:left="5760" w:hanging="360"/>
+      </w:pPr>
+    </w:lvl>
+    <w:lvl xmlns:w="http://schemas.openxmlformats.org/wordprocessingml/2006/main" w:ilvl="8">
+      <w:start w:val="1"/>
+      <w:numFmt w:val="lowerRoman"/>
+      <w:lvlText w:val="%9."/>
+      <w:lvlJc w:val="right"/>
+      <w:pPr>
+        <w:ind w:left="6480" w:hanging="180"/>
+      </w:pPr>
+    </w:lvl>
+  </w:abstractNum>
+  <w:abstractNum xmlns:w="http://schemas.openxmlformats.org/wordprocessingml/2006/main" w:abstractNumId="8">
+    <w:nsid w:val="3010ae02"/>
+    <w:multiLevelType xmlns:w="http://schemas.openxmlformats.org/wordprocessingml/2006/main" w:val="hybridMultilevel"/>
+    <w:lvl xmlns:w="http://schemas.openxmlformats.org/wordprocessingml/2006/main" w:ilvl="0">
+      <w:start w:val="1"/>
+      <w:numFmt w:val="lowerLetter"/>
+      <w:lvlText w:val="%1)"/>
+      <w:lvlJc w:val="left"/>
+      <w:pPr>
+        <w:ind w:left="720" w:hanging="360"/>
+      </w:pPr>
+    </w:lvl>
+    <w:lvl xmlns:w="http://schemas.openxmlformats.org/wordprocessingml/2006/main" w:ilvl="1">
+      <w:start w:val="1"/>
+      <w:numFmt w:val="lowerLetter"/>
+      <w:lvlText w:val="%2."/>
+      <w:lvlJc w:val="left"/>
+      <w:pPr>
+        <w:ind w:left="1440" w:hanging="360"/>
+      </w:pPr>
+    </w:lvl>
+    <w:lvl xmlns:w="http://schemas.openxmlformats.org/wordprocessingml/2006/main" w:ilvl="2">
+      <w:start w:val="1"/>
+      <w:numFmt w:val="lowerRoman"/>
+      <w:lvlText w:val="%3."/>
+      <w:lvlJc w:val="right"/>
+      <w:pPr>
+        <w:ind w:left="2160" w:hanging="180"/>
+      </w:pPr>
+    </w:lvl>
+    <w:lvl xmlns:w="http://schemas.openxmlformats.org/wordprocessingml/2006/main" w:ilvl="3">
+      <w:start w:val="1"/>
+      <w:numFmt w:val="decimal"/>
+      <w:lvlText w:val="%4."/>
+      <w:lvlJc w:val="left"/>
+      <w:pPr>
+        <w:ind w:left="2880" w:hanging="360"/>
+      </w:pPr>
+    </w:lvl>
+    <w:lvl xmlns:w="http://schemas.openxmlformats.org/wordprocessingml/2006/main" w:ilvl="4">
+      <w:start w:val="1"/>
+      <w:numFmt w:val="lowerLetter"/>
+      <w:lvlText w:val="%5."/>
+      <w:lvlJc w:val="left"/>
+      <w:pPr>
+        <w:ind w:left="3600" w:hanging="360"/>
+      </w:pPr>
+    </w:lvl>
+    <w:lvl xmlns:w="http://schemas.openxmlformats.org/wordprocessingml/2006/main" w:ilvl="5">
+      <w:start w:val="1"/>
+      <w:numFmt w:val="lowerRoman"/>
+      <w:lvlText w:val="%6."/>
+      <w:lvlJc w:val="right"/>
+      <w:pPr>
+        <w:ind w:left="4320" w:hanging="180"/>
+      </w:pPr>
+    </w:lvl>
+    <w:lvl xmlns:w="http://schemas.openxmlformats.org/wordprocessingml/2006/main" w:ilvl="6">
+      <w:start w:val="1"/>
+      <w:numFmt w:val="decimal"/>
+      <w:lvlText w:val="%7."/>
+      <w:lvlJc w:val="left"/>
+      <w:pPr>
+        <w:ind w:left="5040" w:hanging="360"/>
+      </w:pPr>
+    </w:lvl>
+    <w:lvl xmlns:w="http://schemas.openxmlformats.org/wordprocessingml/2006/main" w:ilvl="7">
+      <w:start w:val="1"/>
+      <w:numFmt w:val="lowerLetter"/>
+      <w:lvlText w:val="%8."/>
+      <w:lvlJc w:val="left"/>
+      <w:pPr>
+        <w:ind w:left="5760" w:hanging="360"/>
+      </w:pPr>
+    </w:lvl>
+    <w:lvl xmlns:w="http://schemas.openxmlformats.org/wordprocessingml/2006/main" w:ilvl="8">
+      <w:start w:val="1"/>
+      <w:numFmt w:val="lowerRoman"/>
+      <w:lvlText w:val="%9."/>
+      <w:lvlJc w:val="right"/>
+      <w:pPr>
+        <w:ind w:left="6480" w:hanging="180"/>
+      </w:pPr>
+    </w:lvl>
+  </w:abstractNum>
+  <w:abstractNum xmlns:w="http://schemas.openxmlformats.org/wordprocessingml/2006/main" w:abstractNumId="7">
+    <w:nsid w:val="417ddb19"/>
+    <w:multiLevelType xmlns:w="http://schemas.openxmlformats.org/wordprocessingml/2006/main" w:val="hybridMultilevel"/>
+    <w:lvl xmlns:w="http://schemas.openxmlformats.org/wordprocessingml/2006/main" w:ilvl="0">
+      <w:start w:val="1"/>
+      <w:numFmt w:val="decimal"/>
+      <w:lvlText w:val="%1."/>
+      <w:lvlJc w:val="left"/>
+      <w:pPr>
+        <w:ind w:left="720" w:hanging="360"/>
+      </w:pPr>
+    </w:lvl>
+    <w:lvl xmlns:w="http://schemas.openxmlformats.org/wordprocessingml/2006/main" w:ilvl="1">
+      <w:start w:val="1"/>
+      <w:numFmt w:val="lowerLetter"/>
+      <w:lvlText w:val="%2."/>
+      <w:lvlJc w:val="left"/>
+      <w:pPr>
+        <w:ind w:left="1440" w:hanging="360"/>
+      </w:pPr>
+    </w:lvl>
+    <w:lvl xmlns:w="http://schemas.openxmlformats.org/wordprocessingml/2006/main" w:ilvl="2">
+      <w:start w:val="1"/>
+      <w:numFmt w:val="lowerRoman"/>
+      <w:lvlText w:val="%3."/>
+      <w:lvlJc w:val="right"/>
+      <w:pPr>
+        <w:ind w:left="2160" w:hanging="180"/>
+      </w:pPr>
+    </w:lvl>
+    <w:lvl xmlns:w="http://schemas.openxmlformats.org/wordprocessingml/2006/main" w:ilvl="3">
+      <w:start w:val="1"/>
+      <w:numFmt w:val="decimal"/>
+      <w:lvlText w:val="%4."/>
+      <w:lvlJc w:val="left"/>
+      <w:pPr>
+        <w:ind w:left="2880" w:hanging="360"/>
+      </w:pPr>
+    </w:lvl>
+    <w:lvl xmlns:w="http://schemas.openxmlformats.org/wordprocessingml/2006/main" w:ilvl="4">
+      <w:start w:val="1"/>
+      <w:numFmt w:val="lowerLetter"/>
+      <w:lvlText w:val="%5."/>
+      <w:lvlJc w:val="left"/>
+      <w:pPr>
+        <w:ind w:left="3600" w:hanging="360"/>
+      </w:pPr>
+    </w:lvl>
+    <w:lvl xmlns:w="http://schemas.openxmlformats.org/wordprocessingml/2006/main" w:ilvl="5">
+      <w:start w:val="1"/>
+      <w:numFmt w:val="lowerRoman"/>
+      <w:lvlText w:val="%6."/>
+      <w:lvlJc w:val="right"/>
+      <w:pPr>
+        <w:ind w:left="4320" w:hanging="180"/>
+      </w:pPr>
+    </w:lvl>
+    <w:lvl xmlns:w="http://schemas.openxmlformats.org/wordprocessingml/2006/main" w:ilvl="6">
+      <w:start w:val="1"/>
+      <w:numFmt w:val="decimal"/>
+      <w:lvlText w:val="%7."/>
+      <w:lvlJc w:val="left"/>
+      <w:pPr>
+        <w:ind w:left="5040" w:hanging="360"/>
+      </w:pPr>
+    </w:lvl>
+    <w:lvl xmlns:w="http://schemas.openxmlformats.org/wordprocessingml/2006/main" w:ilvl="7">
+      <w:start w:val="1"/>
+      <w:numFmt w:val="lowerLetter"/>
+      <w:lvlText w:val="%8."/>
+      <w:lvlJc w:val="left"/>
+      <w:pPr>
+        <w:ind w:left="5760" w:hanging="360"/>
+      </w:pPr>
+    </w:lvl>
+    <w:lvl xmlns:w="http://schemas.openxmlformats.org/wordprocessingml/2006/main" w:ilvl="8">
+      <w:start w:val="1"/>
+      <w:numFmt w:val="lowerRoman"/>
+      <w:lvlText w:val="%9."/>
+      <w:lvlJc w:val="right"/>
+      <w:pPr>
+        <w:ind w:left="6480" w:hanging="180"/>
+      </w:pPr>
+    </w:lvl>
+  </w:abstractNum>
+  <w:abstractNum xmlns:w="http://schemas.openxmlformats.org/wordprocessingml/2006/main" w:abstractNumId="6">
+    <w:nsid w:val="48f7ff5e"/>
+    <w:multiLevelType xmlns:w="http://schemas.openxmlformats.org/wordprocessingml/2006/main" w:val="hybridMultilevel"/>
+    <w:lvl xmlns:w="http://schemas.openxmlformats.org/wordprocessingml/2006/main" w:ilvl="0">
+      <w:start w:val="1"/>
+      <w:numFmt w:val="decimal"/>
+      <w:lvlText w:val="%1."/>
+      <w:lvlJc w:val="left"/>
+      <w:pPr>
+        <w:ind w:left="720" w:hanging="360"/>
+      </w:pPr>
+    </w:lvl>
+    <w:lvl xmlns:w="http://schemas.openxmlformats.org/wordprocessingml/2006/main" w:ilvl="1">
+      <w:start w:val="1"/>
+      <w:numFmt w:val="lowerLetter"/>
+      <w:lvlText w:val="%2."/>
+      <w:lvlJc w:val="left"/>
+      <w:pPr>
+        <w:ind w:left="1440" w:hanging="360"/>
+      </w:pPr>
+    </w:lvl>
+    <w:lvl xmlns:w="http://schemas.openxmlformats.org/wordprocessingml/2006/main" w:ilvl="2">
+      <w:start w:val="1"/>
+      <w:numFmt w:val="lowerRoman"/>
+      <w:lvlText w:val="%3."/>
+      <w:lvlJc w:val="right"/>
+      <w:pPr>
+        <w:ind w:left="2160" w:hanging="180"/>
+      </w:pPr>
+    </w:lvl>
+    <w:lvl xmlns:w="http://schemas.openxmlformats.org/wordprocessingml/2006/main" w:ilvl="3">
+      <w:start w:val="1"/>
+      <w:numFmt w:val="decimal"/>
+      <w:lvlText w:val="%4."/>
+      <w:lvlJc w:val="left"/>
+      <w:pPr>
+        <w:ind w:left="2880" w:hanging="360"/>
+      </w:pPr>
+    </w:lvl>
+    <w:lvl xmlns:w="http://schemas.openxmlformats.org/wordprocessingml/2006/main" w:ilvl="4">
+      <w:start w:val="1"/>
+      <w:numFmt w:val="lowerLetter"/>
+      <w:lvlText w:val="%5."/>
+      <w:lvlJc w:val="left"/>
+      <w:pPr>
+        <w:ind w:left="3600" w:hanging="360"/>
+      </w:pPr>
+    </w:lvl>
+    <w:lvl xmlns:w="http://schemas.openxmlformats.org/wordprocessingml/2006/main" w:ilvl="5">
+      <w:start w:val="1"/>
+      <w:numFmt w:val="lowerRoman"/>
+      <w:lvlText w:val="%6."/>
+      <w:lvlJc w:val="right"/>
+      <w:pPr>
+        <w:ind w:left="4320" w:hanging="180"/>
+      </w:pPr>
+    </w:lvl>
+    <w:lvl xmlns:w="http://schemas.openxmlformats.org/wordprocessingml/2006/main" w:ilvl="6">
+      <w:start w:val="1"/>
+      <w:numFmt w:val="decimal"/>
+      <w:lvlText w:val="%7."/>
+      <w:lvlJc w:val="left"/>
+      <w:pPr>
+        <w:ind w:left="5040" w:hanging="360"/>
+      </w:pPr>
+    </w:lvl>
+    <w:lvl xmlns:w="http://schemas.openxmlformats.org/wordprocessingml/2006/main" w:ilvl="7">
+      <w:start w:val="1"/>
+      <w:numFmt w:val="lowerLetter"/>
+      <w:lvlText w:val="%8."/>
+      <w:lvlJc w:val="left"/>
+      <w:pPr>
+        <w:ind w:left="5760" w:hanging="360"/>
+      </w:pPr>
+    </w:lvl>
+    <w:lvl xmlns:w="http://schemas.openxmlformats.org/wordprocessingml/2006/main" w:ilvl="8">
+      <w:start w:val="1"/>
+      <w:numFmt w:val="lowerRoman"/>
+      <w:lvlText w:val="%9."/>
+      <w:lvlJc w:val="right"/>
+      <w:pPr>
+        <w:ind w:left="6480" w:hanging="180"/>
+      </w:pPr>
+    </w:lvl>
+  </w:abstractNum>
+  <w:abstractNum xmlns:w="http://schemas.openxmlformats.org/wordprocessingml/2006/main" w:abstractNumId="5">
+    <w:nsid w:val="32277538"/>
+    <w:multiLevelType xmlns:w="http://schemas.openxmlformats.org/wordprocessingml/2006/main" w:val="hybridMultilevel"/>
+    <w:lvl xmlns:w="http://schemas.openxmlformats.org/wordprocessingml/2006/main" w:ilvl="0">
+      <w:start w:val="1"/>
+      <w:numFmt w:val="decimal"/>
+      <w:lvlText w:val="%1."/>
+      <w:lvlJc w:val="left"/>
+      <w:pPr>
+        <w:ind w:left="720" w:hanging="360"/>
+      </w:pPr>
+    </w:lvl>
+    <w:lvl xmlns:w="http://schemas.openxmlformats.org/wordprocessingml/2006/main" w:ilvl="1">
+      <w:start w:val="1"/>
+      <w:numFmt w:val="lowerLetter"/>
+      <w:lvlText w:val="%2."/>
+      <w:lvlJc w:val="left"/>
+      <w:pPr>
+        <w:ind w:left="1440" w:hanging="360"/>
+      </w:pPr>
+    </w:lvl>
+    <w:lvl xmlns:w="http://schemas.openxmlformats.org/wordprocessingml/2006/main" w:ilvl="2">
+      <w:start w:val="1"/>
+      <w:numFmt w:val="lowerRoman"/>
+      <w:lvlText w:val="%3."/>
+      <w:lvlJc w:val="right"/>
+      <w:pPr>
+        <w:ind w:left="2160" w:hanging="180"/>
+      </w:pPr>
+    </w:lvl>
+    <w:lvl xmlns:w="http://schemas.openxmlformats.org/wordprocessingml/2006/main" w:ilvl="3">
+      <w:start w:val="1"/>
+      <w:numFmt w:val="decimal"/>
+      <w:lvlText w:val="%4."/>
+      <w:lvlJc w:val="left"/>
+      <w:pPr>
+        <w:ind w:left="2880" w:hanging="360"/>
+      </w:pPr>
+    </w:lvl>
+    <w:lvl xmlns:w="http://schemas.openxmlformats.org/wordprocessingml/2006/main" w:ilvl="4">
+      <w:start w:val="1"/>
+      <w:numFmt w:val="lowerLetter"/>
+      <w:lvlText w:val="%5."/>
+      <w:lvlJc w:val="left"/>
+      <w:pPr>
+        <w:ind w:left="3600" w:hanging="360"/>
+      </w:pPr>
+    </w:lvl>
+    <w:lvl xmlns:w="http://schemas.openxmlformats.org/wordprocessingml/2006/main" w:ilvl="5">
+      <w:start w:val="1"/>
+      <w:numFmt w:val="lowerRoman"/>
+      <w:lvlText w:val="%6."/>
+      <w:lvlJc w:val="right"/>
+      <w:pPr>
+        <w:ind w:left="4320" w:hanging="180"/>
+      </w:pPr>
+    </w:lvl>
+    <w:lvl xmlns:w="http://schemas.openxmlformats.org/wordprocessingml/2006/main" w:ilvl="6">
+      <w:start w:val="1"/>
+      <w:numFmt w:val="decimal"/>
+      <w:lvlText w:val="%7."/>
+      <w:lvlJc w:val="left"/>
+      <w:pPr>
+        <w:ind w:left="5040" w:hanging="360"/>
+      </w:pPr>
+    </w:lvl>
+    <w:lvl xmlns:w="http://schemas.openxmlformats.org/wordprocessingml/2006/main" w:ilvl="7">
+      <w:start w:val="1"/>
+      <w:numFmt w:val="lowerLetter"/>
+      <w:lvlText w:val="%8."/>
+      <w:lvlJc w:val="left"/>
+      <w:pPr>
+        <w:ind w:left="5760" w:hanging="360"/>
+      </w:pPr>
+    </w:lvl>
+    <w:lvl xmlns:w="http://schemas.openxmlformats.org/wordprocessingml/2006/main" w:ilvl="8">
+      <w:start w:val="1"/>
+      <w:numFmt w:val="lowerRoman"/>
+      <w:lvlText w:val="%9."/>
+      <w:lvlJc w:val="right"/>
+      <w:pPr>
+        <w:ind w:left="6480" w:hanging="180"/>
+      </w:pPr>
+    </w:lvl>
+  </w:abstractNum>
+  <w:abstractNum xmlns:w="http://schemas.openxmlformats.org/wordprocessingml/2006/main" w:abstractNumId="4">
+    <w:nsid w:val="34aa5694"/>
+    <w:multiLevelType xmlns:w="http://schemas.openxmlformats.org/wordprocessingml/2006/main" w:val="hybridMultilevel"/>
+    <w:lvl xmlns:w="http://schemas.openxmlformats.org/wordprocessingml/2006/main" w:ilvl="0">
+      <w:start w:val="1"/>
+      <w:numFmt w:val="lowerLetter"/>
+      <w:lvlText w:val="%1)"/>
+      <w:lvlJc w:val="left"/>
+      <w:pPr>
+        <w:ind w:left="720" w:hanging="360"/>
+      </w:pPr>
+    </w:lvl>
+    <w:lvl xmlns:w="http://schemas.openxmlformats.org/wordprocessingml/2006/main" w:ilvl="1">
+      <w:start w:val="1"/>
+      <w:numFmt w:val="lowerLetter"/>
+      <w:lvlText w:val="%2."/>
+      <w:lvlJc w:val="left"/>
+      <w:pPr>
+        <w:ind w:left="1440" w:hanging="360"/>
+      </w:pPr>
+    </w:lvl>
+    <w:lvl xmlns:w="http://schemas.openxmlformats.org/wordprocessingml/2006/main" w:ilvl="2">
+      <w:start w:val="1"/>
+      <w:numFmt w:val="lowerRoman"/>
+      <w:lvlText w:val="%3."/>
+      <w:lvlJc w:val="right"/>
+      <w:pPr>
+        <w:ind w:left="2160" w:hanging="180"/>
+      </w:pPr>
+    </w:lvl>
+    <w:lvl xmlns:w="http://schemas.openxmlformats.org/wordprocessingml/2006/main" w:ilvl="3">
+      <w:start w:val="1"/>
+      <w:numFmt w:val="decimal"/>
+      <w:lvlText w:val="%4."/>
+      <w:lvlJc w:val="left"/>
+      <w:pPr>
+        <w:ind w:left="2880" w:hanging="360"/>
+      </w:pPr>
+    </w:lvl>
+    <w:lvl xmlns:w="http://schemas.openxmlformats.org/wordprocessingml/2006/main" w:ilvl="4">
+      <w:start w:val="1"/>
+      <w:numFmt w:val="lowerLetter"/>
+      <w:lvlText w:val="%5."/>
+      <w:lvlJc w:val="left"/>
+      <w:pPr>
+        <w:ind w:left="3600" w:hanging="360"/>
+      </w:pPr>
+    </w:lvl>
+    <w:lvl xmlns:w="http://schemas.openxmlformats.org/wordprocessingml/2006/main" w:ilvl="5">
+      <w:start w:val="1"/>
+      <w:numFmt w:val="lowerRoman"/>
+      <w:lvlText w:val="%6."/>
+      <w:lvlJc w:val="right"/>
+      <w:pPr>
+        <w:ind w:left="4320" w:hanging="180"/>
+      </w:pPr>
+    </w:lvl>
+    <w:lvl xmlns:w="http://schemas.openxmlformats.org/wordprocessingml/2006/main" w:ilvl="6">
+      <w:start w:val="1"/>
+      <w:numFmt w:val="decimal"/>
+      <w:lvlText w:val="%7."/>
+      <w:lvlJc w:val="left"/>
+      <w:pPr>
+        <w:ind w:left="5040" w:hanging="360"/>
+      </w:pPr>
+    </w:lvl>
+    <w:lvl xmlns:w="http://schemas.openxmlformats.org/wordprocessingml/2006/main" w:ilvl="7">
+      <w:start w:val="1"/>
+      <w:numFmt w:val="lowerLetter"/>
+      <w:lvlText w:val="%8."/>
+      <w:lvlJc w:val="left"/>
+      <w:pPr>
+        <w:ind w:left="5760" w:hanging="360"/>
+      </w:pPr>
+    </w:lvl>
+    <w:lvl xmlns:w="http://schemas.openxmlformats.org/wordprocessingml/2006/main" w:ilvl="8">
+      <w:start w:val="1"/>
+      <w:numFmt w:val="lowerRoman"/>
+      <w:lvlText w:val="%9."/>
+      <w:lvlJc w:val="right"/>
+      <w:pPr>
+        <w:ind w:left="6480" w:hanging="180"/>
+      </w:pPr>
+    </w:lvl>
+  </w:abstractNum>
+  <w:abstractNum xmlns:w="http://schemas.openxmlformats.org/wordprocessingml/2006/main" w:abstractNumId="3">
+    <w:nsid w:val="3a9df055"/>
+    <w:multiLevelType xmlns:w="http://schemas.openxmlformats.org/wordprocessingml/2006/main" w:val="hybridMultilevel"/>
+    <w:lvl xmlns:w="http://schemas.openxmlformats.org/wordprocessingml/2006/main" w:ilvl="0">
+      <w:start w:val="1"/>
+      <w:numFmt w:val="lowerLetter"/>
+      <w:lvlText w:val="%1)"/>
+      <w:lvlJc w:val="left"/>
+      <w:pPr>
+        <w:ind w:left="720" w:hanging="360"/>
+      </w:pPr>
+    </w:lvl>
+    <w:lvl xmlns:w="http://schemas.openxmlformats.org/wordprocessingml/2006/main" w:ilvl="1">
+      <w:start w:val="1"/>
+      <w:numFmt w:val="lowerLetter"/>
+      <w:lvlText w:val="%2."/>
+      <w:lvlJc w:val="left"/>
+      <w:pPr>
+        <w:ind w:left="1440" w:hanging="360"/>
+      </w:pPr>
+    </w:lvl>
+    <w:lvl xmlns:w="http://schemas.openxmlformats.org/wordprocessingml/2006/main" w:ilvl="2">
+      <w:start w:val="1"/>
+      <w:numFmt w:val="lowerRoman"/>
+      <w:lvlText w:val="%3."/>
+      <w:lvlJc w:val="right"/>
+      <w:pPr>
+        <w:ind w:left="2160" w:hanging="180"/>
+      </w:pPr>
+    </w:lvl>
+    <w:lvl xmlns:w="http://schemas.openxmlformats.org/wordprocessingml/2006/main" w:ilvl="3">
+      <w:start w:val="1"/>
+      <w:numFmt w:val="decimal"/>
+      <w:lvlText w:val="%4."/>
+      <w:lvlJc w:val="left"/>
+      <w:pPr>
+        <w:ind w:left="2880" w:hanging="360"/>
+      </w:pPr>
+    </w:lvl>
+    <w:lvl xmlns:w="http://schemas.openxmlformats.org/wordprocessingml/2006/main" w:ilvl="4">
+      <w:start w:val="1"/>
+      <w:numFmt w:val="lowerLetter"/>
+      <w:lvlText w:val="%5."/>
+      <w:lvlJc w:val="left"/>
+      <w:pPr>
+        <w:ind w:left="3600" w:hanging="360"/>
+      </w:pPr>
+    </w:lvl>
+    <w:lvl xmlns:w="http://schemas.openxmlformats.org/wordprocessingml/2006/main" w:ilvl="5">
+      <w:start w:val="1"/>
+      <w:numFmt w:val="lowerRoman"/>
+      <w:lvlText w:val="%6."/>
+      <w:lvlJc w:val="right"/>
+      <w:pPr>
+        <w:ind w:left="4320" w:hanging="180"/>
+      </w:pPr>
+    </w:lvl>
+    <w:lvl xmlns:w="http://schemas.openxmlformats.org/wordprocessingml/2006/main" w:ilvl="6">
+      <w:start w:val="1"/>
+      <w:numFmt w:val="decimal"/>
+      <w:lvlText w:val="%7."/>
+      <w:lvlJc w:val="left"/>
+      <w:pPr>
+        <w:ind w:left="5040" w:hanging="360"/>
+      </w:pPr>
+    </w:lvl>
+    <w:lvl xmlns:w="http://schemas.openxmlformats.org/wordprocessingml/2006/main" w:ilvl="7">
+      <w:start w:val="1"/>
+      <w:numFmt w:val="lowerLetter"/>
+      <w:lvlText w:val="%8."/>
+      <w:lvlJc w:val="left"/>
+      <w:pPr>
+        <w:ind w:left="5760" w:hanging="360"/>
+      </w:pPr>
+    </w:lvl>
+    <w:lvl xmlns:w="http://schemas.openxmlformats.org/wordprocessingml/2006/main" w:ilvl="8">
+      <w:start w:val="1"/>
+      <w:numFmt w:val="lowerRoman"/>
+      <w:lvlText w:val="%9."/>
+      <w:lvlJc w:val="right"/>
+      <w:pPr>
+        <w:ind w:left="6480" w:hanging="180"/>
+      </w:pPr>
+    </w:lvl>
+  </w:abstractNum>
+  <w:abstractNum xmlns:w="http://schemas.openxmlformats.org/wordprocessingml/2006/main" w:abstractNumId="2">
+    <w:nsid w:val="78aa8c9e"/>
+    <w:multiLevelType xmlns:w="http://schemas.openxmlformats.org/wordprocessingml/2006/main" w:val="hybridMultilevel"/>
+    <w:lvl xmlns:w="http://schemas.openxmlformats.org/wordprocessingml/2006/main" w:ilvl="0">
+      <w:start w:val="1"/>
+      <w:numFmt w:val="lowerLetter"/>
+      <w:lvlText w:val="%1)"/>
+      <w:lvlJc w:val="left"/>
+      <w:pPr>
+        <w:ind w:left="720" w:hanging="360"/>
+      </w:pPr>
+    </w:lvl>
+    <w:lvl xmlns:w="http://schemas.openxmlformats.org/wordprocessingml/2006/main" w:ilvl="1">
+      <w:start w:val="1"/>
+      <w:numFmt w:val="lowerLetter"/>
+      <w:lvlText w:val="%2."/>
+      <w:lvlJc w:val="left"/>
+      <w:pPr>
+        <w:ind w:left="1440" w:hanging="360"/>
+      </w:pPr>
+    </w:lvl>
+    <w:lvl xmlns:w="http://schemas.openxmlformats.org/wordprocessingml/2006/main" w:ilvl="2">
+      <w:start w:val="1"/>
+      <w:numFmt w:val="lowerRoman"/>
+      <w:lvlText w:val="%3."/>
+      <w:lvlJc w:val="right"/>
+      <w:pPr>
+        <w:ind w:left="2160" w:hanging="180"/>
+      </w:pPr>
+    </w:lvl>
+    <w:lvl xmlns:w="http://schemas.openxmlformats.org/wordprocessingml/2006/main" w:ilvl="3">
+      <w:start w:val="1"/>
+      <w:numFmt w:val="decimal"/>
+      <w:lvlText w:val="%4."/>
+      <w:lvlJc w:val="left"/>
+      <w:pPr>
+        <w:ind w:left="2880" w:hanging="360"/>
+      </w:pPr>
+    </w:lvl>
+    <w:lvl xmlns:w="http://schemas.openxmlformats.org/wordprocessingml/2006/main" w:ilvl="4">
+      <w:start w:val="1"/>
+      <w:numFmt w:val="lowerLetter"/>
+      <w:lvlText w:val="%5."/>
+      <w:lvlJc w:val="left"/>
+      <w:pPr>
+        <w:ind w:left="3600" w:hanging="360"/>
+      </w:pPr>
+    </w:lvl>
+    <w:lvl xmlns:w="http://schemas.openxmlformats.org/wordprocessingml/2006/main" w:ilvl="5">
+      <w:start w:val="1"/>
+      <w:numFmt w:val="lowerRoman"/>
+      <w:lvlText w:val="%6."/>
+      <w:lvlJc w:val="right"/>
+      <w:pPr>
+        <w:ind w:left="4320" w:hanging="180"/>
+      </w:pPr>
+    </w:lvl>
+    <w:lvl xmlns:w="http://schemas.openxmlformats.org/wordprocessingml/2006/main" w:ilvl="6">
+      <w:start w:val="1"/>
+      <w:numFmt w:val="decimal"/>
+      <w:lvlText w:val="%7."/>
+      <w:lvlJc w:val="left"/>
+      <w:pPr>
+        <w:ind w:left="5040" w:hanging="360"/>
+      </w:pPr>
+    </w:lvl>
+    <w:lvl xmlns:w="http://schemas.openxmlformats.org/wordprocessingml/2006/main" w:ilvl="7">
+      <w:start w:val="1"/>
+      <w:numFmt w:val="lowerLetter"/>
+      <w:lvlText w:val="%8."/>
+      <w:lvlJc w:val="left"/>
+      <w:pPr>
+        <w:ind w:left="5760" w:hanging="360"/>
+      </w:pPr>
+    </w:lvl>
+    <w:lvl xmlns:w="http://schemas.openxmlformats.org/wordprocessingml/2006/main" w:ilvl="8">
+      <w:start w:val="1"/>
+      <w:numFmt w:val="lowerRoman"/>
+      <w:lvlText w:val="%9."/>
+      <w:lvlJc w:val="right"/>
+      <w:pPr>
+        <w:ind w:left="6480" w:hanging="180"/>
+      </w:pPr>
+    </w:lvl>
+  </w:abstractNum>
+  <w:abstractNum xmlns:w="http://schemas.openxmlformats.org/wordprocessingml/2006/main" w:abstractNumId="1">
+    <w:nsid w:val="c6c5692"/>
+    <w:multiLevelType xmlns:w="http://schemas.openxmlformats.org/wordprocessingml/2006/main" w:val="hybridMultilevel"/>
+    <w:lvl xmlns:w="http://schemas.openxmlformats.org/wordprocessingml/2006/main" w:ilvl="0">
+      <w:start w:val="1"/>
+      <w:numFmt w:val="lowerLetter"/>
+      <w:lvlText w:val="%1)"/>
+      <w:lvlJc w:val="left"/>
+      <w:pPr>
+        <w:ind w:left="720" w:hanging="360"/>
+      </w:pPr>
+    </w:lvl>
+    <w:lvl xmlns:w="http://schemas.openxmlformats.org/wordprocessingml/2006/main" w:ilvl="1">
+      <w:start w:val="1"/>
+      <w:numFmt w:val="lowerLetter"/>
+      <w:lvlText w:val="%2."/>
+      <w:lvlJc w:val="left"/>
+      <w:pPr>
+        <w:ind w:left="1440" w:hanging="360"/>
+      </w:pPr>
+    </w:lvl>
+    <w:lvl xmlns:w="http://schemas.openxmlformats.org/wordprocessingml/2006/main" w:ilvl="2">
+      <w:start w:val="1"/>
+      <w:numFmt w:val="lowerRoman"/>
+      <w:lvlText w:val="%3."/>
+      <w:lvlJc w:val="right"/>
+      <w:pPr>
+        <w:ind w:left="2160" w:hanging="180"/>
+      </w:pPr>
+    </w:lvl>
+    <w:lvl xmlns:w="http://schemas.openxmlformats.org/wordprocessingml/2006/main" w:ilvl="3">
+      <w:start w:val="1"/>
+      <w:numFmt w:val="decimal"/>
+      <w:lvlText w:val="%4."/>
+      <w:lvlJc w:val="left"/>
+      <w:pPr>
+        <w:ind w:left="2880" w:hanging="360"/>
+      </w:pPr>
+    </w:lvl>
+    <w:lvl xmlns:w="http://schemas.openxmlformats.org/wordprocessingml/2006/main" w:ilvl="4">
+      <w:start w:val="1"/>
+      <w:numFmt w:val="lowerLetter"/>
+      <w:lvlText w:val="%5."/>
+      <w:lvlJc w:val="left"/>
+      <w:pPr>
+        <w:ind w:left="3600" w:hanging="360"/>
+      </w:pPr>
+    </w:lvl>
+    <w:lvl xmlns:w="http://schemas.openxmlformats.org/wordprocessingml/2006/main" w:ilvl="5">
+      <w:start w:val="1"/>
+      <w:numFmt w:val="lowerRoman"/>
+      <w:lvlText w:val="%6."/>
+      <w:lvlJc w:val="right"/>
+      <w:pPr>
+        <w:ind w:left="4320" w:hanging="180"/>
+      </w:pPr>
+    </w:lvl>
+    <w:lvl xmlns:w="http://schemas.openxmlformats.org/wordprocessingml/2006/main" w:ilvl="6">
+      <w:start w:val="1"/>
+      <w:numFmt w:val="decimal"/>
+      <w:lvlText w:val="%7."/>
+      <w:lvlJc w:val="left"/>
+      <w:pPr>
+        <w:ind w:left="5040" w:hanging="360"/>
+      </w:pPr>
+    </w:lvl>
+    <w:lvl xmlns:w="http://schemas.openxmlformats.org/wordprocessingml/2006/main" w:ilvl="7">
+      <w:start w:val="1"/>
+      <w:numFmt w:val="lowerLetter"/>
+      <w:lvlText w:val="%8."/>
+      <w:lvlJc w:val="left"/>
+      <w:pPr>
+        <w:ind w:left="5760" w:hanging="360"/>
+      </w:pPr>
+    </w:lvl>
+    <w:lvl xmlns:w="http://schemas.openxmlformats.org/wordprocessingml/2006/main" w:ilvl="8">
+      <w:start w:val="1"/>
+      <w:numFmt w:val="lowerRoman"/>
+      <w:lvlText w:val="%9."/>
+      <w:lvlJc w:val="right"/>
+      <w:pPr>
+        <w:ind w:left="6480" w:hanging="180"/>
+      </w:pPr>
+    </w:lvl>
+  </w:abstractNum>
   <w:abstractNum w:abstractNumId="0" w15:restartNumberingAfterBreak="0">
     <w:nsid w:val="0053208E"/>
     <w:multiLevelType w:val="multilevel"/>
@@ -2543,6 +6901,39 @@
       </w:pPr>
     </w:lvl>
   </w:abstractNum>
+  <w:num w:numId="12">
+    <w:abstractNumId w:val="11"/>
+  </w:num>
+  <w:num w:numId="11">
+    <w:abstractNumId w:val="10"/>
+  </w:num>
+  <w:num w:numId="10">
+    <w:abstractNumId w:val="9"/>
+  </w:num>
+  <w:num w:numId="9">
+    <w:abstractNumId w:val="8"/>
+  </w:num>
+  <w:num w:numId="8">
+    <w:abstractNumId w:val="7"/>
+  </w:num>
+  <w:num w:numId="7">
+    <w:abstractNumId w:val="6"/>
+  </w:num>
+  <w:num w:numId="6">
+    <w:abstractNumId w:val="5"/>
+  </w:num>
+  <w:num w:numId="5">
+    <w:abstractNumId w:val="4"/>
+  </w:num>
+  <w:num w:numId="4">
+    <w:abstractNumId w:val="3"/>
+  </w:num>
+  <w:num w:numId="3">
+    <w:abstractNumId w:val="2"/>
+  </w:num>
+  <w:num w:numId="2">
+    <w:abstractNumId w:val="1"/>
+  </w:num>
   <w:num w:numId="1" w16cid:durableId="1993171202">
     <w:abstractNumId w:val="0"/>
   </w:num>
@@ -2554,7 +6945,7 @@
   <w:docDefaults>
     <w:rPrDefault>
       <w:rPr>
-        <w:rFonts w:ascii="Times New Roman" w:eastAsiaTheme="minorEastAsia" w:hAnsi="Times New Roman" w:cstheme="minorBidi"/>
+        <w:rFonts w:ascii="Times New Roman" w:hAnsi="Times New Roman" w:eastAsiaTheme="minorEastAsia" w:cstheme="minorBidi"/>
         <w:lang w:val="ru-RU" w:eastAsia="ru-RU" w:bidi="ar-SA"/>
       </w:rPr>
     </w:rPrDefault>
@@ -2567,10 +6958,10 @@
     <w:lsdException w:name="heading 3" w:uiPriority="9" w:qFormat="1"/>
     <w:lsdException w:name="heading 4" w:uiPriority="9" w:qFormat="1"/>
     <w:lsdException w:name="heading 5" w:uiPriority="9" w:qFormat="1"/>
-    <w:lsdException w:name="heading 6" w:semiHidden="1" w:uiPriority="9" w:unhideWhenUsed="1" w:qFormat="1"/>
-    <w:lsdException w:name="heading 7" w:semiHidden="1" w:uiPriority="9" w:unhideWhenUsed="1" w:qFormat="1"/>
-    <w:lsdException w:name="heading 8" w:semiHidden="1" w:uiPriority="9" w:unhideWhenUsed="1" w:qFormat="1"/>
-    <w:lsdException w:name="heading 9" w:semiHidden="1" w:uiPriority="9" w:unhideWhenUsed="1" w:qFormat="1"/>
+    <w:lsdException w:name="heading 6" w:uiPriority="9" w:semiHidden="1" w:unhideWhenUsed="1" w:qFormat="1"/>
+    <w:lsdException w:name="heading 7" w:uiPriority="9" w:semiHidden="1" w:unhideWhenUsed="1" w:qFormat="1"/>
+    <w:lsdException w:name="heading 8" w:uiPriority="9" w:semiHidden="1" w:unhideWhenUsed="1" w:qFormat="1"/>
+    <w:lsdException w:name="heading 9" w:uiPriority="9" w:semiHidden="1" w:unhideWhenUsed="1" w:qFormat="1"/>
     <w:lsdException w:name="index 1" w:semiHidden="1" w:unhideWhenUsed="1"/>
     <w:lsdException w:name="index 2" w:semiHidden="1" w:unhideWhenUsed="1"/>
     <w:lsdException w:name="index 3" w:semiHidden="1" w:unhideWhenUsed="1"/>
@@ -2666,7 +7057,7 @@
     <w:lsdException w:name="HTML Sample" w:semiHidden="1" w:unhideWhenUsed="1"/>
     <w:lsdException w:name="HTML Typewriter" w:semiHidden="1" w:unhideWhenUsed="1"/>
     <w:lsdException w:name="HTML Variable" w:semiHidden="1" w:unhideWhenUsed="1"/>
-    <w:lsdException w:name="Normal Table" w:semiHidden="1" w:uiPriority="0" w:unhideWhenUsed="1"/>
+    <w:lsdException w:name="Normal Table" w:uiPriority="0" w:semiHidden="1" w:unhideWhenUsed="1"/>
     <w:lsdException w:name="annotation subject" w:semiHidden="1" w:unhideWhenUsed="1"/>
     <w:lsdException w:name="No List" w:semiHidden="1" w:unhideWhenUsed="1"/>
     <w:lsdException w:name="Outline List 1" w:semiHidden="1" w:unhideWhenUsed="1"/>
@@ -2825,8 +7216,8 @@
     <w:lsdException w:name="Subtle Reference" w:uiPriority="31" w:qFormat="1"/>
     <w:lsdException w:name="Intense Reference" w:uiPriority="32" w:qFormat="1"/>
     <w:lsdException w:name="Book Title" w:uiPriority="33" w:qFormat="1"/>
-    <w:lsdException w:name="Bibliography" w:semiHidden="1" w:uiPriority="37" w:unhideWhenUsed="1"/>
-    <w:lsdException w:name="TOC Heading" w:semiHidden="1" w:uiPriority="39" w:unhideWhenUsed="1" w:qFormat="1"/>
+    <w:lsdException w:name="Bibliography" w:uiPriority="37" w:semiHidden="1" w:unhideWhenUsed="1"/>
+    <w:lsdException w:name="TOC Heading" w:uiPriority="39" w:semiHidden="1" w:unhideWhenUsed="1" w:qFormat="1"/>
     <w:lsdException w:name="Plain Table 1" w:uiPriority="41"/>
     <w:lsdException w:name="Plain Table 2" w:uiPriority="42"/>
     <w:lsdException w:name="Plain Table 3" w:uiPriority="43"/>
@@ -2937,7 +7328,7 @@
     <w:lsdException w:name="Unresolved Mention" w:semiHidden="1" w:unhideWhenUsed="1"/>
     <w:lsdException w:name="Smart Link" w:semiHidden="1" w:unhideWhenUsed="1"/>
   </w:latentStyles>
-  <w:style w:type="paragraph" w:default="1" w:styleId="a">
+  <w:style w:type="paragraph" w:styleId="a" w:default="1">
     <w:name w:val="Normal"/>
     <w:qFormat/>
     <w:rPr>
@@ -3030,13 +7421,13 @@
       <w:sz w:val="22"/>
     </w:rPr>
   </w:style>
-  <w:style w:type="character" w:default="1" w:styleId="a0">
+  <w:style w:type="character" w:styleId="a0" w:default="1">
     <w:name w:val="Default Paragraph Font"/>
     <w:uiPriority w:val="1"/>
     <w:semiHidden/>
     <w:unhideWhenUsed/>
   </w:style>
-  <w:style w:type="table" w:default="1" w:styleId="a1">
+  <w:style w:type="table" w:styleId="a1" w:default="1">
     <w:name w:val="Normal Table"/>
     <w:uiPriority w:val="99"/>
     <w:semiHidden/>
@@ -3051,7 +7442,7 @@
       </w:tblCellMar>
     </w:tblPr>
   </w:style>
-  <w:style w:type="numbering" w:default="1" w:styleId="a2">
+  <w:style w:type="numbering" w:styleId="a2" w:default="1">
     <w:name w:val="No List"/>
     <w:uiPriority w:val="99"/>
     <w:semiHidden/>
@@ -3226,7 +7617,7 @@
       <w:sz w:val="24"/>
     </w:rPr>
   </w:style>
-  <w:style w:type="paragraph" w:customStyle="1" w:styleId="Footnote">
+  <w:style w:type="paragraph" w:styleId="Footnote" w:customStyle="1">
     <w:name w:val="Footnote"/>
     <w:link w:val="Footnote1"/>
     <w:qFormat/>
@@ -3240,7 +7631,7 @@
       <w:sz w:val="22"/>
     </w:rPr>
   </w:style>
-  <w:style w:type="character" w:customStyle="1" w:styleId="Footnote1">
+  <w:style w:type="character" w:styleId="Footnote1" w:customStyle="1">
     <w:name w:val="Footnote1"/>
     <w:link w:val="Footnote"/>
     <w:qFormat/>
@@ -3249,7 +7640,7 @@
       <w:sz w:val="22"/>
     </w:rPr>
   </w:style>
-  <w:style w:type="paragraph" w:customStyle="1" w:styleId="HeaderandFooter">
+  <w:style w:type="paragraph" w:styleId="HeaderandFooter" w:customStyle="1">
     <w:name w:val="Header and Footer"/>
     <w:link w:val="HeaderandFooter1"/>
     <w:qFormat/>
@@ -3261,7 +7652,7 @@
       <w:color w:val="000000"/>
     </w:rPr>
   </w:style>
-  <w:style w:type="character" w:customStyle="1" w:styleId="HeaderandFooter1">
+  <w:style w:type="character" w:styleId="HeaderandFooter1" w:customStyle="1">
     <w:name w:val="Header and Footer1"/>
     <w:link w:val="HeaderandFooter"/>
     <w:qFormat/>
@@ -3269,6 +7660,18 @@
       <w:rFonts w:ascii="XO Thames" w:hAnsi="XO Thames"/>
       <w:sz w:val="20"/>
     </w:rPr>
+  </w:style>
+  <w:style w:type="paragraph" w:styleId="ListParagraph">
+    <w:uiPriority w:val="34"/>
+    <w:name w:val="List Paragraph"/>
+    <w:basedOn w:val="a"/>
+    <w:qFormat/>
+    <w:rsid w:val="58CF9E3D"/>
+    <w:pPr>
+      <w:spacing/>
+      <w:ind w:left="720"/>
+      <w:contextualSpacing/>
+    </w:pPr>
   </w:style>
 </w:styles>
 </file>

</xml_diff>